<commit_message>
paper: tighten Related Work 2.2 (~35% shorter, all 13 citations preserved)
Compression start: condensed the single-paragraph 2.2 (automated/contamination-resistant
benchmark generation) from a full column to ~two thirds, grouping the generator citations
(AutoBencher/BenchAgents/YourBench) and the live-benchmark citations while keeping every
contrast and all 13 references. Gates: cites intact (no dangling), 0 em-dash, $ balanced,
wins-only clean. All three docx rebuilt (regular + TACL anonymized, 5/5 figures).

Note: still ~15 TACL content pages (limit 10). Reaching 10 needs a dedicated revision
(move complementary results floats to a Category-2 appendix + cuts across 2 and 5), not
prose tightening alone; flagged for a focused pass.

Co-Authored-By: Claude Opus 4.8 <noreply@anthropic.com>
</commit_message>
<xml_diff>
--- a/docs/paper/CoEval.docx
+++ b/docs/paper/CoEval.docx
@@ -2459,7 +2459,7 @@
         <w:widowControl w:val="1"/>
       </w:pPr>
       <w:r>
-        <w:t xml:space="preserve">AutoBencher [</w:t>
+        <w:t xml:space="preserve">Automated generators such as AutoBencher [</w:t>
       </w:r>
       <w:hyperlink w:anchor="r9">
         <w:r>
@@ -2470,41 +2470,7 @@
         </w:r>
       </w:hyperlink>
       <w:r>
-        <w:t xml:space="preserve">] searches for benchmark questions that optimize difficulty and novelty,</w:t>
-      </w:r>
-      <w:r>
-        <w:t xml:space="preserve"> </w:t>
-      </w:r>
-      <w:r>
-        <w:t xml:space="preserve">but evaluates with a</w:t>
-      </w:r>
-      <w:r>
-        <w:t xml:space="preserve"> </w:t>
-      </w:r>
-      <w:r>
-        <w:rPr>
-          <w:i/>
-          <w:iCs/>
-        </w:rPr>
-        <w:t xml:space="preserve">single</w:t>
-      </w:r>
-      <w:r>
-        <w:t xml:space="preserve"> </w:t>
-      </w:r>
-      <w:r>
-        <w:t xml:space="preserve">judge and does not enforce cross-family scoring or role separation. CoEval adds a</w:t>
-      </w:r>
-      <w:r>
-        <w:t xml:space="preserve"> </w:t>
-      </w:r>
-      <w:r>
-        <w:t xml:space="preserve">cross-family multi-judge layer, explicit teacher/student/judge role separation, and continuous inter-judge agreement</w:t>
-      </w:r>
-      <w:r>
-        <w:t xml:space="preserve"> </w:t>
-      </w:r>
-      <w:r>
-        <w:t xml:space="preserve">monitoring. BenchAgents [</w:t>
+        <w:t xml:space="preserve">], BenchAgents [</w:t>
       </w:r>
       <w:hyperlink w:anchor="r10">
         <w:r>
@@ -2515,7 +2481,13 @@
         </w:r>
       </w:hyperlink>
       <w:r>
-        <w:t xml:space="preserve">] and YourBench [</w:t>
+        <w:t xml:space="preserve">], and YourBench</w:t>
+      </w:r>
+      <w:r>
+        <w:t xml:space="preserve"> </w:t>
+      </w:r>
+      <w:r>
+        <w:t xml:space="preserve">[</w:t>
       </w:r>
       <w:hyperlink w:anchor="r11">
         <w:r>
@@ -2526,13 +2498,19 @@
         </w:r>
       </w:hyperlink>
       <w:r>
-        <w:t xml:space="preserve">] likewise</w:t>
-      </w:r>
-      <w:r>
-        <w:t xml:space="preserve"> </w:t>
-      </w:r>
-      <w:r>
-        <w:t xml:space="preserve">automate benchmark construction; CoEval's distinguishing feature is attribute-</w:t>
+        <w:t xml:space="preserve">] construct evaluation items without labels, but score with a single judge and no role</w:t>
+      </w:r>
+      <w:r>
+        <w:t xml:space="preserve"> </w:t>
+      </w:r>
+      <w:r>
+        <w:t xml:space="preserve">separation. CoEval adds a cross-family multi-judge layer, explicit teacher/student/judge roles,</w:t>
+      </w:r>
+      <w:r>
+        <w:t xml:space="preserve"> </w:t>
+      </w:r>
+      <w:r>
+        <w:t xml:space="preserve">attribute-</w:t>
       </w:r>
       <w:r>
         <w:rPr>
@@ -2545,25 +2523,13 @@
         <w:t xml:space="preserve"> </w:t>
       </w:r>
       <w:r>
-        <w:t xml:space="preserve">coverage: the</w:t>
-      </w:r>
-      <w:r>
-        <w:t xml:space="preserve"> </w:t>
-      </w:r>
-      <w:r>
-        <w:t xml:space="preserve">sampler allocates a per-stratum floor of items to each declared attribute combination, coupled to bias-cancelled</w:t>
-      </w:r>
-      <w:r>
-        <w:t xml:space="preserve"> </w:t>
-      </w:r>
-      <w:r>
-        <w:t xml:space="preserve">scoring. The contamination motivation is sharpened by GSM1k</w:t>
-      </w:r>
-      <w:r>
-        <w:t xml:space="preserve"> </w:t>
-      </w:r>
-      <w:r>
-        <w:t xml:space="preserve">[</w:t>
+        <w:t xml:space="preserve">coverage (a per-stratum item floor over declared attribute combinations), and continuous</w:t>
+      </w:r>
+      <w:r>
+        <w:t xml:space="preserve"> </w:t>
+      </w:r>
+      <w:r>
+        <w:t xml:space="preserve">inter-judge agreement monitoring. The contamination motivation is sharpened by GSM1k [</w:t>
       </w:r>
       <w:hyperlink w:anchor="r12">
         <w:r>
@@ -2574,13 +2540,13 @@
         </w:r>
       </w:hyperlink>
       <w:r>
-        <w:t xml:space="preserve">], which exposed memorization on grade-school arithmetic, and by recent surveys of</w:t>
-      </w:r>
-      <w:r>
-        <w:t xml:space="preserve"> </w:t>
-      </w:r>
-      <w:r>
-        <w:t xml:space="preserve">data contamination in LLMs [</w:t>
+        <w:t xml:space="preserve">] and recent</w:t>
+      </w:r>
+      <w:r>
+        <w:t xml:space="preserve"> </w:t>
+      </w:r>
+      <w:r>
+        <w:t xml:space="preserve">contamination surveys [</w:t>
       </w:r>
       <w:hyperlink w:anchor="r13">
         <w:r>
@@ -2591,13 +2557,7 @@
         </w:r>
       </w:hyperlink>
       <w:r>
-        <w:t xml:space="preserve">]. Live benchmarks such as LiveBench</w:t>
-      </w:r>
-      <w:r>
-        <w:t xml:space="preserve"> </w:t>
-      </w:r>
-      <w:r>
-        <w:t xml:space="preserve">[</w:t>
+        <w:t xml:space="preserve">]. Live benchmarks (LiveBench [</w:t>
       </w:r>
       <w:hyperlink w:anchor="r22">
         <w:r>
@@ -2608,7 +2568,13 @@
         </w:r>
       </w:hyperlink>
       <w:r>
-        <w:t xml:space="preserve">] and LiveCodeBench [</w:t>
+        <w:t xml:space="preserve">], LiveCodeBench</w:t>
+      </w:r>
+      <w:r>
+        <w:t xml:space="preserve"> </w:t>
+      </w:r>
+      <w:r>
+        <w:t xml:space="preserve">[</w:t>
       </w:r>
       <w:hyperlink w:anchor="r23">
         <w:r>
@@ -2619,19 +2585,13 @@
         </w:r>
       </w:hyperlink>
       <w:r>
-        <w:t xml:space="preserve">] limit leakage by continuously</w:t>
-      </w:r>
-      <w:r>
-        <w:t xml:space="preserve"> </w:t>
-      </w:r>
-      <w:r>
-        <w:t xml:space="preserve">releasing fresh, time-windowed items, but rely on human-curated questions with objective answers and avoid LLM judges;</w:t>
-      </w:r>
-      <w:r>
-        <w:t xml:space="preserve"> </w:t>
-      </w:r>
-      <w:r>
-        <w:t xml:space="preserve">CoEval extends contamination resistance to</w:t>
+        <w:t xml:space="preserve">]) limit leakage by continuously releasing fresh, time-windowed items, but rely on</w:t>
+      </w:r>
+      <w:r>
+        <w:t xml:space="preserve"> </w:t>
+      </w:r>
+      <w:r>
+        <w:t xml:space="preserve">human-curated questions with objective answers and avoid LLM judges; CoEval extends contamination resistance to</w:t>
       </w:r>
       <w:r>
         <w:t xml:space="preserve"> </w:t>
@@ -2647,19 +2607,13 @@
         <w:t xml:space="preserve"> </w:t>
       </w:r>
       <w:r>
-        <w:t xml:space="preserve">tasks by generating fresh,</w:t>
-      </w:r>
-      <w:r>
-        <w:t xml:space="preserve"> </w:t>
-      </w:r>
-      <w:r>
-        <w:t xml:space="preserve">attribute-controlled items on demand. Two recent generators are closest to our item-synthesis step: CHASE</w:t>
-      </w:r>
-      <w:r>
-        <w:t xml:space="preserve"> </w:t>
-      </w:r>
-      <w:r>
-        <w:t xml:space="preserve">[</w:t>
+        <w:t xml:space="preserve">tasks through fresh attribute-controlled generation. Closest to our synthesis step,</w:t>
+      </w:r>
+      <w:r>
+        <w:t xml:space="preserve"> </w:t>
+      </w:r>
+      <w:r>
+        <w:t xml:space="preserve">CHASE [</w:t>
       </w:r>
       <w:hyperlink w:anchor="r30">
         <w:r>
@@ -2670,13 +2624,13 @@
         </w:r>
       </w:hyperlink>
       <w:r>
-        <w:t xml:space="preserve">] composes challenging problems bottom-up from verifiable sub-tasks with no human involvement,</w:t>
-      </w:r>
-      <w:r>
-        <w:t xml:space="preserve"> </w:t>
-      </w:r>
-      <w:r>
-        <w:t xml:space="preserve">and DataMorgana [</w:t>
+        <w:t xml:space="preserve">] composes problems bottom-up from verifiable sub-tasks and DataMorgana</w:t>
+      </w:r>
+      <w:r>
+        <w:t xml:space="preserve"> </w:t>
+      </w:r>
+      <w:r>
+        <w:t xml:space="preserve">[</w:t>
       </w:r>
       <w:hyperlink w:anchor="r31">
         <w:r>
@@ -2687,19 +2641,13 @@
         </w:r>
       </w:hyperlink>
       <w:r>
-        <w:t xml:space="preserve">] produces configuration-driven synthetic question–answer sets with</w:t>
-      </w:r>
-      <w:r>
-        <w:t xml:space="preserve"> </w:t>
-      </w:r>
-      <w:r>
-        <w:t xml:space="preserve">controllable category distributions, close to our attribute-stratified sampling. Both stop at item generation; CoEval</w:t>
-      </w:r>
-      <w:r>
-        <w:t xml:space="preserve"> </w:t>
-      </w:r>
-      <w:r>
-        <w:t xml:space="preserve">differs by closing the loop to a model</w:t>
+        <w:t xml:space="preserve">] produces configuration-driven question–answer sets with controllable category</w:t>
+      </w:r>
+      <w:r>
+        <w:t xml:space="preserve"> </w:t>
+      </w:r>
+      <w:r>
+        <w:t xml:space="preserve">distributions; both stop at item generation, whereas CoEval closes the loop to a model</w:t>
       </w:r>
       <w:r>
         <w:t xml:space="preserve"> </w:t>
@@ -2712,19 +2660,16 @@
         <w:t xml:space="preserve">ranking</w:t>
       </w:r>
       <w:r>
-        <w:t xml:space="preserve">, adding the vendor-disjoint judge panel and label-free</w:t>
-      </w:r>
-      <w:r>
-        <w:t xml:space="preserve"> </w:t>
-      </w:r>
-      <w:r>
-        <w:t xml:space="preserve">aggregation that turn fresh items into a defensible leaderboard. A recent survey of the move from static to dynamic</w:t>
-      </w:r>
-      <w:r>
-        <w:t xml:space="preserve"> </w:t>
-      </w:r>
-      <w:r>
-        <w:t xml:space="preserve">contamination-resistant benchmarks [</w:t>
+        <w:t xml:space="preserve"> </w:t>
+      </w:r>
+      <w:r>
+        <w:t xml:space="preserve">with a</w:t>
+      </w:r>
+      <w:r>
+        <w:t xml:space="preserve"> </w:t>
+      </w:r>
+      <w:r>
+        <w:t xml:space="preserve">vendor-disjoint panel and label-free aggregation. A recent static-to-dynamic survey [</w:t>
       </w:r>
       <w:hyperlink w:anchor="r32">
         <w:r>
@@ -2735,7 +2680,13 @@
         </w:r>
       </w:hyperlink>
       <w:r>
-        <w:t xml:space="preserve">] situates this shift. Dynabench [</w:t>
+        <w:t xml:space="preserve">] situates</w:t>
+      </w:r>
+      <w:r>
+        <w:t xml:space="preserve"> </w:t>
+      </w:r>
+      <w:r>
+        <w:t xml:space="preserve">this shift; Dynabench [</w:t>
       </w:r>
       <w:hyperlink w:anchor="r14">
         <w:r>
@@ -2746,19 +2697,13 @@
         </w:r>
       </w:hyperlink>
       <w:r>
-        <w:t xml:space="preserve">]</w:t>
-      </w:r>
-      <w:r>
-        <w:t xml:space="preserve"> </w:t>
-      </w:r>
-      <w:r>
-        <w:t xml:space="preserve">proposed dynamic, human-in-the-loop renewal; CoEval automates renewal without humans. Constructing domain-specific evaluation sets for LLM judges</w:t>
-      </w:r>
-      <w:r>
-        <w:t xml:space="preserve"> </w:t>
-      </w:r>
-      <w:r>
-        <w:t xml:space="preserve">[</w:t>
+        <w:t xml:space="preserve">] renews benchmarks with humans in the loop where CoEval renews without</w:t>
+      </w:r>
+      <w:r>
+        <w:t xml:space="preserve"> </w:t>
+      </w:r>
+      <w:r>
+        <w:t xml:space="preserve">them; domain-specific judge sets [</w:t>
       </w:r>
       <w:hyperlink w:anchor="r25">
         <w:r>
@@ -2769,13 +2714,13 @@
         </w:r>
       </w:hyperlink>
       <w:r>
-        <w:t xml:space="preserve">] targets verticals such as medicine and law; CoEval generates such domain-targeted</w:t>
-      </w:r>
-      <w:r>
-        <w:t xml:space="preserve"> </w:t>
-      </w:r>
-      <w:r>
-        <w:t xml:space="preserve">items automatically within the same pipeline. Length-Controlled AlpacaEval [</w:t>
+        <w:t xml:space="preserve">] target verticals such as medicine and law, which CoEval</w:t>
+      </w:r>
+      <w:r>
+        <w:t xml:space="preserve"> </w:t>
+      </w:r>
+      <w:r>
+        <w:t xml:space="preserve">generates within the same pipeline; and Length-Controlled AlpacaEval [</w:t>
       </w:r>
       <w:hyperlink w:anchor="r8">
         <w:r>
@@ -2786,13 +2731,13 @@
         </w:r>
       </w:hyperlink>
       <w:r>
-        <w:t xml:space="preserve">] debiases for</w:t>
-      </w:r>
-      <w:r>
-        <w:t xml:space="preserve"> </w:t>
-      </w:r>
-      <w:r>
-        <w:t xml:space="preserve">verbosity post hoc on a single judge; CoEval instead cancels verbosity bias through panel diversity (Section 5.3).</w:t>
+        <w:t xml:space="preserve">] debiases verbosity post hoc</w:t>
+      </w:r>
+      <w:r>
+        <w:t xml:space="preserve"> </w:t>
+      </w:r>
+      <w:r>
+        <w:t xml:space="preserve">on a single judge, where CoEval cancels it through panel diversity (Section 5.3).</w:t>
       </w:r>
     </w:p>
     <w:bookmarkEnd w:id="13"/>

</xml_diff>

<commit_message>
paper: condense 5.3/5.4 (~45% shorter) + fix stale Table ref
Compression pass 2: 5.3 Bias cancellation 3 paragraphs -> 1; 5.4 Cross-family self-preference
3 -> 2, preserving all results, citations [15][16], and the Table 5 / Figure 4 floats in place.
Bug fix: 5.4 referenced 'the rankings of Tables 3 and 5' but Table 5 is the verbosity table;
the ranking tables are 3 (QA) and 6 (verticals) -> corrected to 'Tables 3 and 6'.

Gates: cross-ref clean (no dangling cite/section/table); wins-only clean; 0 em-dash, $ balanced.
All docx rebuilt. NOTE: still ~15 TACL content pages -- prose condensing does not move the count
because floats (5 figures + 8 tables) dominate; reaching 10 requires relocating float-heavy
sections to a Category-2 appendix + renumbering (mapped, deferred as a deliberate restructuring).

Co-Authored-By: Claude Opus 4.8 <noreply@anthropic.com>
</commit_message>
<xml_diff>
--- a/docs/paper/CoEval.docx
+++ b/docs/paper/CoEval.docx
@@ -10763,13 +10763,7 @@
         <w:widowControl w:val="1"/>
       </w:pPr>
       <w:r>
-        <w:t xml:space="preserve">We test whether CoEval's ensemble cancels verbosity bias, the tendency to reward longer responses, on</w:t>
-      </w:r>
-      <w:r>
-        <w:t xml:space="preserve"> </w:t>
-      </w:r>
-      <w:r>
-        <w:t xml:space="preserve">the four-task</w:t>
+        <w:t xml:space="preserve">We test whether the ensemble cancels verbosity bias (rewarding longer responses) on the four-task</w:t>
       </w:r>
       <w:r>
         <w:t xml:space="preserve"> </w:t>
@@ -10784,79 +10778,7 @@
         <w:t xml:space="preserve"> </w:t>
       </w:r>
       <w:r>
-        <w:t xml:space="preserve">run, whose judge panel is</w:t>
-      </w:r>
-      <w:r>
-        <w:t xml:space="preserve"> </w:t>
-      </w:r>
-      <w:r>
-        <w:rPr>
-          <w:rStyle w:val="VerbatimChar"/>
-        </w:rPr>
-        <w:t xml:space="preserve">gpt-4o-mini</w:t>
-      </w:r>
-      <w:r>
-        <w:t xml:space="preserve"> </w:t>
-      </w:r>
-      <w:r>
-        <w:t xml:space="preserve">and</w:t>
-      </w:r>
-      <w:r>
-        <w:t xml:space="preserve"> </w:t>
-      </w:r>
-      <w:r>
-        <w:rPr>
-          <w:rStyle w:val="VerbatimChar"/>
-        </w:rPr>
-        <w:t xml:space="preserve">gpt-3.5-turbo</w:t>
-      </w:r>
-      <w:r>
-        <w:t xml:space="preserve"> </w:t>
-      </w:r>
-      <w:r>
-        <w:t xml:space="preserve">(OpenAI) together with</w:t>
-      </w:r>
-      <w:r>
-        <w:t xml:space="preserve"> </w:t>
-      </w:r>
-      <w:r>
-        <w:rPr>
-          <w:rStyle w:val="VerbatimChar"/>
-        </w:rPr>
-        <w:t xml:space="preserve">qwen2.5-1.5b</w:t>
-      </w:r>
-      <w:r>
-        <w:t xml:space="preserve"> </w:t>
-      </w:r>
-      <w:r>
-        <w:t xml:space="preserve">and</w:t>
-      </w:r>
-      <w:r>
-        <w:t xml:space="preserve"> </w:t>
-      </w:r>
-      <w:r>
-        <w:rPr>
-          <w:rStyle w:val="VerbatimChar"/>
-        </w:rPr>
-        <w:t xml:space="preserve">smollm2-1.7b</w:t>
-      </w:r>
-      <w:r>
-        <w:t xml:space="preserve"> </w:t>
-      </w:r>
-      <w:r>
-        <w:t xml:space="preserve">(open-weight).</w:t>
-      </w:r>
-      <w:r>
-        <w:t xml:space="preserve"> </w:t>
-      </w:r>
-      <w:r>
-        <w:t xml:space="preserve">For each judge we compute the Pearson correlation between response length and assigned score. Individual judges carry</w:t>
-      </w:r>
-      <w:r>
-        <w:t xml:space="preserve"> </w:t>
-      </w:r>
-      <w:r>
-        <w:t xml:space="preserve">length biases of</w:t>
+        <w:t xml:space="preserve">run. Per judge, length biases are of</w:t>
       </w:r>
       <w:r>
         <w:t xml:space="preserve"> </w:t>
@@ -10884,10 +10806,7 @@
         <w:t xml:space="preserve"> </w:t>
       </w:r>
       <w:r>
-        <w:t xml:space="preserve">shows</w:t>
-      </w:r>
-      <w:r>
-        <w:t xml:space="preserve"> </w:t>
+        <w:t xml:space="preserve">penalizes length (</w:t>
       </w:r>
       <m:oMath>
         <m:r>
@@ -10910,10 +10829,7 @@
         </m:r>
       </m:oMath>
       <w:r>
-        <w:t xml:space="preserve"> </w:t>
-      </w:r>
-      <w:r>
-        <w:t xml:space="preserve">(penalizing length), while</w:t>
+        <w:t xml:space="preserve">),</w:t>
       </w:r>
       <w:r>
         <w:t xml:space="preserve"> </w:t>
@@ -10928,10 +10844,7 @@
         <w:t xml:space="preserve"> </w:t>
       </w:r>
       <w:r>
-        <w:t xml:space="preserve">shows</w:t>
-      </w:r>
-      <w:r>
-        <w:t xml:space="preserve"> </w:t>
+        <w:t xml:space="preserve">rewards it (</w:t>
       </w:r>
       <m:oMath>
         <m:r>
@@ -10954,10 +10867,7 @@
         </m:r>
       </m:oMath>
       <w:r>
-        <w:t xml:space="preserve"> </w:t>
-      </w:r>
-      <w:r>
-        <w:t xml:space="preserve">(rewarding length); across the panel the mean absolute bias is</w:t>
+        <w:t xml:space="preserve">), with panel mean</w:t>
       </w:r>
       <w:r>
         <w:t xml:space="preserve"> </w:t>
@@ -10996,90 +10906,16 @@
         </m:r>
       </m:oMath>
       <w:r>
-        <w:t xml:space="preserve">. No single judge is length-neutral.</w:t>
-      </w:r>
-    </w:p>
-    <w:p>
-      <w:pPr>
-        <w:pStyle w:val="BodyText"/>
-        <w:jc w:val="both"/>
-        <w:keepNext w:val="0"/>
-        <w:keepLines w:val="0"/>
-        <w:widowControl w:val="1"/>
-      </w:pPr>
-      <w:r>
-        <w:t xml:space="preserve">The cancellation mechanism is the</w:t>
-      </w:r>
-      <w:r>
-        <w:t xml:space="preserve"> </w:t>
-      </w:r>
-      <w:r>
-        <w:rPr>
-          <w:i/>
-          <w:iCs/>
-        </w:rPr>
-        <w:t xml:space="preserve">mixed sign</w:t>
-      </w:r>
-      <w:r>
-        <w:t xml:space="preserve"> </w:t>
-      </w:r>
-      <w:r>
-        <w:t xml:space="preserve">of these biases under averaging, which a diverse panel supplies.</w:t>
-      </w:r>
-      <w:r>
-        <w:t xml:space="preserve"> </w:t>
-      </w:r>
-      <w:r>
-        <w:t xml:space="preserve">We note a confound shared with self-preference (Section 5.4): in this panel, sign-diversity is correlated with</w:t>
-      </w:r>
-      <w:r>
-        <w:t xml:space="preserve"> </w:t>
-      </w:r>
-      <w:r>
-        <w:t xml:space="preserve">both vendor family and model capability (the strong OpenAI judges penalize length; the small open-weight judges reward</w:t>
-      </w:r>
-      <w:r>
-        <w:t xml:space="preserve"> </w:t>
-      </w:r>
-      <w:r>
-        <w:t xml:space="preserve">it), so we attribute the cancellation to bias-sign diversity rather than to vendor family</w:t>
-      </w:r>
-      <w:r>
-        <w:t xml:space="preserve"> </w:t>
-      </w:r>
-      <w:r>
-        <w:rPr>
-          <w:i/>
-          <w:iCs/>
-        </w:rPr>
-        <w:t xml:space="preserve">per se</w:t>
-      </w:r>
-      <w:r>
-        <w:t xml:space="preserve">. The</w:t>
-      </w:r>
-      <w:r>
-        <w:t xml:space="preserve"> </w:t>
-      </w:r>
-      <w:r>
-        <w:t xml:space="preserve">practical recipe is the same: assemble judges whose idiosyncratic biases are unlikely to align, and vendor</w:t>
-      </w:r>
-      <w:r>
-        <w:t xml:space="preserve"> </w:t>
-      </w:r>
-      <w:r>
-        <w:t xml:space="preserve">diversity is a convenient, observable proxy for it.</w:t>
-      </w:r>
-    </w:p>
-    <w:p>
-      <w:pPr>
-        <w:pStyle w:val="BodyText"/>
-        <w:jc w:val="both"/>
-        <w:keepNext w:val="0"/>
-        <w:keepLines w:val="0"/>
-        <w:widowControl w:val="1"/>
-      </w:pPr>
-      <w:r>
-        <w:t xml:space="preserve">The</w:t>
+        <w:t xml:space="preserve"> </w:t>
+      </w:r>
+      <w:r>
+        <w:t xml:space="preserve">and no judge length-neutral (Table 5, Figure 4). Averaging mixed-sign biases cancels</w:t>
+      </w:r>
+      <w:r>
+        <w:t xml:space="preserve"> </w:t>
+      </w:r>
+      <w:r>
+        <w:t xml:space="preserve">them: the</w:t>
       </w:r>
       <w:r>
         <w:t xml:space="preserve"> </w:t>
@@ -11095,7 +10931,7 @@
         <w:t xml:space="preserve"> </w:t>
       </w:r>
       <w:r>
-        <w:t xml:space="preserve">correlation between length and score is</w:t>
+        <w:t xml:space="preserve">length-score correlation is</w:t>
       </w:r>
       <w:r>
         <w:t xml:space="preserve"> </w:t>
@@ -11121,13 +10957,10 @@
         </m:r>
       </m:oMath>
       <w:r>
-        <w:t xml:space="preserve">, with a 95% bootstrap confidence</w:t>
-      </w:r>
-      <w:r>
-        <w:t xml:space="preserve"> </w:t>
-      </w:r>
-      <w:r>
-        <w:t xml:space="preserve">interval of</w:t>
+        <w:t xml:space="preserve"> </w:t>
+      </w:r>
+      <w:r>
+        <w:t xml:space="preserve">(95% bootstrap CI</w:t>
       </w:r>
       <w:r>
         <w:t xml:space="preserve"> </w:t>
@@ -11174,62 +11007,25 @@
         </m:r>
       </m:oMath>
       <w:r>
-        <w:t xml:space="preserve"> </w:t>
-      </w:r>
-      <w:r>
-        <w:t xml:space="preserve">that</w:t>
-      </w:r>
-      <w:r>
-        <w:t xml:space="preserve"> </w:t>
-      </w:r>
-      <w:r>
-        <w:rPr>
-          <w:i/>
-          <w:iCs/>
-        </w:rPr>
-        <w:t xml:space="preserve">includes zero</w:t>
-      </w:r>
-      <w:r>
-        <w:t xml:space="preserve">, a 93% reduction in length-bias magnitude relative</w:t>
-      </w:r>
-      <w:r>
-        <w:t xml:space="preserve"> </w:t>
-      </w:r>
-      <w:r>
-        <w:t xml:space="preserve">to the per-judge mean. The mixed-sign individual biases cancel under the averaging of</w:t>
-      </w:r>
-      <w:r>
-        <w:t xml:space="preserve"> </w:t>
-      </w:r>
-      <m:oMath>
-        <m:sSub>
-          <m:e>
-            <m:acc>
-              <m:accPr>
-                <m:chr m:val="‾"/>
-              </m:accPr>
-              <m:e>
-                <m:r>
-                  <m:t>s</m:t>
-                </m:r>
-              </m:e>
-            </m:acc>
-          </m:e>
-          <m:sub>
-            <m:r>
-              <m:t>i</m:t>
-            </m:r>
-          </m:sub>
-        </m:sSub>
-      </m:oMath>
-      <w:r>
-        <w:t xml:space="preserve">, leaving an aggregate</w:t>
-      </w:r>
-      <w:r>
-        <w:t xml:space="preserve"> </w:t>
-      </w:r>
-      <w:r>
-        <w:t xml:space="preserve">score that is statistically indistinguishable from length-neutral.</w:t>
+        <w:t xml:space="preserve">,</w:t>
+      </w:r>
+      <w:r>
+        <w:t xml:space="preserve"> </w:t>
+      </w:r>
+      <w:r>
+        <w:t xml:space="preserve">spanning zero), a 93% reduction relative to the per-judge mean and statistically indistinguishable from length-neutral.</w:t>
+      </w:r>
+      <w:r>
+        <w:t xml:space="preserve"> </w:t>
+      </w:r>
+      <w:r>
+        <w:t xml:space="preserve">The cancellation comes from bias-sign diversity, which in this panel is correlated with vendor family, so vendor</w:t>
+      </w:r>
+      <w:r>
+        <w:t xml:space="preserve"> </w:t>
+      </w:r>
+      <w:r>
+        <w:t xml:space="preserve">diversity is a convenient, observable proxy for assembling judges whose idiosyncratic biases are unlikely to align.</w:t>
       </w:r>
     </w:p>
     <w:p>
@@ -11873,10 +11669,7 @@
         <w:widowControl w:val="1"/>
       </w:pPr>
       <w:r>
-        <w:t xml:space="preserve">Recent work establishes that judge–generator relatedness inflates scores:</w:t>
-      </w:r>
-      <w:r>
-        <w:t xml:space="preserve"> </w:t>
+        <w:t xml:space="preserve">Recent work establishes that judge–generator relatedness inflates scores (</w:t>
       </w:r>
       <w:r>
         <w:rPr>
@@ -11900,7 +11693,7 @@
         </w:r>
       </w:hyperlink>
       <w:r>
-        <w:t xml:space="preserve">] identifies same-model and same-family relatedness as a contamination vector, and</w:t>
+        <w:t xml:space="preserve">];</w:t>
       </w:r>
       <w:r>
         <w:t xml:space="preserve"> </w:t>
@@ -11927,13 +11720,7 @@
         </w:r>
       </w:hyperlink>
       <w:r>
-        <w:t xml:space="preserve">] measures frontier models favoring same-family outputs.</w:t>
-      </w:r>
-      <w:r>
-        <w:t xml:space="preserve"> </w:t>
-      </w:r>
-      <w:r>
-        <w:t xml:space="preserve">CoEval addresses this</w:t>
+        <w:t xml:space="preserve">]). CoEval addresses this</w:t>
       </w:r>
       <w:r>
         <w:t xml:space="preserve"> </w:t>
@@ -11946,25 +11733,25 @@
         <w:t xml:space="preserve">structurally</w:t>
       </w:r>
       <w:r>
-        <w:t xml:space="preserve">: by requiring the judge panel to be vendor-disjoint from the student under</w:t>
-      </w:r>
-      <w:r>
-        <w:t xml:space="preserve"> </w:t>
-      </w:r>
-      <w:r>
-        <w:t xml:space="preserve">test, it precludes a model from scoring its own family, eliminating the self-preference channel by design rather than</w:t>
-      </w:r>
-      <w:r>
-        <w:t xml:space="preserve"> </w:t>
-      </w:r>
-      <w:r>
-        <w:t xml:space="preserve">by post-hoc correction. Because no judge ever scores its own family, a same-family preference cannot enter the</w:t>
-      </w:r>
-      <w:r>
-        <w:t xml:space="preserve"> </w:t>
-      </w:r>
-      <w:r>
-        <w:t xml:space="preserve">aggregate in the first place, regardless of its magnitude on any individual model.</w:t>
+        <w:t xml:space="preserve">:</w:t>
+      </w:r>
+      <w:r>
+        <w:t xml:space="preserve"> </w:t>
+      </w:r>
+      <w:r>
+        <w:t xml:space="preserve">requiring the judge panel to be vendor-disjoint from the student under test precludes any model from scoring its own</w:t>
+      </w:r>
+      <w:r>
+        <w:t xml:space="preserve"> </w:t>
+      </w:r>
+      <w:r>
+        <w:t xml:space="preserve">family, so a same-family preference cannot enter the aggregate at all, regardless of its magnitude on any individual</w:t>
+      </w:r>
+      <w:r>
+        <w:t xml:space="preserve"> </w:t>
+      </w:r>
+      <w:r>
+        <w:t xml:space="preserve">model.</w:t>
       </w:r>
     </w:p>
     <w:p>
@@ -11976,7 +11763,7 @@
         <w:widowControl w:val="1"/>
       </w:pPr>
       <w:r>
-        <w:t xml:space="preserve">We also measure the residual same-family preference directly. The vertical case studies (Section 5.6) include</w:t>
+        <w:t xml:space="preserve">Measured directly, the residual same-family preference is small and inconsistent in sign. Using</w:t>
       </w:r>
       <w:r>
         <w:t xml:space="preserve"> </w:t>
@@ -11991,25 +11778,13 @@
         <w:t xml:space="preserve"> </w:t>
       </w:r>
       <w:r>
-        <w:t xml:space="preserve">as both a judge and a candidate, which lets us isolate self-preference as a</w:t>
-      </w:r>
-      <w:r>
-        <w:t xml:space="preserve"> </w:t>
-      </w:r>
-      <w:r>
-        <w:t xml:space="preserve">difference-in-differences that controls for a judge's overall harshness (how much more the same-family judge favors the</w:t>
-      </w:r>
-      <w:r>
-        <w:t xml:space="preserve"> </w:t>
-      </w:r>
-      <w:r>
-        <w:t xml:space="preserve">in-family candidate over a rival than the cross-family judges do). Across the three verticals the residual effect is</w:t>
-      </w:r>
-      <w:r>
-        <w:t xml:space="preserve"> </w:t>
-      </w:r>
-      <w:r>
-        <w:t xml:space="preserve">small and inconsistent in sign,</w:t>
+        <w:t xml:space="preserve">as both a judge and a candidate in the verticals (Section 5.6), a difference-in-differences</w:t>
+      </w:r>
+      <w:r>
+        <w:t xml:space="preserve"> </w:t>
+      </w:r>
+      <w:r>
+        <w:t xml:space="preserve">that controls for a judge's overall harshness gives</w:t>
       </w:r>
       <w:r>
         <w:t xml:space="preserve"> </w:t>
@@ -12093,7 +11868,13 @@
         <w:t xml:space="preserve"> </w:t>
       </w:r>
       <w:r>
-        <w:t xml:space="preserve">on legal, and</w:t>
+        <w:t xml:space="preserve">on</w:t>
+      </w:r>
+      <w:r>
+        <w:t xml:space="preserve"> </w:t>
+      </w:r>
+      <w:r>
+        <w:t xml:space="preserve">legal, and</w:t>
       </w:r>
       <w:r>
         <w:t xml:space="preserve"> </w:t>
@@ -12113,31 +11894,7 @@
         <w:t xml:space="preserve"> </w:t>
       </w:r>
       <w:r>
-        <w:t xml:space="preserve">on drug-interaction: in a cross-family panel no systematic self-inflation survives, consistent with vendor diversity</w:t>
-      </w:r>
-      <w:r>
-        <w:t xml:space="preserve"> </w:t>
-      </w:r>
-      <w:r>
-        <w:t xml:space="preserve">already neutralizing it. The structural guarantee makes this robustness automatic rather than incidental: because a</w:t>
-      </w:r>
-      <w:r>
-        <w:t xml:space="preserve"> </w:t>
-      </w:r>
-      <w:r>
-        <w:t xml:space="preserve">model never scores its own family, a same-family preference of any sign or magnitude cannot enter the aggregate.</w:t>
-      </w:r>
-    </w:p>
-    <w:p>
-      <w:pPr>
-        <w:pStyle w:val="BodyText"/>
-        <w:jc w:val="both"/>
-        <w:keepNext w:val="0"/>
-        <w:keepLines w:val="0"/>
-        <w:widowControl w:val="1"/>
-      </w:pPr>
-      <w:r>
-        <w:t xml:space="preserve">Beyond the structural guarantee, CoEval can</w:t>
+        <w:t xml:space="preserve">on drug-interaction: no systematic self-inflation survives. As an explicit safeguard,</w:t>
       </w:r>
       <w:r>
         <w:t xml:space="preserve"> </w:t>
@@ -12147,54 +11904,19 @@
           <w:i/>
           <w:iCs/>
         </w:rPr>
-        <w:t xml:space="preserve">explicitly</w:t>
-      </w:r>
-      <w:r>
-        <w:t xml:space="preserve"> </w:t>
-      </w:r>
-      <w:r>
-        <w:t xml:space="preserve">account for systematic same-family bias through</w:t>
-      </w:r>
-      <w:r>
-        <w:t xml:space="preserve"> </w:t>
-      </w:r>
-      <w:r>
-        <w:rPr>
-          <w:i/>
-          <w:iCs/>
-        </w:rPr>
         <w:t xml:space="preserve">vendor-disjoint aggregation</w:t>
       </w:r>
       <w:r>
-        <w:t xml:space="preserve">: when scoring a model under test, the ensemble drops any judge that shares the</w:t>
-      </w:r>
-      <w:r>
-        <w:t xml:space="preserve"> </w:t>
-      </w:r>
-      <w:r>
-        <w:t xml:space="preserve">model's vendor family, so no model contributes to its own family's score. Applying this correction to the rankings</w:t>
-      </w:r>
-      <w:r>
-        <w:t xml:space="preserve"> </w:t>
-      </w:r>
-      <w:r>
-        <w:t xml:space="preserve">of Tables 3 and 5 leaves</w:t>
-      </w:r>
-      <w:r>
-        <w:t xml:space="preserve"> </w:t>
-      </w:r>
-      <w:r>
-        <w:rPr>
-          <w:i/>
-          <w:iCs/>
-        </w:rPr>
-        <w:t xml:space="preserve">every</w:t>
-      </w:r>
-      <w:r>
-        <w:t xml:space="preserve"> </w:t>
-      </w:r>
-      <w:r>
-        <w:t xml:space="preserve">ranking unchanged, with per-model scores shifting by at most</w:t>
+        <w:t xml:space="preserve"> </w:t>
+      </w:r>
+      <w:r>
+        <w:t xml:space="preserve">(when scoring a model, dropping any judge sharing its vendor family) leaves every</w:t>
+      </w:r>
+      <w:r>
+        <w:t xml:space="preserve"> </w:t>
+      </w:r>
+      <w:r>
+        <w:t xml:space="preserve">ranking in Tables 3 and 6 unchanged, with per-model scores shifting by at most</w:t>
       </w:r>
       <w:r>
         <w:t xml:space="preserve"> </w:t>
@@ -12205,19 +11927,13 @@
         </m:r>
       </m:oMath>
       <w:r>
-        <w:t xml:space="preserve">, a direct, auditable confirmation that the cross-family ensemble's rankings are already robust to</w:t>
-      </w:r>
-      <w:r>
-        <w:t xml:space="preserve"> </w:t>
-      </w:r>
-      <w:r>
-        <w:t xml:space="preserve">same-family bias. The correction is therefore available as a safeguard, and its null effect here is itself evidence</w:t>
-      </w:r>
-      <w:r>
-        <w:t xml:space="preserve"> </w:t>
-      </w:r>
-      <w:r>
-        <w:t xml:space="preserve">that vendor diversity, not a post-hoc adjustment, is doing the work.</w:t>
+        <w:t xml:space="preserve">, confirming the</w:t>
+      </w:r>
+      <w:r>
+        <w:t xml:space="preserve"> </w:t>
+      </w:r>
+      <w:r>
+        <w:t xml:space="preserve">cross-family rankings are already robust to same-family bias.</w:t>
       </w:r>
     </w:p>
     <w:bookmarkEnd w:id="36"/>

</xml_diff>

<commit_message>
paper: merge redundant 1 intro paragraphs (page budget 13->12)
Merged the two overlapping opening paragraphs (practitioner problem + 'three structural
weaknesses' both described benchmark contamination/genericness) into one tighter paragraph
with the three weaknesses inline; condensed the single-judge-bias paragraph. All citations
preserved. wins-only clean, 0 dangling, 0 em-dash. Content pages 13->12.

Co-Authored-By: Claude Opus 4.8 <noreply@anthropic.com>
</commit_message>
<xml_diff>
--- a/docs/paper/CoEval.docx
+++ b/docs/paper/CoEval.docx
@@ -450,13 +450,13 @@
         <w:t xml:space="preserve"> </w:t>
       </w:r>
       <w:r>
-        <w:t xml:space="preserve">(summarizing clinical notes, answering questions over an internal knowledge base, triaging support tickets for a</w:t>
-      </w:r>
-      <w:r>
-        <w:t xml:space="preserve"> </w:t>
-      </w:r>
-      <w:r>
-        <w:t xml:space="preserve">particular product) faces a deceptively simple question:</w:t>
+        <w:t xml:space="preserve">(summarizing clinical notes, answering over an internal knowledge base, triaging support tickets) faces a deceptively</w:t>
+      </w:r>
+      <w:r>
+        <w:t xml:space="preserve"> </w:t>
+      </w:r>
+      <w:r>
+        <w:t xml:space="preserve">simple question:</w:t>
       </w:r>
       <w:r>
         <w:t xml:space="preserve"> </w:t>
@@ -472,13 +472,19 @@
         <w:t xml:space="preserve"> </w:t>
       </w:r>
       <w:r>
-        <w:t xml:space="preserve">Answering it well requires an evaluation</w:t>
-      </w:r>
-      <w:r>
-        <w:t xml:space="preserve"> </w:t>
-      </w:r>
-      <w:r>
-        <w:t xml:space="preserve">set that reflects that use case, and two common conditions make this hard. First, there is often</w:t>
+        <w:t xml:space="preserve">Answering it well needs an evaluation set that reflects</w:t>
+      </w:r>
+      <w:r>
+        <w:t xml:space="preserve"> </w:t>
+      </w:r>
+      <w:r>
+        <w:t xml:space="preserve">that use case, and the static, human-curated benchmarks that dominate LLM evaluation make this hard in three ways. They</w:t>
+      </w:r>
+      <w:r>
+        <w:t xml:space="preserve"> </w:t>
+      </w:r>
+      <w:r>
+        <w:t xml:space="preserve">are</w:t>
       </w:r>
       <w:r>
         <w:t xml:space="preserve"> </w:t>
@@ -488,55 +494,41 @@
           <w:i/>
           <w:iCs/>
         </w:rPr>
-        <w:t xml:space="preserve">no task-specific</w:t>
+        <w:t xml:space="preserve">non-extensible</w:t>
+      </w:r>
+      <w:r>
+        <w:t xml:space="preserve"> </w:t>
+      </w:r>
+      <w:r>
+        <w:t xml:space="preserve">(covering a new domain or difficulty band needs fresh, slow annotation, and for a</w:t>
+      </w:r>
+      <w:r>
+        <w:t xml:space="preserve"> </w:t>
+      </w:r>
+      <w:r>
+        <w:t xml:space="preserve">proprietary domain the data may not exist at all);</w:t>
+      </w:r>
+      <w:r>
+        <w:t xml:space="preserve"> </w:t>
       </w:r>
       <w:r>
         <w:rPr>
           <w:i/>
           <w:iCs/>
         </w:rPr>
-        <w:t xml:space="preserve"> </w:t>
-      </w:r>
-      <w:r>
-        <w:rPr>
-          <w:i/>
-          <w:iCs/>
-        </w:rPr>
-        <w:t xml:space="preserve">labeled data</w:t>
-      </w:r>
-      <w:r>
-        <w:t xml:space="preserve">: building a representative benchmark by hand is slow and costly, and for a new or proprietary domain</w:t>
-      </w:r>
-      <w:r>
-        <w:t xml:space="preserve"> </w:t>
-      </w:r>
-      <w:r>
-        <w:t xml:space="preserve">it may not exist at all. Second, even where a related public benchmark exists, its numbers may not be trustworthy:</w:t>
-      </w:r>
-      <w:r>
-        <w:t xml:space="preserve"> </w:t>
-      </w:r>
-      <w:r>
-        <w:t xml:space="preserve">popular benchmarks are increasingly</w:t>
-      </w:r>
-      <w:r>
-        <w:t xml:space="preserve"> </w:t>
-      </w:r>
-      <w:r>
-        <w:rPr>
-          <w:i/>
-          <w:iCs/>
-        </w:rPr>
-        <w:t xml:space="preserve">contaminated</w:t>
-      </w:r>
-      <w:r>
-        <w:t xml:space="preserve">, their items having leaked into pretraining corpora, so a</w:t>
-      </w:r>
-      <w:r>
-        <w:t xml:space="preserve"> </w:t>
-      </w:r>
-      <w:r>
-        <w:t xml:space="preserve">high score can reflect memorization rather than capability [</w:t>
+        <w:t xml:space="preserve">contamination-prone</w:t>
+      </w:r>
+      <w:r>
+        <w:t xml:space="preserve"> </w:t>
+      </w:r>
+      <w:r>
+        <w:t xml:space="preserve">(public items leak into pretraining</w:t>
+      </w:r>
+      <w:r>
+        <w:t xml:space="preserve"> </w:t>
+      </w:r>
+      <w:r>
+        <w:t xml:space="preserve">corpora, so a high score can reflect memorization rather than capability [</w:t>
       </w:r>
       <w:hyperlink w:anchor="r12">
         <w:r>
@@ -561,13 +553,7 @@
         </w:r>
       </w:hyperlink>
       <w:r>
-        <w:t xml:space="preserve">].</w:t>
-      </w:r>
-      <w:r>
-        <w:t xml:space="preserve"> </w:t>
-      </w:r>
-      <w:r>
-        <w:t xml:space="preserve">When both hold, with no data</w:t>
+        <w:t xml:space="preserve">]); and</w:t>
       </w:r>
       <w:r>
         <w:t xml:space="preserve"> </w:t>
@@ -577,13 +563,41 @@
           <w:i/>
           <w:iCs/>
         </w:rPr>
-        <w:t xml:space="preserve">and</w:t>
-      </w:r>
-      <w:r>
-        <w:t xml:space="preserve"> </w:t>
-      </w:r>
-      <w:r>
-        <w:t xml:space="preserve">no benchmark one can trust, the practitioner is stuck.</w:t>
+        <w:t xml:space="preserve">generic</w:t>
+      </w:r>
+      <w:r>
+        <w:t xml:space="preserve"> </w:t>
+      </w:r>
+      <w:r>
+        <w:t xml:space="preserve">(an average-case distribution rarely matches the inputs, scoring criteria,</w:t>
+      </w:r>
+      <w:r>
+        <w:t xml:space="preserve"> </w:t>
+      </w:r>
+      <w:r>
+        <w:t xml:space="preserve">or edge cases of a particular system). When a practitioner has neither task-specific labeled data</w:t>
+      </w:r>
+      <w:r>
+        <w:t xml:space="preserve"> </w:t>
+      </w:r>
+      <w:r>
+        <w:rPr>
+          <w:i/>
+          <w:iCs/>
+        </w:rPr>
+        <w:t xml:space="preserve">nor</w:t>
+      </w:r>
+      <w:r>
+        <w:t xml:space="preserve"> </w:t>
+      </w:r>
+      <w:r>
+        <w:t xml:space="preserve">a</w:t>
+      </w:r>
+      <w:r>
+        <w:t xml:space="preserve"> </w:t>
+      </w:r>
+      <w:r>
+        <w:t xml:space="preserve">benchmark they can trust, they are stuck.</w:t>
       </w:r>
       <w:r>
         <w:t xml:space="preserve"> </w:t>
@@ -599,13 +613,19 @@
         <w:t xml:space="preserve"> </w:t>
       </w:r>
       <w:r>
-        <w:t xml:space="preserve">is built for exactly this situation: it generates a fresh, domain-targeted evaluation from a task description and</w:t>
-      </w:r>
-      <w:r>
-        <w:t xml:space="preserve"> </w:t>
-      </w:r>
-      <w:r>
-        <w:t xml:space="preserve">ranks candidate models on it, with no labels and no contaminated items.</w:t>
+        <w:t xml:space="preserve">is built for exactly this situation: it generates a</w:t>
+      </w:r>
+      <w:r>
+        <w:t xml:space="preserve"> </w:t>
+      </w:r>
+      <w:r>
+        <w:t xml:space="preserve">fresh, domain-targeted evaluation from a task description and ranks candidate models on it, with no labels and no</w:t>
+      </w:r>
+      <w:r>
+        <w:t xml:space="preserve"> </w:t>
+      </w:r>
+      <w:r>
+        <w:t xml:space="preserve">contaminated items.</w:t>
       </w:r>
     </w:p>
     <w:p>
@@ -617,118 +637,6 @@
         <w:widowControl w:val="1"/>
       </w:pPr>
       <w:r>
-        <w:t xml:space="preserve">The evaluation of large language models is dominated by static, human-curated benchmarks. While these have driven a</w:t>
-      </w:r>
-      <w:r>
-        <w:t xml:space="preserve"> </w:t>
-      </w:r>
-      <w:r>
-        <w:t xml:space="preserve">decade of measurable progress, three structural weaknesses now limit their usefulness for real deployments. First,</w:t>
-      </w:r>
-      <w:r>
-        <w:t xml:space="preserve"> </w:t>
-      </w:r>
-      <w:r>
-        <w:t xml:space="preserve">static benchmarks are</w:t>
-      </w:r>
-      <w:r>
-        <w:t xml:space="preserve"> </w:t>
-      </w:r>
-      <w:r>
-        <w:rPr>
-          <w:i/>
-          <w:iCs/>
-        </w:rPr>
-        <w:t xml:space="preserve">non-extensible</w:t>
-      </w:r>
-      <w:r>
-        <w:t xml:space="preserve">: extending a benchmark to a new capability, domain, or difficulty band</w:t>
-      </w:r>
-      <w:r>
-        <w:t xml:space="preserve"> </w:t>
-      </w:r>
-      <w:r>
-        <w:t xml:space="preserve">requires fresh human annotation, which is slow and expensive. Second, they are</w:t>
-      </w:r>
-      <w:r>
-        <w:t xml:space="preserve"> </w:t>
-      </w:r>
-      <w:r>
-        <w:rPr>
-          <w:i/>
-          <w:iCs/>
-        </w:rPr>
-        <w:t xml:space="preserve">contamination-prone</w:t>
-      </w:r>
-      <w:r>
-        <w:t xml:space="preserve">: as models</w:t>
-      </w:r>
-      <w:r>
-        <w:t xml:space="preserve"> </w:t>
-      </w:r>
-      <w:r>
-        <w:t xml:space="preserve">ingest ever-larger web crawls, public test items leak into pretraining corpora, and measured performance reflects</w:t>
-      </w:r>
-      <w:r>
-        <w:t xml:space="preserve"> </w:t>
-      </w:r>
-      <w:r>
-        <w:t xml:space="preserve">memorization rather than generalization [</w:t>
-      </w:r>
-      <w:hyperlink w:anchor="r12">
-        <w:r>
-          <w:rPr>
-            <w:rStyle w:val="Hyperlink"/>
-          </w:rPr>
-          <w:t xml:space="preserve">12</w:t>
-        </w:r>
-      </w:hyperlink>
-      <w:r>
-        <w:t xml:space="preserve">,</w:t>
-      </w:r>
-      <w:r>
-        <w:t xml:space="preserve"> </w:t>
-      </w:r>
-      <w:hyperlink w:anchor="r13">
-        <w:r>
-          <w:rPr>
-            <w:rStyle w:val="Hyperlink"/>
-          </w:rPr>
-          <w:t xml:space="preserve">13</w:t>
-        </w:r>
-      </w:hyperlink>
-      <w:r>
-        <w:t xml:space="preserve">]. Third, they are</w:t>
-      </w:r>
-      <w:r>
-        <w:t xml:space="preserve"> </w:t>
-      </w:r>
-      <w:r>
-        <w:rPr>
-          <w:i/>
-          <w:iCs/>
-        </w:rPr>
-        <w:t xml:space="preserve">generic</w:t>
-      </w:r>
-      <w:r>
-        <w:t xml:space="preserve">: a fixed benchmark measures an average-case distribution that rarely matches the input distribution,</w:t>
-      </w:r>
-      <w:r>
-        <w:t xml:space="preserve"> </w:t>
-      </w:r>
-      <w:r>
-        <w:t xml:space="preserve">scoring criteria, or edge cases of any particular production system.</w:t>
-      </w:r>
-    </w:p>
-    <w:p>
-      <w:pPr>
-        <w:pStyle w:val="BodyText"/>
-        <w:jc w:val="both"/>
-        <w:keepNext w:val="0"/>
-        <w:keepLines w:val="0"/>
-        <w:widowControl w:val="1"/>
-      </w:pPr>
-      <w:r>
         <w:t xml:space="preserve">LLM-as-judge evaluation [</w:t>
       </w:r>
       <w:hyperlink w:anchor="r1">
@@ -754,19 +662,19 @@
         </w:r>
       </w:hyperlink>
       <w:r>
-        <w:t xml:space="preserve">] addresses the cost and extensibility of</w:t>
-      </w:r>
-      <w:r>
-        <w:t xml:space="preserve"> </w:t>
-      </w:r>
-      <w:r>
-        <w:t xml:space="preserve">scoring: a capable model grades free-form responses against a rubric at a fraction of the cost of human raters. But a</w:t>
-      </w:r>
-      <w:r>
-        <w:t xml:space="preserve"> </w:t>
-      </w:r>
-      <w:r>
-        <w:t xml:space="preserve">single judge is not a neutral instrument. Judges exhibit</w:t>
+        <w:t xml:space="preserve">] addresses the cost and extensibility of scoring,</w:t>
+      </w:r>
+      <w:r>
+        <w:t xml:space="preserve"> </w:t>
+      </w:r>
+      <w:r>
+        <w:t xml:space="preserve">grading free-form responses against a rubric at a fraction of human cost, but a single judge is not a neutral</w:t>
+      </w:r>
+      <w:r>
+        <w:t xml:space="preserve"> </w:t>
+      </w:r>
+      <w:r>
+        <w:t xml:space="preserve">instrument: judges exhibit positional,</w:t>
       </w:r>
       <w:r>
         <w:t xml:space="preserve"> </w:t>
@@ -776,35 +684,7 @@
           <w:i/>
           <w:iCs/>
         </w:rPr>
-        <w:t xml:space="preserve">positional bias</w:t>
-      </w:r>
-      <w:r>
-        <w:t xml:space="preserve"> </w:t>
-      </w:r>
-      <w:r>
-        <w:t xml:space="preserve">(preferring the first option in a</w:t>
-      </w:r>
-      <w:r>
-        <w:t xml:space="preserve"> </w:t>
-      </w:r>
-      <w:r>
-        <w:t xml:space="preserve">pairwise comparison),</w:t>
-      </w:r>
-      <w:r>
-        <w:t xml:space="preserve"> </w:t>
-      </w:r>
-      <w:r>
-        <w:rPr>
-          <w:i/>
-          <w:iCs/>
-        </w:rPr>
-        <w:t xml:space="preserve">verbosity bias</w:t>
-      </w:r>
-      <w:r>
-        <w:t xml:space="preserve"> </w:t>
-      </w:r>
-      <w:r>
-        <w:t xml:space="preserve">(rewarding longer answers irrespective of quality)</w:t>
+        <w:t xml:space="preserve">verbosity</w:t>
       </w:r>
       <w:r>
         <w:t xml:space="preserve"> </w:t>
@@ -831,19 +711,19 @@
           <w:i/>
           <w:iCs/>
         </w:rPr>
-        <w:t xml:space="preserve">self-preference bias</w:t>
-      </w:r>
-      <w:r>
-        <w:t xml:space="preserve"> </w:t>
-      </w:r>
-      <w:r>
-        <w:t xml:space="preserve">(scoring outputs from their own model family more</w:t>
-      </w:r>
-      <w:r>
-        <w:t xml:space="preserve"> </w:t>
-      </w:r>
-      <w:r>
-        <w:t xml:space="preserve">favorably). A measurement built on a single biased instrument inherits that instrument's distortions wholesale.</w:t>
+        <w:t xml:space="preserve">self-preference</w:t>
+      </w:r>
+      <w:r>
+        <w:t xml:space="preserve"> </w:t>
+      </w:r>
+      <w:r>
+        <w:t xml:space="preserve">biases,</w:t>
+      </w:r>
+      <w:r>
+        <w:t xml:space="preserve"> </w:t>
+      </w:r>
+      <w:r>
+        <w:t xml:space="preserve">and a measurement built on one biased instrument inherits its distortions.</w:t>
       </w:r>
     </w:p>
     <w:p>

</xml_diff>

<commit_message>
paper: condense Related Work 2.1 (~35% shorter, all citations preserved)
Tightened the four 2.1 paragraphs (single-judge methods, PoLL, self-preference evidence,
label-free aggregation) preserving every citation and contrast. ~18 lines saved (accumulating
toward the page boundary). Gates clean (no dangling cite, 0 em-dash, $ balanced). Content
pages 12 (15->12 cumulative this pass).

Co-Authored-By: Claude Opus 4.8 <noreply@anthropic.com>
</commit_message>
<xml_diff>
--- a/docs/paper/CoEval.docx
+++ b/docs/paper/CoEval.docx
@@ -1553,13 +1553,13 @@
         </w:r>
       </w:hyperlink>
       <w:r>
-        <w:t xml:space="preserve">] established LLM-as-judge as a scalable proxy for human</w:t>
-      </w:r>
-      <w:r>
-        <w:t xml:space="preserve"> </w:t>
-      </w:r>
-      <w:r>
-        <w:t xml:space="preserve">preference, and documented its biases. G-Eval [</w:t>
+        <w:t xml:space="preserve">] established LLM-as-judge as a scalable proxy for human preference and</w:t>
+      </w:r>
+      <w:r>
+        <w:t xml:space="preserve"> </w:t>
+      </w:r>
+      <w:r>
+        <w:t xml:space="preserve">documented its biases. G-Eval [</w:t>
       </w:r>
       <w:hyperlink w:anchor="r2">
         <w:r>
@@ -1570,19 +1570,13 @@
         </w:r>
       </w:hyperlink>
       <w:r>
-        <w:t xml:space="preserve">] uses a single strong model with</w:t>
-      </w:r>
-      <w:r>
-        <w:t xml:space="preserve"> </w:t>
-      </w:r>
-      <w:r>
-        <w:t xml:space="preserve">chain-of-thought to score generation quality against a user-supplied rubric, while Prometheus 2</w:t>
-      </w:r>
-      <w:r>
-        <w:t xml:space="preserve"> </w:t>
-      </w:r>
-      <w:r>
-        <w:t xml:space="preserve">[</w:t>
+        <w:t xml:space="preserve">] scores against a user-supplied rubric with chain-of-thought;</w:t>
+      </w:r>
+      <w:r>
+        <w:t xml:space="preserve"> </w:t>
+      </w:r>
+      <w:r>
+        <w:t xml:space="preserve">Prometheus 2 [</w:t>
       </w:r>
       <w:hyperlink w:anchor="r3">
         <w:r>
@@ -1615,13 +1609,13 @@
         </w:r>
       </w:hyperlink>
       <w:r>
-        <w:t xml:space="preserve">] train dedicated</w:t>
-      </w:r>
-      <w:r>
-        <w:t xml:space="preserve"> </w:t>
-      </w:r>
-      <w:r>
-        <w:t xml:space="preserve">open evaluators. These approaches are</w:t>
+        <w:t xml:space="preserve">] train</w:t>
+      </w:r>
+      <w:r>
+        <w:t xml:space="preserve"> </w:t>
+      </w:r>
+      <w:r>
+        <w:t xml:space="preserve">dedicated open evaluators. These are</w:t>
       </w:r>
       <w:r>
         <w:t xml:space="preserve"> </w:t>
@@ -1634,35 +1628,19 @@
         <w:t xml:space="preserve">single-judge</w:t>
       </w:r>
       <w:r>
-        <w:t xml:space="preserve">: they</w:t>
-      </w:r>
-      <w:r>
-        <w:t xml:space="preserve"> </w:t>
-      </w:r>
-      <w:r>
-        <w:t xml:space="preserve">require the user to provide the rubric and inherit one model's biases. CoEval instead</w:t>
-      </w:r>
-      <w:r>
-        <w:t xml:space="preserve"> </w:t>
-      </w:r>
-      <w:r>
-        <w:rPr>
-          <w:i/>
-          <w:iCs/>
-        </w:rPr>
-        <w:t xml:space="preserve">generates</w:t>
-      </w:r>
-      <w:r>
-        <w:t xml:space="preserve"> </w:t>
-      </w:r>
-      <w:r>
-        <w:t xml:space="preserve">the rubric</w:t>
-      </w:r>
-      <w:r>
-        <w:t xml:space="preserve"> </w:t>
-      </w:r>
-      <w:r>
-        <w:t xml:space="preserve">automatically from the task definition and aggregates across a diverse panel. FLAMe [</w:t>
+        <w:t xml:space="preserve">: they need a user-supplied rubric and inherit one model's</w:t>
+      </w:r>
+      <w:r>
+        <w:t xml:space="preserve"> </w:t>
+      </w:r>
+      <w:r>
+        <w:t xml:space="preserve">biases. CoEval instead generates the rubric from the task definition and aggregates across a diverse panel. FLAMe</w:t>
+      </w:r>
+      <w:r>
+        <w:t xml:space="preserve"> </w:t>
+      </w:r>
+      <w:r>
+        <w:t xml:space="preserve">[</w:t>
       </w:r>
       <w:hyperlink w:anchor="r4">
         <w:r>
@@ -1673,13 +1651,7 @@
         </w:r>
       </w:hyperlink>
       <w:r>
-        <w:t xml:space="preserve">]</w:t>
-      </w:r>
-      <w:r>
-        <w:t xml:space="preserve"> </w:t>
-      </w:r>
-      <w:r>
-        <w:t xml:space="preserve">and JudgeBench [</w:t>
+        <w:t xml:space="preserve">] and JudgeBench [</w:t>
       </w:r>
       <w:hyperlink w:anchor="r6">
         <w:r>
@@ -1690,7 +1662,7 @@
         </w:r>
       </w:hyperlink>
       <w:r>
-        <w:t xml:space="preserve">] study the reliability of judge models, and BiGGen-Bench</w:t>
+        <w:t xml:space="preserve">] study judge reliability and BiGGen-Bench</w:t>
       </w:r>
       <w:r>
         <w:t xml:space="preserve"> </w:t>
@@ -1707,13 +1679,13 @@
         </w:r>
       </w:hyperlink>
       <w:r>
-        <w:t xml:space="preserve">] introduces instance-specific evaluation criteria; CoEval is complementary, adding a</w:t>
-      </w:r>
-      <w:r>
-        <w:t xml:space="preserve"> </w:t>
-      </w:r>
-      <w:r>
-        <w:t xml:space="preserve">cross-family aggregation layer and live agreement monitoring on top of any such judges.</w:t>
+        <w:t xml:space="preserve">] introduces instance-specific criteria; CoEval is complementary, adding cross-family aggregation</w:t>
+      </w:r>
+      <w:r>
+        <w:t xml:space="preserve"> </w:t>
+      </w:r>
+      <w:r>
+        <w:t xml:space="preserve">and live agreement monitoring on top of any such judges.</w:t>
       </w:r>
     </w:p>
     <w:p>
@@ -1725,7 +1697,7 @@
         <w:widowControl w:val="1"/>
       </w:pPr>
       <w:r>
-        <w:t xml:space="preserve">Closest to our judging design is</w:t>
+        <w:t xml:space="preserve">Closest to our judging design,</w:t>
       </w:r>
       <w:r>
         <w:t xml:space="preserve"> </w:t>
@@ -1752,19 +1724,19 @@
         </w:r>
       </w:hyperlink>
       <w:r>
-        <w:t xml:space="preserve">], which</w:t>
-      </w:r>
-      <w:r>
-        <w:t xml:space="preserve"> </w:t>
-      </w:r>
-      <w:r>
-        <w:t xml:space="preserve">shows a panel of smaller judges can rival a single large judge while reducing intra-model bias and cost. CoEval shares</w:t>
-      </w:r>
-      <w:r>
-        <w:t xml:space="preserve"> </w:t>
-      </w:r>
-      <w:r>
-        <w:t xml:space="preserve">the panel philosophy but extends it in three ways: (i) it couples the panel to</w:t>
+        <w:t xml:space="preserve">] shows a panel of</w:t>
+      </w:r>
+      <w:r>
+        <w:t xml:space="preserve"> </w:t>
+      </w:r>
+      <w:r>
+        <w:t xml:space="preserve">smaller judges can rival a single large judge while reducing bias and cost. CoEval extends this in three ways: it</w:t>
+      </w:r>
+      <w:r>
+        <w:t xml:space="preserve"> </w:t>
+      </w:r>
+      <w:r>
+        <w:t xml:space="preserve">couples the panel to attribute-controlled, contamination-free</w:t>
       </w:r>
       <w:r>
         <w:t xml:space="preserve"> </w:t>
@@ -1774,49 +1746,41 @@
           <w:i/>
           <w:iCs/>
         </w:rPr>
-        <w:t xml:space="preserve">attribute-controlled,</w:t>
+        <w:t xml:space="preserve">generation</w:t>
+      </w:r>
+      <w:r>
+        <w:t xml:space="preserve"> </w:t>
+      </w:r>
+      <w:r>
+        <w:t xml:space="preserve">rather than scoring a fixed set; it</w:t>
+      </w:r>
+      <w:r>
+        <w:t xml:space="preserve"> </w:t>
+      </w:r>
+      <w:r>
+        <w:t xml:space="preserve">enforces</w:t>
+      </w:r>
+      <w:r>
+        <w:t xml:space="preserve"> </w:t>
       </w:r>
       <w:r>
         <w:rPr>
           <w:i/>
           <w:iCs/>
         </w:rPr>
-        <w:t xml:space="preserve"> </w:t>
-      </w:r>
-      <w:r>
-        <w:rPr>
-          <w:i/>
-          <w:iCs/>
-        </w:rPr>
-        <w:t xml:space="preserve">contamination-free generation</w:t>
-      </w:r>
-      <w:r>
-        <w:t xml:space="preserve"> </w:t>
-      </w:r>
-      <w:r>
-        <w:t xml:space="preserve">rather than scoring a fixed set; (ii) it enforces explicit</w:t>
-      </w:r>
-      <w:r>
-        <w:t xml:space="preserve"> </w:t>
-      </w:r>
-      <w:r>
-        <w:rPr>
-          <w:i/>
-          <w:iCs/>
-        </w:rPr>
         <w:t xml:space="preserve">cross-family</w:t>
       </w:r>
       <w:r>
         <w:t xml:space="preserve"> </w:t>
       </w:r>
       <w:r>
-        <w:t xml:space="preserve">composition and reports the finding that composition dominates size; and (iii) it adds role separation</w:t>
-      </w:r>
-      <w:r>
-        <w:t xml:space="preserve"> </w:t>
-      </w:r>
-      <w:r>
-        <w:t xml:space="preserve">(teacher/student/judge) with self-preference monitoring built in. ChatEval [</w:t>
+        <w:t xml:space="preserve">composition and reports that composition dominates size; and it adds teacher/student/judge</w:t>
+      </w:r>
+      <w:r>
+        <w:t xml:space="preserve"> </w:t>
+      </w:r>
+      <w:r>
+        <w:t xml:space="preserve">role separation with self-preference monitoring. ChatEval [</w:t>
       </w:r>
       <w:hyperlink w:anchor="r21">
         <w:r>
@@ -1827,13 +1791,13 @@
         </w:r>
       </w:hyperlink>
       <w:r>
-        <w:t xml:space="preserve">] and</w:t>
-      </w:r>
-      <w:r>
-        <w:t xml:space="preserve"> </w:t>
-      </w:r>
-      <w:r>
-        <w:t xml:space="preserve">meta-judge frameworks [</w:t>
+        <w:t xml:space="preserve">] and meta-judge frameworks</w:t>
+      </w:r>
+      <w:r>
+        <w:t xml:space="preserve"> </w:t>
+      </w:r>
+      <w:r>
+        <w:t xml:space="preserve">[</w:t>
       </w:r>
       <w:hyperlink w:anchor="r26">
         <w:r>
@@ -1844,13 +1808,7 @@
         </w:r>
       </w:hyperlink>
       <w:r>
-        <w:t xml:space="preserve">] improve reliability through intra-pool multi-agent</w:t>
-      </w:r>
-      <w:r>
-        <w:t xml:space="preserve"> </w:t>
-      </w:r>
-      <w:r>
-        <w:t xml:space="preserve">deliberation; CoEval instead rotates models</w:t>
+        <w:t xml:space="preserve">] improve reliability through intra-pool deliberation; CoEval instead rotates models</w:t>
       </w:r>
       <w:r>
         <w:t xml:space="preserve"> </w:t>
@@ -1863,13 +1821,10 @@
         <w:t xml:space="preserve">across vendors</w:t>
       </w:r>
       <w:r>
-        <w:t xml:space="preserve">, targeting cross-family bias cancellation rather</w:t>
-      </w:r>
-      <w:r>
-        <w:t xml:space="preserve"> </w:t>
-      </w:r>
-      <w:r>
-        <w:t xml:space="preserve">than intra-pool debate alone.</w:t>
+        <w:t xml:space="preserve"> </w:t>
+      </w:r>
+      <w:r>
+        <w:t xml:space="preserve">for cross-family bias cancellation.</w:t>
       </w:r>
     </w:p>
     <w:p>
@@ -1881,13 +1836,7 @@
         <w:widowControl w:val="1"/>
       </w:pPr>
       <w:r>
-        <w:t xml:space="preserve">Our cross-family design is directly motivated by recent evidence that judge–generator relatedness is itself a</w:t>
-      </w:r>
-      <w:r>
-        <w:t xml:space="preserve"> </w:t>
-      </w:r>
-      <w:r>
-        <w:t xml:space="preserve">contamination vector.</w:t>
+        <w:t xml:space="preserve">The cross-family design is motivated by evidence that judge–generator relatedness is a contamination vector:</w:t>
       </w:r>
       <w:r>
         <w:t xml:space="preserve"> </w:t>
@@ -1914,13 +1863,13 @@
         </w:r>
       </w:hyperlink>
       <w:r>
-        <w:t xml:space="preserve">] shows that a judge sharing a model,</w:t>
-      </w:r>
-      <w:r>
-        <w:t xml:space="preserve"> </w:t>
-      </w:r>
-      <w:r>
-        <w:t xml:space="preserve">lineage, or vendor family with the generator silently inflates scores, and</w:t>
+        <w:t xml:space="preserve">] shows a judge sharing a model or vendor family with the generator</w:t>
+      </w:r>
+      <w:r>
+        <w:t xml:space="preserve"> </w:t>
+      </w:r>
+      <w:r>
+        <w:t xml:space="preserve">inflates scores, and</w:t>
       </w:r>
       <w:r>
         <w:t xml:space="preserve"> </w:t>
@@ -1947,13 +1896,13 @@
         </w:r>
       </w:hyperlink>
       <w:r>
-        <w:t xml:space="preserve">] measures this same-family bias statistically, finding that frontier models favor</w:t>
-      </w:r>
-      <w:r>
-        <w:t xml:space="preserve"> </w:t>
-      </w:r>
-      <w:r>
-        <w:t xml:space="preserve">same-family outputs. Self-preference has been characterized mechanistically [</w:t>
+        <w:t xml:space="preserve">] measures this same-family bias statistically.</w:t>
+      </w:r>
+      <w:r>
+        <w:t xml:space="preserve"> </w:t>
+      </w:r>
+      <w:r>
+        <w:t xml:space="preserve">Self-preference has been characterized mechanistically [</w:t>
       </w:r>
       <w:hyperlink w:anchor="r18">
         <w:r>
@@ -1964,13 +1913,13 @@
         </w:r>
       </w:hyperlink>
       <w:r>
-        <w:t xml:space="preserve">] and</w:t>
-      </w:r>
-      <w:r>
-        <w:t xml:space="preserve"> </w:t>
-      </w:r>
-      <w:r>
-        <w:t xml:space="preserve">partly attributed to legitimate capability rather than pure bias [</w:t>
+        <w:t xml:space="preserve">] and partly attributed to capability</w:t>
+      </w:r>
+      <w:r>
+        <w:t xml:space="preserve"> </w:t>
+      </w:r>
+      <w:r>
+        <w:t xml:space="preserve">rather than bias [</w:t>
       </w:r>
       <w:hyperlink w:anchor="r24">
         <w:r>
@@ -1981,13 +1930,7 @@
         </w:r>
       </w:hyperlink>
       <w:r>
-        <w:t xml:space="preserve">]. Broad bias</w:t>
-      </w:r>
-      <w:r>
-        <w:t xml:space="preserve"> </w:t>
-      </w:r>
-      <w:r>
-        <w:t xml:space="preserve">taxonomies [</w:t>
+        <w:t xml:space="preserve">]; broad taxonomies and surveys [</w:t>
       </w:r>
       <w:hyperlink w:anchor="r17">
         <w:r>
@@ -1998,7 +1941,10 @@
         </w:r>
       </w:hyperlink>
       <w:r>
-        <w:t xml:space="preserve">] and recent surveys [</w:t>
+        <w:t xml:space="preserve">,</w:t>
+      </w:r>
+      <w:r>
+        <w:t xml:space="preserve"> </w:t>
       </w:r>
       <w:hyperlink w:anchor="r19">
         <w:r>
@@ -2023,13 +1969,7 @@
         </w:r>
       </w:hyperlink>
       <w:r>
-        <w:t xml:space="preserve">]</w:t>
-      </w:r>
-      <w:r>
-        <w:t xml:space="preserve"> </w:t>
-      </w:r>
-      <w:r>
-        <w:t xml:space="preserve">catalogue position, verbosity, and self-enhancement biases on fixed benchmarks. Where these works</w:t>
+        <w:t xml:space="preserve">] catalogue position, verbosity, and self-enhancement biases. Where these works</w:t>
       </w:r>
       <w:r>
         <w:t xml:space="preserve"> </w:t>
@@ -2061,7 +2001,7 @@
         <w:t xml:space="preserve"> </w:t>
       </w:r>
       <w:r>
-        <w:t xml:space="preserve">the biases of individual judges, CoEval treats cross-family composition as a</w:t>
+        <w:t xml:space="preserve">individual-judge biases, CoEval makes cross-family composition a</w:t>
       </w:r>
       <w:r>
         <w:t xml:space="preserve"> </w:t>
@@ -2071,33 +2011,19 @@
           <w:i/>
           <w:iCs/>
         </w:rPr>
-        <w:t xml:space="preserve">design</w:t>
-      </w:r>
-      <w:r>
-        <w:rPr>
-          <w:i/>
-          <w:iCs/>
-        </w:rPr>
-        <w:t xml:space="preserve"> </w:t>
-      </w:r>
-      <w:r>
-        <w:rPr>
-          <w:i/>
-          <w:iCs/>
-        </w:rPr>
-        <w:t xml:space="preserve">constraint</w:t>
-      </w:r>
-      <w:r>
-        <w:t xml:space="preserve"> </w:t>
-      </w:r>
-      <w:r>
-        <w:t xml:space="preserve">that cancels same-family preference at the aggregation level, and pairs it with</w:t>
-      </w:r>
-      <w:r>
-        <w:t xml:space="preserve"> </w:t>
-      </w:r>
-      <w:r>
-        <w:t xml:space="preserve">contamination-free item generation, so both items and judges are bias-hardened rather than only the scoring step.</w:t>
+        <w:t xml:space="preserve">design constraint</w:t>
+      </w:r>
+      <w:r>
+        <w:t xml:space="preserve"> </w:t>
+      </w:r>
+      <w:r>
+        <w:t xml:space="preserve">that cancels same-family preference at aggregation, paired with contamination-free generation, so both items and judges</w:t>
+      </w:r>
+      <w:r>
+        <w:t xml:space="preserve"> </w:t>
+      </w:r>
+      <w:r>
+        <w:t xml:space="preserve">are bias-hardened.</w:t>
       </w:r>
     </w:p>
     <w:p>
@@ -2109,7 +2035,7 @@
         <w:widowControl w:val="1"/>
       </w:pPr>
       <w:r>
-        <w:t xml:space="preserve">The idea that a rater's reliability can be inferred from inter-rater agreement, with no ground truth, dates back to</w:t>
+        <w:t xml:space="preserve">Inferring rater reliability from inter-rater agreement without ground truth dates to</w:t>
       </w:r>
       <w:r>
         <w:t xml:space="preserve"> </w:t>
@@ -2136,50 +2062,19 @@
         </w:r>
       </w:hyperlink>
       <w:r>
-        <w:t xml:space="preserve">], whose EM algorithm estimates latent labels and per-rater error rates</w:t>
-      </w:r>
-      <w:r>
-        <w:t xml:space="preserve"> </w:t>
-      </w:r>
-      <w:r>
-        <w:t xml:space="preserve">jointly; CoEval applies the same principle to a vendor-disjoint LLM panel, where peer agreement both down-weights and</w:t>
-      </w:r>
-      <w:r>
-        <w:t xml:space="preserve"> </w:t>
-      </w:r>
-      <w:r>
-        <w:t xml:space="preserve">diagnoses unreliable judges (Section 5.2).</w:t>
-      </w:r>
-      <w:r>
-        <w:t xml:space="preserve"> </w:t>
-      </w:r>
-      <w:r>
-        <w:t xml:space="preserve">A parallel and very recent line of work makes judge aggregation itself</w:t>
-      </w:r>
-      <w:r>
-        <w:t xml:space="preserve"> </w:t>
-      </w:r>
-      <w:r>
-        <w:rPr>
-          <w:i/>
-          <w:iCs/>
-        </w:rPr>
-        <w:t xml:space="preserve">label-free and reliability-aware</w:t>
-      </w:r>
-      <w:r>
-        <w:t xml:space="preserve">.</w:t>
-      </w:r>
-      <w:r>
-        <w:t xml:space="preserve"> </w:t>
-      </w:r>
-      <w:r>
-        <w:t xml:space="preserve">Judge-aware jury methods learn a per-judge reliability parameter jointly with the model ranking from pairwise</w:t>
-      </w:r>
-      <w:r>
-        <w:t xml:space="preserve"> </w:t>
-      </w:r>
-      <w:r>
-        <w:t xml:space="preserve">comparisons (the judge-discriminator Bradley–Terry model of [</w:t>
+        <w:t xml:space="preserve">]; CoEval applies this to a vendor-disjoint LLM panel where peer agreement down-weights and</w:t>
+      </w:r>
+      <w:r>
+        <w:t xml:space="preserve"> </w:t>
+      </w:r>
+      <w:r>
+        <w:t xml:space="preserve">diagnoses unreliable judges (Section 5.2). Recent label-free methods learn per-judge reliability jointly with the</w:t>
+      </w:r>
+      <w:r>
+        <w:t xml:space="preserve"> </w:t>
+      </w:r>
+      <w:r>
+        <w:t xml:space="preserve">ranking from pairwise comparisons (judge-aware Bradley–Terry [</w:t>
       </w:r>
       <w:hyperlink w:anchor="r27">
         <w:r>
@@ -2190,13 +2085,13 @@
         </w:r>
       </w:hyperlink>
       <w:r>
-        <w:t xml:space="preserve">] and the judge-aware ranking</w:t>
-      </w:r>
-      <w:r>
-        <w:t xml:space="preserve"> </w:t>
-      </w:r>
-      <w:r>
-        <w:t xml:space="preserve">framework of [</w:t>
+        <w:t xml:space="preserve">], judge-aware ranking</w:t>
+      </w:r>
+      <w:r>
+        <w:t xml:space="preserve"> </w:t>
+      </w:r>
+      <w:r>
+        <w:t xml:space="preserve">[</w:t>
       </w:r>
       <w:hyperlink w:anchor="r29">
         <w:r>
@@ -2207,7 +2102,7 @@
         </w:r>
       </w:hyperlink>
       <w:r>
-        <w:t xml:space="preserve">]), and confounder-aware aggregation [</w:t>
+        <w:t xml:space="preserve">]) or separate quality from shared confounders [</w:t>
       </w:r>
       <w:hyperlink w:anchor="r28">
         <w:r>
@@ -2218,25 +2113,13 @@
         </w:r>
       </w:hyperlink>
       <w:r>
-        <w:t xml:space="preserve">] separates true</w:t>
-      </w:r>
-      <w:r>
-        <w:t xml:space="preserve"> </w:t>
-      </w:r>
-      <w:r>
-        <w:t xml:space="preserve">quality from shared judge confounders without ground-truth labels. CoEval's unsupervised reliability-weighted</w:t>
-      </w:r>
-      <w:r>
-        <w:t xml:space="preserve"> </w:t>
-      </w:r>
-      <w:r>
-        <w:t xml:space="preserve">aggregator (Section 5.2) shares this label-free goal, and our contribution is not the aggregator in isolation but</w:t>
-      </w:r>
-      <w:r>
-        <w:t xml:space="preserve"> </w:t>
-      </w:r>
-      <w:r>
-        <w:t xml:space="preserve">its</w:t>
+        <w:t xml:space="preserve">]. CoEval shares this goal,</w:t>
+      </w:r>
+      <w:r>
+        <w:t xml:space="preserve"> </w:t>
+      </w:r>
+      <w:r>
+        <w:t xml:space="preserve">but its contribution is the</w:t>
       </w:r>
       <w:r>
         <w:t xml:space="preserve"> </w:t>
@@ -2249,22 +2132,19 @@
         <w:t xml:space="preserve">integration</w:t>
       </w:r>
       <w:r>
-        <w:t xml:space="preserve"> </w:t>
-      </w:r>
-      <w:r>
-        <w:t xml:space="preserve">with the rest of the loop: these methods assume a fixed, externally supplied item set, scored</w:t>
-      </w:r>
-      <w:r>
-        <w:t xml:space="preserve"> </w:t>
-      </w:r>
-      <w:r>
-        <w:t xml:space="preserve">as pairwise comparisons by a single-vendor judge pool, whereas CoEval supplies the items themselves (generated de novo</w:t>
-      </w:r>
-      <w:r>
-        <w:t xml:space="preserve"> </w:t>
-      </w:r>
-      <w:r>
-        <w:t xml:space="preserve">and contamination-free) and scores them as rubric-anchored absolute scores from a</w:t>
+        <w:t xml:space="preserve">: these methods score a fixed, externally-supplied item set as pairwise</w:t>
+      </w:r>
+      <w:r>
+        <w:t xml:space="preserve"> </w:t>
+      </w:r>
+      <w:r>
+        <w:t xml:space="preserve">comparisons from a single-vendor pool, whereas CoEval supplies the items (generated de novo, contamination-free) and</w:t>
+      </w:r>
+      <w:r>
+        <w:t xml:space="preserve"> </w:t>
+      </w:r>
+      <w:r>
+        <w:t xml:space="preserve">scores them as rubric-anchored absolute scores from a</w:t>
       </w:r>
       <w:r>
         <w:t xml:space="preserve"> </w:t>
@@ -2280,19 +2160,7 @@
         <w:t xml:space="preserve"> </w:t>
       </w:r>
       <w:r>
-        <w:t xml:space="preserve">panel, so</w:t>
-      </w:r>
-      <w:r>
-        <w:t xml:space="preserve"> </w:t>
-      </w:r>
-      <w:r>
-        <w:t xml:space="preserve">the item supply and the judge pool are both bias-hardened rather than only the aggregation step. Owning the whole loop</w:t>
-      </w:r>
-      <w:r>
-        <w:t xml:space="preserve"> </w:t>
-      </w:r>
-      <w:r>
-        <w:t xml:space="preserve">is what surfaces the</w:t>
+        <w:t xml:space="preserve">panel. Owning the whole loop surfaces the</w:t>
       </w:r>
       <w:r>
         <w:t xml:space="preserve"> </w:t>
@@ -2308,13 +2176,13 @@
         <w:t xml:space="preserve"> </w:t>
       </w:r>
       <w:r>
-        <w:t xml:space="preserve">of Section 5.2: a single judge can be anti-correlated with</w:t>
-      </w:r>
-      <w:r>
-        <w:t xml:space="preserve"> </w:t>
-      </w:r>
-      <w:r>
-        <w:t xml:space="preserve">ground truth where the cross-family ensemble is the low-regret choice.</w:t>
+        <w:t xml:space="preserve">of Section 5.2: a single judge can be anti-correlated with ground truth where the</w:t>
+      </w:r>
+      <w:r>
+        <w:t xml:space="preserve"> </w:t>
+      </w:r>
+      <w:r>
+        <w:t xml:space="preserve">cross-family ensemble is the low-regret choice.</w:t>
       </w:r>
     </w:p>
     <w:bookmarkEnd w:id="12"/>

</xml_diff>

<commit_message>
paper: fix renumber rot — stale bare-numeric section refs in Table 1 + 5 roadmap
The earlier section renumbers (5.5->5.3, 5.6->5.4; 5.3/5.4/5.7 -> appendices) updated
'Section&nbsp;5.X' refs but MISSED bare-numeric refs that the audit's regex did not cover:
Table 1's caption/rows ('5.5 contamination', '5.4, 5.6 verticals', '5.4, 5.7', '(5.2-5.3)')
and the 5 roadmap ('(5.3)','(5.4)'). Corrected: contamination row 5.5->5.3, verticals row
5.6->5.4, bias studies -> 'Section 5.2, Appendix E', domain -> Appendix D; roadmap verbosity/
self-preference now point to Appendix E. Verified: every remaining 5.x ref resolves correctly
(5.3=contamination, 5.4=verticals); 0 dangling section/cite; wins-only clean.

Co-Authored-By: Claude Opus 4.8 <noreply@anthropic.com>
</commit_message>
<xml_diff>
--- a/docs/paper/CoEval.docx
+++ b/docs/paper/CoEval.docx
@@ -4124,7 +4124,7 @@
           <w:b w:val="0"/>
           <w:i/>
         </w:rPr>
-        <w:t>Experimental configurations. Judge panels differ by experiment because the ground-truth anchor (5.1) uses a frontier cross-family panel while the bias and reliability studies (5.2–5.3) use a deliberately heterogeneous panel that includes weak open-weight judges; the verticals (5.4, 5.7) reuse one fixed cross-family panel. All students are gpt-4o-mini, gpt-3.5-turbo, and llama-3.2-3b unless noted.</w:t>
+        <w:t>Experimental configurations. Judge panels differ by experiment: the ground-truth anchor (Section 5.1) uses a frontier cross-family panel; the reliability and bias studies (Section 5.2, Appendix E) use a deliberately heterogeneous panel that includes weak open-weight judges; and the verticals (Section 5.4, Appendix D) reuse one fixed cross-family panel. All students are gpt-4o-mini, gpt-3.5-turbo, and llama-3.2-3b unless noted.</w:t>
       </w:r>
     </w:p>
     <w:tbl>
@@ -4133,7 +4133,7 @@
         <w:tblW w:type="pct" w:w="5000"/>
         <w:jc w:val="center"/>
         <w:tblLook w:firstRow="1" w:lastRow="0" w:firstColumn="0" w:lastColumn="0" w:noHBand="0" w:noVBand="0" w:val="0020"/>
-        <w:tblCaption w:val="Table 1. Experimental configurations. Judge panels differ by experiment because the ground-truth anchor (5.1) uses a frontier cross-family panel while the bias and reliability studies (5.2–5.3) use a deliberately heterogeneous panel that includes weak open-weight judges; the verticals (5.4, 5.7) reuse one fixed cross-family panel. All students are gpt-4o-mini, gpt-3.5-turbo, and llama-3.2-3b unless noted."/>
+        <w:tblCaption w:val="Table 1. Experimental configurations. Judge panels differ by experiment: the ground-truth anchor (Section 5.1) uses a frontier cross-family panel; the reliability and bias studies (Section 5.2, Appendix E) use a deliberately heterogeneous panel that includes weak open-weight judges; and the verticals (Section 5.4, Appendix D) reuse one fixed cross-family panel. All students are gpt-4o-mini, gpt-3.5-turbo, and llama-3.2-3b unless noted."/>
         <w:tblLayout w:type="autofit"/>
         <w:tblBorders>
           <w:top w:val="single" w:sz="10" w:color="4F6272"/>
@@ -4528,7 +4528,7 @@
                 <w:rFonts w:ascii="Georgia" w:hAnsi="Georgia"/>
                 <w:sz w:val="19"/>
               </w:rPr>
-              <w:t xml:space="preserve">5.2–5.3, App. B</w:t>
+              <w:t xml:space="preserve">5.2 + App. E, App. B</w:t>
             </w:r>
           </w:p>
         </w:tc>
@@ -4642,7 +4642,7 @@
                 <w:rFonts w:ascii="Georgia" w:hAnsi="Georgia"/>
                 <w:sz w:val="19"/>
               </w:rPr>
-              <w:t xml:space="preserve">5.4, 5.6 verticals</w:t>
+              <w:t xml:space="preserve">5.4 verticals</w:t>
             </w:r>
           </w:p>
         </w:tc>
@@ -4756,7 +4756,7 @@
                 <w:rFonts w:ascii="Georgia" w:hAnsi="Georgia"/>
                 <w:sz w:val="19"/>
               </w:rPr>
-              <w:t xml:space="preserve">5.5 contamination</w:t>
+              <w:t xml:space="preserve">5.3 contamination</w:t>
             </w:r>
           </w:p>
         </w:tc>
@@ -4962,13 +4962,13 @@
         <w:t xml:space="preserve"> </w:t>
       </w:r>
       <w:r>
-        <w:t xml:space="preserve">governs reliability (5.2), which cancels the verbosity bias every single judge carries (5.3) and structurally avoids</w:t>
-      </w:r>
-      <w:r>
-        <w:t xml:space="preserve"> </w:t>
-      </w:r>
-      <w:r>
-        <w:t xml:space="preserve">self-preference (5.4); the auto-generated rubrics are themselves task-specialized with a shared quality core</w:t>
+        <w:t xml:space="preserve">governs reliability (Section 5.2) and, as Appendix E shows, cancels the verbosity bias every single judge</w:t>
+      </w:r>
+      <w:r>
+        <w:t xml:space="preserve"> </w:t>
+      </w:r>
+      <w:r>
+        <w:t xml:space="preserve">carries and structurally avoids self-preference; the auto-generated rubrics are themselves task-specialized with a shared quality core</w:t>
       </w:r>
       <w:r>
         <w:t xml:space="preserve"> </w:t>

</xml_diff>

<commit_message>
paper: move Table 1 + Figure 1 to Appendix F (page budget 12->11)
Moved the experimental-config Table 1 (-> Table F1) and the architecture Figure 1 to a new
Appendix F (System overview and experimental configuration); both had no text refs (caption
only), so the body keeps a one-line pointer to each. Figure renumber (correctness 2->1,
ICC 3->2, rubric 4->3, architecture 1->4) and table renumber (2->1, 3->2, 4->3, 5->4) via
placeholder cycles. ALSO fixed a doubly-stale compound ref ('Tables 3 and 6' -> 'Tables 2 and
4') that two prior renumbers had missed.

Exhaustively verified (single + COMPOUND + lettered-appendix forms): body figures 1-4, tables
1-4, appendices A-F all resolve; lettered tables C1/D1/E1/F1; the only compound ref correctly
reads 'Tables 2 and 4'; zero dangling figure/table/section/cite refs; wins-only clean; 0
em-dash, $ balanced. Content pages 12->11. Both docx rebuilt (TACL anonymized, render-verified).

Co-Authored-By: Claude Opus 4.8 <noreply@anthropic.com>
</commit_message>
<xml_diff>
--- a/docs/paper/CoEval.docx
+++ b/docs/paper/CoEval.docx
@@ -1189,7 +1189,7 @@
         <w:t xml:space="preserve"> </w:t>
       </w:r>
       <w:r>
-        <w:t xml:space="preserve">(Section 5.1, Table 3; the doubly-robust aggregator recovers the true ranking of thirteen models at</w:t>
+        <w:t xml:space="preserve">(Section 5.1, Table 2; the doubly-robust aggregator recovers the true ranking of thirteen models at</w:t>
       </w:r>
       <w:r>
         <w:t xml:space="preserve"> </w:t>
@@ -2490,7 +2490,7 @@
     </w:p>
     <w:bookmarkEnd w:id="13"/>
     <w:bookmarkEnd w:id="14"/>
-    <w:bookmarkStart w:id="22" w:name="the-coeval-framework"/>
+    <w:bookmarkStart w:id="19" w:name="the-coeval-framework"/>
     <w:p>
       <w:pPr>
         <w:pStyle w:val="Heading2"/>
@@ -2523,92 +2523,10 @@
         <w:t xml:space="preserve"> </w:t>
       </w:r>
       <w:r>
-        <w:t xml:space="preserve">layer.</w:t>
+        <w:t xml:space="preserve">layer; Appendix F shows the pipeline.</w:t>
       </w:r>
     </w:p>
-    <w:p>
-      <w:pPr>
-        <w:pStyle w:val="BodyText"/>
-        <w:jc w:val="center"/>
-        <w:keepNext/>
-        <w:keepLines/>
-        <w:widowControl w:val="1"/>
-      </w:pPr>
-      <w:r>
-        <w:drawing>
-          <wp:inline>
-            <wp:extent cx="5943600" cy="1920171"/>
-            <wp:effectExtent b="0" l="0" r="0" t="0"/>
-            <wp:docPr descr="CoEval five-phase pipeline with teacher, student, and judge role bands" title="" id="16" name="Picture"/>
-            <a:graphic>
-              <a:graphicData uri="http://schemas.openxmlformats.org/drawingml/2006/picture">
-                <pic:pic>
-                  <pic:nvPicPr>
-                    <pic:cNvPr descr="figures/f1_architecture.png" id="17" name="Picture"/>
-                    <pic:cNvPicPr>
-                      <a:picLocks noChangeArrowheads="1" noChangeAspect="1"/>
-                    </pic:cNvPicPr>
-                  </pic:nvPicPr>
-                  <pic:blipFill>
-                    <a:blip r:embed="rId15"/>
-                    <a:stretch>
-                      <a:fillRect/>
-                    </a:stretch>
-                  </pic:blipFill>
-                  <pic:spPr bwMode="auto">
-                    <a:xfrm>
-                      <a:off x="0" y="0"/>
-                      <a:ext cx="5943600" cy="1920171"/>
-                    </a:xfrm>
-                    <a:prstGeom prst="rect">
-                      <a:avLst/>
-                    </a:prstGeom>
-                    <a:noFill/>
-                    <a:ln w="9525">
-                      <a:noFill/>
-                      <a:headEnd/>
-                      <a:tailEnd/>
-                    </a:ln>
-                  </pic:spPr>
-                </pic:pic>
-              </a:graphicData>
-            </a:graphic>
-          </wp:inline>
-        </w:drawing>
-      </w:r>
-    </w:p>
-    <w:p>
-      <w:pPr>
-        <w:pStyle w:val="ImageCaption"/>
-        <w:spacing w:before="80" w:after="120" w:line="240" w:lineRule="auto"/>
-        <w:jc w:val="center"/>
-        <w:keepNext w:val="0"/>
-        <w:keepLines/>
-        <w:widowControl w:val="1"/>
-      </w:pPr>
-      <w:r>
-        <w:rPr>
-          <w:b/>
-          <w:i/>
-        </w:rPr>
-        <w:t>Figure 1.</w:t>
-      </w:r>
-      <w:r>
-        <w:rPr>
-          <w:b w:val="0"/>
-          <w:i/>
-        </w:rPr>
-        <w:t xml:space="preserve"> </w:t>
-      </w:r>
-      <w:r>
-        <w:rPr>
-          <w:b w:val="0"/>
-          <w:i/>
-        </w:rPr>
-        <w:t>The CoEval pipeline. A single pool of models rotates through three roles: teachers map attributes, construct rubrics, and generate fresh benchmark items (Phases 1–3); students produce candidate responses (Phase 4); and a cross-family judge ensemble scores them (Phase 5). The entire run is specified in one declarative configuration.</w:t>
-      </w:r>
-    </w:p>
-    <w:bookmarkStart w:id="18" w:name="teacher-student-and-judge-roles"/>
+    <w:bookmarkStart w:id="15" w:name="teacher-student-and-judge-roles"/>
     <w:p>
       <w:pPr>
         <w:pStyle w:val="Heading3"/>
@@ -2741,8 +2659,8 @@
         <w:t xml:space="preserve">inject items from an existing dataset, allowing CoEval scores to be grounded against native metrics (Section 5.1).</w:t>
       </w:r>
     </w:p>
-    <w:bookmarkEnd w:id="18"/>
-    <w:bookmarkStart w:id="19" w:name="attribute-stratified-generation"/>
+    <w:bookmarkEnd w:id="15"/>
+    <w:bookmarkStart w:id="16" w:name="attribute-stratified-generation"/>
     <w:p>
       <w:pPr>
         <w:pStyle w:val="Heading3"/>
@@ -2995,8 +2913,8 @@
         <w:t xml:space="preserve">pretraining. Contamination-resistance is a structural property of generation, not a post-hoc filter.</w:t>
       </w:r>
     </w:p>
-    <w:bookmarkEnd w:id="19"/>
-    <w:bookmarkStart w:id="20" w:name="X0942ce5d8c067f73a4447ce531e20e150caab8b"/>
+    <w:bookmarkEnd w:id="16"/>
+    <w:bookmarkStart w:id="17" w:name="X0942ce5d8c067f73a4447ce531e20e150caab8b"/>
     <w:p>
       <w:pPr>
         <w:pStyle w:val="Heading3"/>
@@ -3759,8 +3677,8 @@
         <w:t xml:space="preserve">, normalized. We evaluate these aggregators in Section 5.2.</w:t>
       </w:r>
     </w:p>
-    <w:bookmarkEnd w:id="20"/>
-    <w:bookmarkStart w:id="21" w:name="reliability-and-bias-metrics"/>
+    <w:bookmarkEnd w:id="17"/>
+    <w:bookmarkStart w:id="18" w:name="reliability-and-bias-metrics"/>
     <w:p>
       <w:pPr>
         <w:pStyle w:val="Heading3"/>
@@ -3896,9 +3814,9 @@
         <w:t xml:space="preserve">.</w:t>
       </w:r>
     </w:p>
-    <w:bookmarkEnd w:id="21"/>
-    <w:bookmarkEnd w:id="22"/>
-    <w:bookmarkStart w:id="23" w:name="experimental-setup"/>
+    <w:bookmarkEnd w:id="18"/>
+    <w:bookmarkEnd w:id="19"/>
+    <w:bookmarkStart w:id="20" w:name="experimental-setup"/>
     <w:p>
       <w:pPr>
         <w:pStyle w:val="Heading2"/>
@@ -4077,7 +3995,7 @@
         <w:t xml:space="preserve"> </w:t>
       </w:r>
       <w:r>
-        <w:t xml:space="preserve">from that specification. The full study produced</w:t>
+        <w:t xml:space="preserve">from that specification (per-experiment judge panels are in Appendix F, Table F1). The full study produced</w:t>
       </w:r>
       <w:r>
         <w:t xml:space="preserve"> </w:t>
@@ -4096,758 +4014,8 @@
         <w:t xml:space="preserve">across the four tasks.</w:t>
       </w:r>
     </w:p>
-    <w:p>
-      <w:pPr>
-        <w:pStyle w:val="TableCaption"/>
-        <w:spacing w:before="280" w:after="60" w:line="240" w:lineRule="auto"/>
-        <w:jc w:val="center"/>
-        <w:keepNext/>
-        <w:keepLines/>
-        <w:widowControl w:val="1"/>
-      </w:pPr>
-      <w:r>
-        <w:rPr>
-          <w:b/>
-          <w:i/>
-        </w:rPr>
-        <w:t>Table 1.</w:t>
-      </w:r>
-      <w:r>
-        <w:rPr>
-          <w:b w:val="0"/>
-          <w:i/>
-        </w:rPr>
-        <w:t xml:space="preserve"> </w:t>
-      </w:r>
-      <w:r>
-        <w:rPr>
-          <w:b w:val="0"/>
-          <w:i/>
-        </w:rPr>
-        <w:t>Experimental configurations. Judge panels differ by experiment: the ground-truth anchor (Section 5.1) uses a frontier cross-family panel; the reliability and bias studies (Section 5.2, Appendix E) use a deliberately heterogeneous panel that includes weak open-weight judges; and the verticals (Section 5.4, Appendix D) reuse one fixed cross-family panel. All students are gpt-4o-mini, gpt-3.5-turbo, and llama-3.2-3b unless noted.</w:t>
-      </w:r>
-    </w:p>
-    <w:tbl>
-      <w:tblPr>
-        <w:tblStyle w:val="Table"/>
-        <w:tblW w:type="pct" w:w="5000"/>
-        <w:jc w:val="center"/>
-        <w:tblLook w:firstRow="1" w:lastRow="0" w:firstColumn="0" w:lastColumn="0" w:noHBand="0" w:noVBand="0" w:val="0020"/>
-        <w:tblCaption w:val="Table 1. Experimental configurations. Judge panels differ by experiment: the ground-truth anchor (Section 5.1) uses a frontier cross-family panel; the reliability and bias studies (Section 5.2, Appendix E) use a deliberately heterogeneous panel that includes weak open-weight judges; and the verticals (Section 5.4, Appendix D) reuse one fixed cross-family panel. All students are gpt-4o-mini, gpt-3.5-turbo, and llama-3.2-3b unless noted."/>
-        <w:tblLayout w:type="autofit"/>
-        <w:tblBorders>
-          <w:top w:val="single" w:sz="10" w:color="4F6272"/>
-          <w:bottom w:val="single" w:sz="10" w:color="4F6272"/>
-          <w:insideH w:val="single" w:sz="5" w:color="9FB0C2"/>
-          <w:left w:val="single" w:sz="6" w:color="9FB0C2"/>
-          <w:right w:val="single" w:sz="6" w:color="9FB0C2"/>
-          <w:insideV w:val="single" w:sz="5" w:color="D9E1E8"/>
-        </w:tblBorders>
-      </w:tblPr>
-      <w:tblGrid>
-        <w:gridCol w:w="1980"/>
-        <w:gridCol w:w="1980"/>
-        <w:gridCol w:w="1980"/>
-        <w:gridCol w:w="1980"/>
-      </w:tblGrid>
-      <w:tr>
-        <w:trPr>
-          <w:tblHeader w:val="on"/>
-        </w:trPr>
-        <w:tc>
-          <w:tcPr>
-            <w:shd w:fill="EEF3F7"/>
-            <w:tcBorders>
-              <w:left w:val="nil"/>
-              <w:right w:val="nil"/>
-              <w:top w:val="nil"/>
-              <w:bottom w:val="single" w:sz="8" w:color="9FB0C2"/>
-            </w:tcBorders>
-            <w:vAlign w:val="center"/>
-          </w:tcPr>
-          <w:p>
-            <w:pPr>
-              <w:pStyle w:val="Compact"/>
-              <w:spacing w:before="0" w:after="20" w:line="240" w:lineRule="auto"/>
-              <w:jc w:val="center"/>
-              <w:keepNext w:val="0"/>
-              <w:keepLines/>
-              <w:widowControl w:val="1"/>
-            </w:pPr>
-            <w:r>
-              <w:rPr>
-                <w:rFonts w:ascii="Georgia" w:hAnsi="Georgia"/>
-                <w:b/>
-                <w:sz w:val="19"/>
-              </w:rPr>
-              <w:t xml:space="preserve">Experiment</w:t>
-            </w:r>
-          </w:p>
-        </w:tc>
-        <w:tc>
-          <w:tcPr>
-            <w:shd w:fill="EEF3F7"/>
-            <w:tcBorders>
-              <w:left w:val="nil"/>
-              <w:right w:val="nil"/>
-              <w:top w:val="nil"/>
-              <w:bottom w:val="single" w:sz="8" w:color="9FB0C2"/>
-            </w:tcBorders>
-            <w:vAlign w:val="center"/>
-          </w:tcPr>
-          <w:p>
-            <w:pPr>
-              <w:pStyle w:val="Compact"/>
-              <w:spacing w:before="0" w:after="20" w:line="240" w:lineRule="auto"/>
-              <w:jc w:val="center"/>
-              <w:keepNext w:val="0"/>
-              <w:keepLines/>
-              <w:widowControl w:val="1"/>
-            </w:pPr>
-            <w:r>
-              <w:rPr>
-                <w:rFonts w:ascii="Georgia" w:hAnsi="Georgia"/>
-                <w:b/>
-                <w:sz w:val="19"/>
-              </w:rPr>
-              <w:t xml:space="preserve">Task(s)</w:t>
-            </w:r>
-          </w:p>
-        </w:tc>
-        <w:tc>
-          <w:tcPr>
-            <w:shd w:fill="EEF3F7"/>
-            <w:tcBorders>
-              <w:left w:val="nil"/>
-              <w:right w:val="nil"/>
-              <w:top w:val="nil"/>
-              <w:bottom w:val="single" w:sz="8" w:color="9FB0C2"/>
-            </w:tcBorders>
-            <w:vAlign w:val="center"/>
-          </w:tcPr>
-          <w:p>
-            <w:pPr>
-              <w:pStyle w:val="Compact"/>
-              <w:spacing w:before="0" w:after="20" w:line="240" w:lineRule="auto"/>
-              <w:jc w:val="center"/>
-              <w:keepNext w:val="0"/>
-              <w:keepLines/>
-              <w:widowControl w:val="1"/>
-            </w:pPr>
-            <w:r>
-              <w:rPr>
-                <w:rFonts w:ascii="Georgia" w:hAnsi="Georgia"/>
-                <w:b/>
-                <w:sz w:val="19"/>
-              </w:rPr>
-              <w:t xml:space="preserve">Judge panel</w:t>
-            </w:r>
-          </w:p>
-        </w:tc>
-        <w:tc>
-          <w:tcPr>
-            <w:shd w:fill="EEF3F7"/>
-            <w:tcBorders>
-              <w:left w:val="nil"/>
-              <w:right w:val="nil"/>
-              <w:top w:val="nil"/>
-              <w:bottom w:val="single" w:sz="8" w:color="9FB0C2"/>
-            </w:tcBorders>
-            <w:vAlign w:val="center"/>
-          </w:tcPr>
-          <w:p>
-            <w:pPr>
-              <w:pStyle w:val="Compact"/>
-              <w:spacing w:before="0" w:after="20" w:line="240" w:lineRule="auto"/>
-              <w:jc w:val="center"/>
-              <w:keepNext w:val="0"/>
-              <w:keepLines/>
-              <w:widowControl w:val="1"/>
-            </w:pPr>
-            <w:r>
-              <w:rPr>
-                <w:rFonts w:ascii="Georgia" w:hAnsi="Georgia"/>
-                <w:b/>
-                <w:sz w:val="19"/>
-              </w:rPr>
-              <w:t xml:space="preserve">Size</w:t>
-            </w:r>
-          </w:p>
-        </w:tc>
-      </w:tr>
-      <w:tr>
-        <w:tc>
-          <w:tcPr>
-            <w:tcBorders>
-              <w:left w:val="nil"/>
-              <w:right w:val="nil"/>
-              <w:top w:val="nil"/>
-              <w:bottom w:val="single" w:sz="4" w:color="D9E1E8"/>
-            </w:tcBorders>
-            <w:vAlign w:val="center"/>
-          </w:tcPr>
-          <w:p>
-            <w:pPr>
-              <w:pStyle w:val="Compact"/>
-              <w:spacing w:before="0" w:after="20" w:line="240" w:lineRule="auto"/>
-              <w:jc w:val="center"/>
-              <w:keepNext w:val="0"/>
-              <w:keepLines/>
-              <w:widowControl w:val="1"/>
-            </w:pPr>
-            <w:r>
-              <w:rPr>
-                <w:rFonts w:ascii="Georgia" w:hAnsi="Georgia"/>
-                <w:sz w:val="19"/>
-              </w:rPr>
-              <w:t xml:space="preserve">5.1 ground truth</w:t>
-            </w:r>
-          </w:p>
-        </w:tc>
-        <w:tc>
-          <w:tcPr>
-            <w:tcBorders>
-              <w:left w:val="nil"/>
-              <w:right w:val="nil"/>
-              <w:top w:val="nil"/>
-              <w:bottom w:val="single" w:sz="4" w:color="D9E1E8"/>
-            </w:tcBorders>
-            <w:vAlign w:val="center"/>
-          </w:tcPr>
-          <w:p>
-            <w:pPr>
-              <w:pStyle w:val="Compact"/>
-              <w:spacing w:before="0" w:after="20" w:line="240" w:lineRule="auto"/>
-              <w:jc w:val="center"/>
-              <w:keepNext w:val="0"/>
-              <w:keepLines/>
-              <w:widowControl w:val="1"/>
-            </w:pPr>
-            <w:r>
-              <w:rPr>
-                <w:rFonts w:ascii="Georgia" w:hAnsi="Georgia"/>
-                <w:sz w:val="19"/>
-              </w:rPr>
-              <w:t xml:space="preserve">SciQ, ARC (exact-match QA)</w:t>
-            </w:r>
-          </w:p>
-        </w:tc>
-        <w:tc>
-          <w:tcPr>
-            <w:tcBorders>
-              <w:left w:val="nil"/>
-              <w:right w:val="nil"/>
-              <w:top w:val="nil"/>
-              <w:bottom w:val="single" w:sz="4" w:color="D9E1E8"/>
-            </w:tcBorders>
-            <w:vAlign w:val="center"/>
-          </w:tcPr>
-          <w:p>
-            <w:pPr>
-              <w:pStyle w:val="Compact"/>
-              <w:spacing w:before="0" w:after="20" w:line="240" w:lineRule="auto"/>
-              <w:jc w:val="center"/>
-              <w:keepNext w:val="0"/>
-              <w:keepLines/>
-              <w:widowControl w:val="1"/>
-            </w:pPr>
-            <w:r>
-              <w:rPr>
-                <w:rFonts w:ascii="Georgia" w:hAnsi="Georgia"/>
-                <w:sz w:val="19"/>
-              </w:rPr>
-              <w:t xml:space="preserve">gpt-4o, claude-sonnet-4, gemini-2.5-flash</w:t>
-            </w:r>
-          </w:p>
-        </w:tc>
-        <w:tc>
-          <w:tcPr>
-            <w:tcBorders>
-              <w:left w:val="nil"/>
-              <w:right w:val="nil"/>
-              <w:top w:val="nil"/>
-              <w:bottom w:val="single" w:sz="4" w:color="D9E1E8"/>
-            </w:tcBorders>
-            <w:vAlign w:val="center"/>
-          </w:tcPr>
-          <w:p>
-            <w:pPr>
-              <w:pStyle w:val="Compact"/>
-              <w:spacing w:before="0" w:after="20" w:line="240" w:lineRule="auto"/>
-              <w:jc w:val="center"/>
-              <w:keepNext w:val="0"/>
-              <w:keepLines/>
-              <w:widowControl w:val="1"/>
-            </w:pPr>
-            <w:r>
-              <w:rPr>
-                <w:rFonts w:ascii="Georgia" w:hAnsi="Georgia"/>
-                <w:sz w:val="19"/>
-              </w:rPr>
-              <w:t xml:space="preserve">191 items / 573 resp.</w:t>
-            </w:r>
-          </w:p>
-        </w:tc>
-      </w:tr>
-      <w:tr>
-        <w:tc>
-          <w:tcPr>
-            <w:tcBorders>
-              <w:left w:val="nil"/>
-              <w:right w:val="nil"/>
-              <w:top w:val="nil"/>
-              <w:bottom w:val="single" w:sz="4" w:color="D9E1E8"/>
-            </w:tcBorders>
-            <w:vAlign w:val="center"/>
-          </w:tcPr>
-          <w:p>
-            <w:pPr>
-              <w:pStyle w:val="Compact"/>
-              <w:spacing w:before="0" w:after="20" w:line="240" w:lineRule="auto"/>
-              <w:jc w:val="center"/>
-              <w:keepNext w:val="0"/>
-              <w:keepLines/>
-              <w:widowControl w:val="1"/>
-            </w:pPr>
-            <w:r>
-              <w:rPr>
-                <w:rFonts w:ascii="Georgia" w:hAnsi="Georgia"/>
-                <w:sz w:val="19"/>
-              </w:rPr>
-              <w:t xml:space="preserve">5.2 reliability (5.1 summ. anchor)</w:t>
-            </w:r>
-          </w:p>
-        </w:tc>
-        <w:tc>
-          <w:tcPr>
-            <w:tcBorders>
-              <w:left w:val="nil"/>
-              <w:right w:val="nil"/>
-              <w:top w:val="nil"/>
-              <w:bottom w:val="single" w:sz="4" w:color="D9E1E8"/>
-            </w:tcBorders>
-            <w:vAlign w:val="center"/>
-          </w:tcPr>
-          <w:p>
-            <w:pPr>
-              <w:pStyle w:val="Compact"/>
-              <w:spacing w:before="0" w:after="20" w:line="240" w:lineRule="auto"/>
-              <w:jc w:val="center"/>
-              <w:keepNext w:val="0"/>
-              <w:keepLines/>
-              <w:widowControl w:val="1"/>
-            </w:pPr>
-            <w:r>
-              <w:rPr>
-                <w:rFonts w:ascii="Georgia" w:hAnsi="Georgia"/>
-                <w:sz w:val="19"/>
-              </w:rPr>
-              <w:t xml:space="preserve">code (BLEU), news + text summ. (BERTScore)</w:t>
-            </w:r>
-          </w:p>
-        </w:tc>
-        <w:tc>
-          <w:tcPr>
-            <w:tcBorders>
-              <w:left w:val="nil"/>
-              <w:right w:val="nil"/>
-              <w:top w:val="nil"/>
-              <w:bottom w:val="single" w:sz="4" w:color="D9E1E8"/>
-            </w:tcBorders>
-            <w:vAlign w:val="center"/>
-          </w:tcPr>
-          <w:p>
-            <w:pPr>
-              <w:pStyle w:val="Compact"/>
-              <w:spacing w:before="0" w:after="20" w:line="240" w:lineRule="auto"/>
-              <w:jc w:val="center"/>
-              <w:keepNext w:val="0"/>
-              <w:keepLines/>
-              <w:widowControl w:val="1"/>
-            </w:pPr>
-            <w:r>
-              <w:rPr>
-                <w:rFonts w:ascii="Georgia" w:hAnsi="Georgia"/>
-                <w:sz w:val="19"/>
-              </w:rPr>
-              <w:t xml:space="preserve">gpt-4o-mini, gpt-3.5-turbo, claude-haiku, gemini-flash</w:t>
-            </w:r>
-          </w:p>
-        </w:tc>
-        <w:tc>
-          <w:tcPr>
-            <w:tcBorders>
-              <w:left w:val="nil"/>
-              <w:right w:val="nil"/>
-              <w:top w:val="nil"/>
-              <w:bottom w:val="single" w:sz="4" w:color="D9E1E8"/>
-            </w:tcBorders>
-            <w:vAlign w:val="center"/>
-          </w:tcPr>
-          <w:p>
-            <w:pPr>
-              <w:pStyle w:val="Compact"/>
-              <w:spacing w:before="0" w:after="20" w:line="240" w:lineRule="auto"/>
-              <w:jc w:val="center"/>
-              <w:keepNext w:val="0"/>
-              <w:keepLines/>
-              <w:widowControl w:val="1"/>
-            </w:pPr>
-            <w:r>
-              <w:rPr>
-                <w:rFonts w:ascii="Georgia" w:hAnsi="Georgia"/>
-                <w:sz w:val="19"/>
-              </w:rPr>
-              <w:t xml:space="preserve">3 tasks / 900 resp.</w:t>
-            </w:r>
-          </w:p>
-        </w:tc>
-      </w:tr>
-      <w:tr>
-        <w:tc>
-          <w:tcPr>
-            <w:tcBorders>
-              <w:left w:val="nil"/>
-              <w:right w:val="nil"/>
-              <w:top w:val="nil"/>
-              <w:bottom w:val="single" w:sz="4" w:color="D9E1E8"/>
-            </w:tcBorders>
-            <w:vAlign w:val="center"/>
-          </w:tcPr>
-          <w:p>
-            <w:pPr>
-              <w:pStyle w:val="Compact"/>
-              <w:spacing w:before="0" w:after="20" w:line="240" w:lineRule="auto"/>
-              <w:jc w:val="center"/>
-              <w:keepNext w:val="0"/>
-              <w:keepLines/>
-              <w:widowControl w:val="1"/>
-            </w:pPr>
-            <w:r>
-              <w:rPr>
-                <w:rFonts w:ascii="Georgia" w:hAnsi="Georgia"/>
-                <w:sz w:val="19"/>
-              </w:rPr>
-              <w:t xml:space="preserve">5.2 + App. E, App. B</w:t>
-            </w:r>
-          </w:p>
-        </w:tc>
-        <w:tc>
-          <w:tcPr>
-            <w:tcBorders>
-              <w:left w:val="nil"/>
-              <w:right w:val="nil"/>
-              <w:top w:val="nil"/>
-              <w:bottom w:val="single" w:sz="4" w:color="D9E1E8"/>
-            </w:tcBorders>
-            <w:vAlign w:val="center"/>
-          </w:tcPr>
-          <w:p>
-            <w:pPr>
-              <w:pStyle w:val="Compact"/>
-              <w:spacing w:before="0" w:after="20" w:line="240" w:lineRule="auto"/>
-              <w:jc w:val="center"/>
-              <w:keepNext w:val="0"/>
-              <w:keepLines/>
-              <w:widowControl w:val="1"/>
-            </w:pPr>
-            <w:r>
-              <w:rPr>
-                <w:rFonts w:ascii="Georgia" w:hAnsi="Georgia"/>
-                <w:sz w:val="19"/>
-              </w:rPr>
-              <w:t xml:space="preserve">4-task medium study</w:t>
-            </w:r>
-          </w:p>
-        </w:tc>
-        <w:tc>
-          <w:tcPr>
-            <w:tcBorders>
-              <w:left w:val="nil"/>
-              <w:right w:val="nil"/>
-              <w:top w:val="nil"/>
-              <w:bottom w:val="single" w:sz="4" w:color="D9E1E8"/>
-            </w:tcBorders>
-            <w:vAlign w:val="center"/>
-          </w:tcPr>
-          <w:p>
-            <w:pPr>
-              <w:pStyle w:val="Compact"/>
-              <w:spacing w:before="0" w:after="20" w:line="240" w:lineRule="auto"/>
-              <w:jc w:val="center"/>
-              <w:keepNext w:val="0"/>
-              <w:keepLines/>
-              <w:widowControl w:val="1"/>
-            </w:pPr>
-            <w:r>
-              <w:rPr>
-                <w:rFonts w:ascii="Georgia" w:hAnsi="Georgia"/>
-                <w:sz w:val="19"/>
-              </w:rPr>
-              <w:t xml:space="preserve">gpt-4o-mini, gpt-3.5-turbo, qwen2.5-1.5b, smollm2-1.7b</w:t>
-            </w:r>
-          </w:p>
-        </w:tc>
-        <w:tc>
-          <w:tcPr>
-            <w:tcBorders>
-              <w:left w:val="nil"/>
-              <w:right w:val="nil"/>
-              <w:top w:val="nil"/>
-              <w:bottom w:val="single" w:sz="4" w:color="D9E1E8"/>
-            </w:tcBorders>
-            <w:vAlign w:val="center"/>
-          </w:tcPr>
-          <w:p>
-            <w:pPr>
-              <w:pStyle w:val="Compact"/>
-              <w:spacing w:before="0" w:after="20" w:line="240" w:lineRule="auto"/>
-              <w:jc w:val="center"/>
-              <w:keepNext w:val="0"/>
-              <w:keepLines/>
-              <w:widowControl w:val="1"/>
-            </w:pPr>
-            <w:r>
-              <w:rPr>
-                <w:rFonts w:ascii="Georgia" w:hAnsi="Georgia"/>
-                <w:sz w:val="19"/>
-              </w:rPr>
-              <w:t xml:space="preserve">7,978 eval.</w:t>
-            </w:r>
-          </w:p>
-        </w:tc>
-      </w:tr>
-      <w:tr>
-        <w:tc>
-          <w:tcPr>
-            <w:tcBorders>
-              <w:left w:val="nil"/>
-              <w:right w:val="nil"/>
-              <w:top w:val="nil"/>
-              <w:bottom w:val="single" w:sz="4" w:color="D9E1E8"/>
-            </w:tcBorders>
-            <w:vAlign w:val="center"/>
-          </w:tcPr>
-          <w:p>
-            <w:pPr>
-              <w:pStyle w:val="Compact"/>
-              <w:spacing w:before="0" w:after="20" w:line="240" w:lineRule="auto"/>
-              <w:jc w:val="center"/>
-              <w:keepNext w:val="0"/>
-              <w:keepLines/>
-              <w:widowControl w:val="1"/>
-            </w:pPr>
-            <w:r>
-              <w:rPr>
-                <w:rFonts w:ascii="Georgia" w:hAnsi="Georgia"/>
-                <w:sz w:val="19"/>
-              </w:rPr>
-              <w:t xml:space="preserve">5.4 verticals</w:t>
-            </w:r>
-          </w:p>
-        </w:tc>
-        <w:tc>
-          <w:tcPr>
-            <w:tcBorders>
-              <w:left w:val="nil"/>
-              <w:right w:val="nil"/>
-              <w:top w:val="nil"/>
-              <w:bottom w:val="single" w:sz="4" w:color="D9E1E8"/>
-            </w:tcBorders>
-            <w:vAlign w:val="center"/>
-          </w:tcPr>
-          <w:p>
-            <w:pPr>
-              <w:pStyle w:val="Compact"/>
-              <w:spacing w:before="0" w:after="20" w:line="240" w:lineRule="auto"/>
-              <w:jc w:val="center"/>
-              <w:keepNext w:val="0"/>
-              <w:keepLines/>
-              <w:widowControl w:val="1"/>
-            </w:pPr>
-            <w:r>
-              <w:rPr>
-                <w:rFonts w:ascii="Georgia" w:hAnsi="Georgia"/>
-                <w:sz w:val="19"/>
-              </w:rPr>
-              <w:t xml:space="preserve">drug-interaction, clinical, legal</w:t>
-            </w:r>
-          </w:p>
-        </w:tc>
-        <w:tc>
-          <w:tcPr>
-            <w:tcBorders>
-              <w:left w:val="nil"/>
-              <w:right w:val="nil"/>
-              <w:top w:val="nil"/>
-              <w:bottom w:val="single" w:sz="4" w:color="D9E1E8"/>
-            </w:tcBorders>
-            <w:vAlign w:val="center"/>
-          </w:tcPr>
-          <w:p>
-            <w:pPr>
-              <w:pStyle w:val="Compact"/>
-              <w:spacing w:before="0" w:after="20" w:line="240" w:lineRule="auto"/>
-              <w:jc w:val="center"/>
-              <w:keepNext w:val="0"/>
-              <w:keepLines/>
-              <w:widowControl w:val="1"/>
-            </w:pPr>
-            <w:r>
-              <w:rPr>
-                <w:rFonts w:ascii="Georgia" w:hAnsi="Georgia"/>
-                <w:sz w:val="19"/>
-              </w:rPr>
-              <w:t xml:space="preserve">claude-haiku, gemini-flash, gpt-4o-mini</w:t>
-            </w:r>
-          </w:p>
-        </w:tc>
-        <w:tc>
-          <w:tcPr>
-            <w:tcBorders>
-              <w:left w:val="nil"/>
-              <w:right w:val="nil"/>
-              <w:top w:val="nil"/>
-              <w:bottom w:val="single" w:sz="4" w:color="D9E1E8"/>
-            </w:tcBorders>
-            <w:vAlign w:val="center"/>
-          </w:tcPr>
-          <w:p>
-            <w:pPr>
-              <w:pStyle w:val="Compact"/>
-              <w:spacing w:before="0" w:after="20" w:line="240" w:lineRule="auto"/>
-              <w:jc w:val="center"/>
-              <w:keepNext w:val="0"/>
-              <w:keepLines/>
-              <w:widowControl w:val="1"/>
-            </w:pPr>
-            <w:r>
-              <w:rPr>
-                <w:rFonts w:ascii="Georgia" w:hAnsi="Georgia"/>
-                <w:sz w:val="19"/>
-              </w:rPr>
-              <w:t xml:space="preserve">40 items each</w:t>
-            </w:r>
-          </w:p>
-        </w:tc>
-      </w:tr>
-      <w:tr>
-        <w:tc>
-          <w:tcPr>
-            <w:tcBorders>
-              <w:left w:val="nil"/>
-              <w:right w:val="nil"/>
-              <w:top w:val="nil"/>
-              <w:bottom w:val="nil"/>
-            </w:tcBorders>
-            <w:vAlign w:val="center"/>
-          </w:tcPr>
-          <w:p>
-            <w:pPr>
-              <w:pStyle w:val="Compact"/>
-              <w:spacing w:before="0" w:after="20" w:line="240" w:lineRule="auto"/>
-              <w:jc w:val="center"/>
-              <w:keepNext w:val="0"/>
-              <w:keepLines/>
-              <w:widowControl w:val="1"/>
-            </w:pPr>
-            <w:r>
-              <w:rPr>
-                <w:rFonts w:ascii="Georgia" w:hAnsi="Georgia"/>
-                <w:sz w:val="19"/>
-              </w:rPr>
-              <w:t xml:space="preserve">5.3 contamination</w:t>
-            </w:r>
-          </w:p>
-        </w:tc>
-        <w:tc>
-          <w:tcPr>
-            <w:tcBorders>
-              <w:left w:val="nil"/>
-              <w:right w:val="nil"/>
-              <w:top w:val="nil"/>
-              <w:bottom w:val="nil"/>
-            </w:tcBorders>
-            <w:vAlign w:val="center"/>
-          </w:tcPr>
-          <w:p>
-            <w:pPr>
-              <w:pStyle w:val="Compact"/>
-              <w:spacing w:before="0" w:after="20" w:line="240" w:lineRule="auto"/>
-              <w:jc w:val="center"/>
-              <w:keepNext w:val="0"/>
-              <w:keepLines/>
-              <w:widowControl w:val="1"/>
-            </w:pPr>
-            <w:r>
-              <w:rPr>
-                <w:rFonts w:ascii="Georgia" w:hAnsi="Georgia"/>
-                <w:sz w:val="19"/>
-              </w:rPr>
-              <w:t xml:space="preserve">SciQ memorization</w:t>
-            </w:r>
-          </w:p>
-        </w:tc>
-        <w:tc>
-          <w:tcPr>
-            <w:tcBorders>
-              <w:left w:val="nil"/>
-              <w:right w:val="nil"/>
-              <w:top w:val="nil"/>
-              <w:bottom w:val="nil"/>
-            </w:tcBorders>
-            <w:vAlign w:val="center"/>
-          </w:tcPr>
-          <w:p>
-            <w:pPr>
-              <w:pStyle w:val="Compact"/>
-              <w:spacing w:before="0" w:after="20" w:line="240" w:lineRule="auto"/>
-              <w:jc w:val="center"/>
-              <w:keepNext w:val="0"/>
-              <w:keepLines/>
-              <w:widowControl w:val="1"/>
-            </w:pPr>
-            <w:r>
-              <w:rPr>
-                <w:rFonts w:ascii="Georgia" w:hAnsi="Georgia"/>
-                <w:sz w:val="19"/>
-              </w:rPr>
-              <w:t xml:space="preserve">exact-match (no LLM judge)</w:t>
-            </w:r>
-          </w:p>
-        </w:tc>
-        <w:tc>
-          <w:tcPr>
-            <w:tcBorders>
-              <w:left w:val="nil"/>
-              <w:right w:val="nil"/>
-              <w:top w:val="nil"/>
-              <w:bottom w:val="nil"/>
-            </w:tcBorders>
-            <w:vAlign w:val="center"/>
-          </w:tcPr>
-          <w:p>
-            <w:pPr>
-              <w:pStyle w:val="Compact"/>
-              <w:spacing w:before="0" w:after="20" w:line="240" w:lineRule="auto"/>
-              <w:jc w:val="center"/>
-              <w:keepNext w:val="0"/>
-              <w:keepLines/>
-              <w:widowControl w:val="1"/>
-            </w:pPr>
-            <w:r>
-              <w:rPr>
-                <w:rFonts w:ascii="Georgia" w:hAnsi="Georgia"/>
-                <w:sz w:val="19"/>
-              </w:rPr>
-              <w:t xml:space="preserve">200 memorized / 100 fresh</w:t>
-            </w:r>
-          </w:p>
-        </w:tc>
-      </w:tr>
-    </w:tbl>
-    <w:bookmarkEnd w:id="23"/>
-    <w:bookmarkStart w:id="34" w:name="results"/>
+    <w:bookmarkEnd w:id="20"/>
+    <w:bookmarkStart w:id="31" w:name="results"/>
     <w:p>
       <w:pPr>
         <w:pStyle w:val="Heading2"/>
@@ -4940,7 +4108,7 @@
         <w:t xml:space="preserve"> </w:t>
       </w:r>
       <w:r>
-        <w:t xml:space="preserve">ranking (Table 3), benchmarked against a single-judge G-Eval baseline. Section 5.2 and Appendix E explain</w:t>
+        <w:t xml:space="preserve">ranking (Table 2), benchmarked against a single-judge G-Eval baseline. Section 5.2 and Appendix E explain</w:t>
       </w:r>
       <w:r>
         <w:t xml:space="preserve"> </w:t>
@@ -5007,7 +4175,7 @@
         <w:t xml:space="preserve">. Section 5.4 exercises the complete tool on three custom verticals (drug interaction, clinical, legal) with no labeled data, and Appendix D shows that rankings are domain-specific: across four de-novo domains three different models take first place, so a generic leaderboard misdirects the practitioner that CoEval's per-domain ranking serves.</w:t>
       </w:r>
     </w:p>
-    <w:bookmarkStart w:id="27" w:name="X7df2e9e9a901f5ac4e837e696941ee5802047fd"/>
+    <w:bookmarkStart w:id="24" w:name="X7df2e9e9a901f5ac4e837e696941ee5802047fd"/>
     <w:p>
       <w:pPr>
         <w:pStyle w:val="Heading3"/>
@@ -5338,7 +4506,7 @@
           <w:b/>
           <w:i/>
         </w:rPr>
-        <w:t>Table 2.</w:t>
+        <w:t>Table 1.</w:t>
       </w:r>
       <w:r>
         <w:rPr>
@@ -5361,7 +4529,7 @@
         <w:tblW w:type="pct" w:w="5000"/>
         <w:jc w:val="center"/>
         <w:tblLook w:firstRow="1" w:lastRow="0" w:firstColumn="0" w:lastColumn="0" w:noHBand="0" w:noVBand="0" w:val="0020"/>
-        <w:tblCaption w:val="Table 2. Spearman correlation of CoEval accuracy scores with ground-truth correctness on exact-match QA (SciQ, ARC-Challenge; 191 datapoints, 573 responses; datapoint-clustered 95% bootstrap CI). The frontier cross-family ensemble tracks ground truth at ρ = 0.86. The three frontier judges agree on every item; crucially, the weaker auxiliary judges they are contrasted against (Section 5.2) disagree on 3–8 items, confirming this is genuine independent convergence of capable judges on objective correctness, not redundancy of identical models."/>
+        <w:tblCaption w:val="Table 1. Spearman correlation of CoEval accuracy scores with ground-truth correctness on exact-match QA (SciQ, ARC-Challenge; 191 datapoints, 573 responses; datapoint-clustered 95% bootstrap CI). The frontier cross-family ensemble tracks ground truth at ρ = 0.86. The three frontier judges agree on every item; crucially, the weaker auxiliary judges they are contrasted against (Section 5.2) disagree on 3–8 items, confirming this is genuine independent convergence of capable judges on objective correctness, not redundancy of identical models."/>
         <w:tblLayout w:type="autofit"/>
         <w:tblBorders>
           <w:top w:val="single" w:sz="10" w:color="4F6272"/>
@@ -6402,7 +5570,7 @@
         <w:t xml:space="preserve"> </w:t>
       </w:r>
       <w:r>
-        <w:t xml:space="preserve">scores yield the correct ranking. Figure 2 and Table 3 rank the three student models by their CoEval frontier-ensemble</w:t>
+        <w:t xml:space="preserve">scores yield the correct ranking. Figure 1 and Table 2 rank the three student models by their CoEval frontier-ensemble</w:t>
       </w:r>
       <w:r>
         <w:t xml:space="preserve"> </w:t>
@@ -6469,18 +5637,18 @@
           <wp:inline>
             <wp:extent cx="5224272" cy="2987040"/>
             <wp:effectExtent b="0" l="0" r="0" t="0"/>
-            <wp:docPr descr="CoEval ensemble score versus ground-truth accuracy per model; rankings identical" title="" id="25" name="Picture"/>
+            <wp:docPr descr="CoEval ensemble score versus ground-truth accuracy per model; rankings identical" title="" id="22" name="Picture"/>
             <a:graphic>
               <a:graphicData uri="http://schemas.openxmlformats.org/drawingml/2006/picture">
                 <pic:pic>
                   <pic:nvPicPr>
-                    <pic:cNvPr descr="figures/f4_correctness_corr.png" id="26" name="Picture"/>
+                    <pic:cNvPr descr="figures/f4_correctness_corr.png" id="23" name="Picture"/>
                     <pic:cNvPicPr>
                       <a:picLocks noChangeArrowheads="1" noChangeAspect="1"/>
                     </pic:cNvPicPr>
                   </pic:nvPicPr>
                   <pic:blipFill>
-                    <a:blip r:embed="rId24"/>
+                    <a:blip r:embed="rId21"/>
                     <a:stretch>
                       <a:fillRect/>
                     </a:stretch>
@@ -6521,7 +5689,7 @@
           <w:b/>
           <w:i/>
         </w:rPr>
-        <w:t>Figure 2.</w:t>
+        <w:t>Figure 1.</w:t>
       </w:r>
       <w:r>
         <w:rPr>
@@ -6535,7 +5703,7 @@
           <w:b w:val="0"/>
           <w:i/>
         </w:rPr>
-        <w:t>CoEval recovers the true model ranking with no labels. For each student model the CoEval frontier-ensemble accuracy score (green, datapoint-clustered 95% CI) and the held-out ground-truth accuracy (blue) coincide within 0.02, and the order gpt-4o-mini &gt; gpt-3.5-turbo &gt; llama-3.2-3b is reproduced exactly (cf. Table 3).</w:t>
+        <w:t>CoEval recovers the true model ranking with no labels. For each student model the CoEval frontier-ensemble accuracy score (green, datapoint-clustered 95% CI) and the held-out ground-truth accuracy (blue) coincide within 0.02, and the order gpt-4o-mini &gt; gpt-3.5-turbo &gt; llama-3.2-3b is reproduced exactly (cf. Table 2).</w:t>
       </w:r>
     </w:p>
     <w:p>
@@ -6552,7 +5720,7 @@
           <w:b/>
           <w:i/>
         </w:rPr>
-        <w:t>Table 3.</w:t>
+        <w:t>Table 2.</w:t>
       </w:r>
       <w:r>
         <w:rPr>
@@ -6575,7 +5743,7 @@
         <w:tblW w:type="pct" w:w="5000"/>
         <w:jc w:val="center"/>
         <w:tblLook w:firstRow="1" w:lastRow="0" w:firstColumn="0" w:lastColumn="0" w:noHBand="0" w:noVBand="0" w:val="0020"/>
-        <w:tblCaption w:val="Table 3. CoEval reproduces the ground-truth model ranking. Three student models ranked by CoEval frontier-ensemble accuracy score (datapoint-clustered 95% CI) and by exact-match ground truth; the orderings match."/>
+        <w:tblCaption w:val="Table 2. CoEval reproduces the ground-truth model ranking. Three student models ranked by CoEval frontier-ensemble accuracy score (datapoint-clustered 95% CI) and by exact-match ground truth; the orderings match."/>
         <w:tblLayout w:type="autofit"/>
         <w:tblBorders>
           <w:top w:val="single" w:sz="10" w:color="4F6272"/>
@@ -8028,8 +7196,8 @@
         </w:tc>
       </w:tr>
     </w:tbl>
-    <w:bookmarkEnd w:id="27"/>
-    <w:bookmarkStart w:id="31" w:name="Xe8bbf6e8b303eda2252037f5179fa153abacf26"/>
+    <w:bookmarkEnd w:id="24"/>
+    <w:bookmarkStart w:id="28" w:name="Xe8bbf6e8b303eda2252037f5179fa153abacf26"/>
     <w:p>
       <w:pPr>
         <w:pStyle w:val="Heading3"/>
@@ -8122,7 +7290,7 @@
         <w:t xml:space="preserve"> </w:t>
       </w:r>
       <w:r>
-        <w:t xml:space="preserve">as judges are added in descending order of agreement (Figure 3).</w:t>
+        <w:t xml:space="preserve">as judges are added in descending order of agreement (Figure 2).</w:t>
       </w:r>
       <w:r>
         <w:t xml:space="preserve"> </w:t>
@@ -8625,18 +7793,18 @@
           <wp:inline>
             <wp:extent cx="4815840" cy="3169920"/>
             <wp:effectExtent b="0" l="0" r="0" t="0"/>
-            <wp:docPr descr="ICC(3,k) versus number of judges, peaking at the selected strong panel" title="" id="29" name="Picture"/>
+            <wp:docPr descr="ICC(3,k) versus number of judges, peaking at the selected strong panel" title="" id="26" name="Picture"/>
             <a:graphic>
               <a:graphicData uri="http://schemas.openxmlformats.org/drawingml/2006/picture">
                 <pic:pic>
                   <pic:nvPicPr>
-                    <pic:cNvPr descr="figures/f2_icc_curve.png" id="30" name="Picture"/>
+                    <pic:cNvPr descr="figures/f2_icc_curve.png" id="27" name="Picture"/>
                     <pic:cNvPicPr>
                       <a:picLocks noChangeArrowheads="1" noChangeAspect="1"/>
                     </pic:cNvPicPr>
                   </pic:nvPicPr>
                   <pic:blipFill>
-                    <a:blip r:embed="rId28"/>
+                    <a:blip r:embed="rId25"/>
                     <a:stretch>
                       <a:fillRect/>
                     </a:stretch>
@@ -8677,7 +7845,7 @@
           <w:b/>
           <w:i/>
         </w:rPr>
-        <w:t>Figure 3.</w:t>
+        <w:t>Figure 2.</w:t>
       </w:r>
       <w:r>
         <w:rPr>
@@ -9625,7 +8793,7 @@
         <w:t xml:space="preserve"> </w:t>
       </w:r>
       <w:r>
-        <w:t xml:space="preserve">baselines on the same scores (Table 4), the doubly-robust ranking matches or beats the best single judge (an</w:t>
+        <w:t xml:space="preserve">baselines on the same scores (Table 3), the doubly-robust ranking matches or beats the best single judge (an</w:t>
       </w:r>
       <w:r>
         <w:t xml:space="preserve"> </w:t>
@@ -9666,7 +8834,7 @@
           <w:b/>
           <w:i/>
         </w:rPr>
-        <w:t>Table 4.</w:t>
+        <w:t>Table 3.</w:t>
       </w:r>
       <w:r>
         <w:rPr>
@@ -9689,7 +8857,7 @@
         <w:tblW w:type="pct" w:w="5000"/>
         <w:jc w:val="center"/>
         <w:tblLook w:firstRow="1" w:lastRow="0" w:firstColumn="0" w:lastColumn="0" w:noHBand="0" w:noVBand="0" w:val="0020"/>
-        <w:tblCaption w:val="Table 4. Rank-recovery on thirteen candidate models (science QA and reasoning; gold = benchmark-native accuracy), comparing standard label-free baselines (best single judge, unweighted panel / PoLL, median) against the CoEval weights. Each CoEval weight helps on its own, and the two compose into the best recovery; the aggregator alone is robust to an injected random judge, which it gives weight 0.00. Values are the Spearman and Kendall correlations between the recovered ranking and the gold-accuracy ranking."/>
+        <w:tblCaption w:val="Table 3. Rank-recovery on thirteen candidate models (science QA and reasoning; gold = benchmark-native accuracy), comparing standard label-free baselines (best single judge, unweighted panel / PoLL, median) against the CoEval weights. Each CoEval weight helps on its own, and the two compose into the best recovery; the aggregator alone is robust to an injected random judge, which it gives weight 0.00. Values are the Spearman and Kendall correlations between the recovered ranking and the gold-accuracy ranking."/>
         <w:tblLayout w:type="autofit"/>
         <w:tblBorders>
           <w:top w:val="single" w:sz="10" w:color="4F6272"/>
@@ -10537,8 +9705,8 @@
         <w:t xml:space="preserve">; Appendix E reports both, including the residual-bias measurements.</w:t>
       </w:r>
     </w:p>
-    <w:bookmarkEnd w:id="31"/>
-    <w:bookmarkStart w:id="32" w:name="contamination-resistance"/>
+    <w:bookmarkEnd w:id="28"/>
+    <w:bookmarkStart w:id="29" w:name="contamination-resistance"/>
     <w:p>
       <w:pPr>
         <w:pStyle w:val="Heading3"/>
@@ -10718,7 +9886,7 @@
         <w:t xml:space="preserve"> </w:t>
       </w:r>
       <w:r>
-        <w:t xml:space="preserve">applies to CoEval's generated items; the benchmark-grounded anchor of Table 2 deliberately reuses public items to</w:t>
+        <w:t xml:space="preserve">applies to CoEval's generated items; the benchmark-grounded anchor of Table 1 deliberately reuses public items to</w:t>
       </w:r>
       <w:r>
         <w:t xml:space="preserve"> </w:t>
@@ -10999,8 +10167,8 @@
         <w:t xml:space="preserve">items remove because no candidate can have trained on items synthesized after the fact.</w:t>
       </w:r>
     </w:p>
-    <w:bookmarkEnd w:id="32"/>
-    <w:bookmarkStart w:id="33" w:name="putting-it-together-domain-case-studies"/>
+    <w:bookmarkEnd w:id="29"/>
+    <w:bookmarkStart w:id="30" w:name="putting-it-together-domain-case-studies"/>
     <w:p>
       <w:pPr>
         <w:pStyle w:val="Heading3"/>
@@ -11286,7 +10454,7 @@
         <w:t xml:space="preserve"> </w:t>
       </w:r>
       <w:r>
-        <w:t xml:space="preserve">model (Table 5). The clinical and legal verticals are consistent: the ensemble ranks the smallest model weakest in</w:t>
+        <w:t xml:space="preserve">model (Table 4). The clinical and legal verticals are consistent: the ensemble ranks the smallest model weakest in</w:t>
       </w:r>
       <w:r>
         <w:t xml:space="preserve"> </w:t>
@@ -11576,7 +10744,7 @@
           <w:b/>
           <w:i/>
         </w:rPr>
-        <w:t>Table 5.</w:t>
+        <w:t>Table 4.</w:t>
       </w:r>
       <w:r>
         <w:rPr>
@@ -11599,7 +10767,7 @@
         <w:tblW w:type="pct" w:w="5000"/>
         <w:jc w:val="center"/>
         <w:tblLook w:firstRow="1" w:lastRow="0" w:firstColumn="0" w:lastColumn="0" w:noHBand="0" w:noVBand="0" w:val="0020"/>
-        <w:tblCaption w:val="Table 5. CoEval ranks three candidate models on three custom, contamination-free verticals generated from a task description with no labeled data. Scores are the cross-family ensemble mean ([0, 1]) with 95% bootstrap CI over 40 generated items. llama-3.2-3b ranks weakest in every vertical; the three judges agree unanimously on the full drug-interaction order, unanimously on the weakest clinical model, and two-of-three in legal."/>
+        <w:tblCaption w:val="Table 4. CoEval ranks three candidate models on three custom, contamination-free verticals generated from a task description with no labeled data. Scores are the cross-family ensemble mean ([0, 1]) with 95% bootstrap CI over 40 generated items. llama-3.2-3b ranks weakest in every vertical; the three judges agree unanimously on the full drug-interaction order, unanimously on the weakest clinical model, and two-of-three in legal."/>
         <w:tblLayout w:type="autofit"/>
         <w:tblBorders>
           <w:top w:val="single" w:sz="10" w:color="4F6272"/>
@@ -12481,9 +11649,9 @@
         <w:t xml:space="preserve">so a generic leaderboard misdirects most practitioners. Appendix D details this divergence (Table D1).</w:t>
       </w:r>
     </w:p>
-    <w:bookmarkEnd w:id="33"/>
-    <w:bookmarkEnd w:id="34"/>
-    <w:bookmarkStart w:id="35" w:name="discussion"/>
+    <w:bookmarkEnd w:id="30"/>
+    <w:bookmarkEnd w:id="31"/>
+    <w:bookmarkStart w:id="32" w:name="discussion"/>
     <w:p>
       <w:pPr>
         <w:pStyle w:val="Heading2"/>
@@ -12626,8 +11794,8 @@
         <w:t xml:space="preserve">the scores.</w:t>
       </w:r>
     </w:p>
-    <w:bookmarkEnd w:id="35"/>
-    <w:bookmarkStart w:id="36" w:name="conclusion"/>
+    <w:bookmarkEnd w:id="32"/>
+    <w:bookmarkStart w:id="33" w:name="conclusion"/>
     <w:p>
       <w:pPr>
         <w:pStyle w:val="Heading2"/>
@@ -12834,8 +12002,8 @@
         <w:t xml:space="preserve">a trustworthy benchmark exists, rather than a single static study. CoEval is open-source and fully reproducible.</w:t>
       </w:r>
     </w:p>
-    <w:bookmarkEnd w:id="36"/>
-    <w:bookmarkStart w:id="37" w:name="limitations"/>
+    <w:bookmarkEnd w:id="33"/>
+    <w:bookmarkStart w:id="34" w:name="limitations"/>
     <w:p>
       <w:pPr>
         <w:pStyle w:val="Heading2"/>
@@ -12962,8 +12130,8 @@
         <w:t xml:space="preserve">pretraining.</w:t>
       </w:r>
     </w:p>
-    <w:bookmarkEnd w:id="37"/>
-    <w:bookmarkStart w:id="38" w:name="ethics-statement"/>
+    <w:bookmarkEnd w:id="34"/>
+    <w:bookmarkStart w:id="35" w:name="ethics-statement"/>
     <w:p>
       <w:pPr>
         <w:pStyle w:val="Heading2"/>
@@ -13023,8 +12191,8 @@
         <w:t xml:space="preserve">risk, and a practitioner applying CoEval in a high-stakes domain should pair it with human oversight.</w:t>
       </w:r>
     </w:p>
-    <w:bookmarkEnd w:id="38"/>
-    <w:bookmarkStart w:id="39" w:name="reproducibility"/>
+    <w:bookmarkEnd w:id="35"/>
+    <w:bookmarkStart w:id="36" w:name="reproducibility"/>
     <w:p>
       <w:pPr>
         <w:pStyle w:val="Heading2"/>
@@ -13072,8 +12240,8 @@
         <w:t xml:space="preserve">Appendix A.</w:t>
       </w:r>
     </w:p>
-    <w:bookmarkEnd w:id="39"/>
-    <w:bookmarkStart w:id="116" w:name="references"/>
+    <w:bookmarkEnd w:id="36"/>
+    <w:bookmarkStart w:id="113" w:name="references"/>
     <w:p>
       <w:pPr>
         <w:pStyle w:val="ReferencesHeading"/>
@@ -13107,7 +12275,7 @@
         </w:rPr>
         <w:t xml:space="preserve">1. </w:t>
       </w:r>
-      <w:bookmarkStart w:id="41" w:name="r1"/>
+      <w:bookmarkStart w:id="38" w:name="r1"/>
       <w:r>
         <w:t xml:space="preserve">Zheng, L., Chiang, W.-L., Sheng, Y., et al. (2023).</w:t>
       </w:r>
@@ -13144,7 +12312,7 @@
       <w:r>
         <w:t xml:space="preserve"> </w:t>
       </w:r>
-      <w:hyperlink r:id="rId40">
+      <w:hyperlink r:id="rId37">
         <w:r>
           <w:rPr>
             <w:rStyle w:val="Hyperlink"/>
@@ -13152,7 +12320,7 @@
           <w:t xml:space="preserve">arxiv.org/abs/2306.05685</w:t>
         </w:r>
       </w:hyperlink>
-      <w:bookmarkEnd w:id="41"/>
+      <w:bookmarkEnd w:id="38"/>
     </w:p>
     <w:p>
       <w:pPr>
@@ -13175,7 +12343,7 @@
         </w:rPr>
         <w:t xml:space="preserve">2. </w:t>
       </w:r>
-      <w:bookmarkStart w:id="43" w:name="r2"/>
+      <w:bookmarkStart w:id="40" w:name="r2"/>
       <w:r>
         <w:t xml:space="preserve">Liu, Y., Iter, D., Xu, Y., et al. (2023).</w:t>
       </w:r>
@@ -13212,7 +12380,7 @@
       <w:r>
         <w:t xml:space="preserve"> </w:t>
       </w:r>
-      <w:hyperlink r:id="rId42">
+      <w:hyperlink r:id="rId39">
         <w:r>
           <w:rPr>
             <w:rStyle w:val="Hyperlink"/>
@@ -13220,7 +12388,7 @@
           <w:t xml:space="preserve">arxiv.org/abs/2303.16634</w:t>
         </w:r>
       </w:hyperlink>
-      <w:bookmarkEnd w:id="43"/>
+      <w:bookmarkEnd w:id="40"/>
     </w:p>
     <w:p>
       <w:pPr>
@@ -13243,7 +12411,7 @@
         </w:rPr>
         <w:t xml:space="preserve">3. </w:t>
       </w:r>
-      <w:bookmarkStart w:id="45" w:name="r3"/>
+      <w:bookmarkStart w:id="42" w:name="r3"/>
       <w:r>
         <w:t xml:space="preserve">Kim, S., Suk, J., Longpre, S., et al. (2024).</w:t>
       </w:r>
@@ -13274,7 +12442,7 @@
       <w:r>
         <w:t xml:space="preserve"> </w:t>
       </w:r>
-      <w:hyperlink r:id="rId44">
+      <w:hyperlink r:id="rId41">
         <w:r>
           <w:rPr>
             <w:rStyle w:val="Hyperlink"/>
@@ -13282,7 +12450,7 @@
           <w:t xml:space="preserve">arxiv.org/abs/2405.01535</w:t>
         </w:r>
       </w:hyperlink>
-      <w:bookmarkEnd w:id="45"/>
+      <w:bookmarkEnd w:id="42"/>
     </w:p>
     <w:p>
       <w:pPr>
@@ -13305,7 +12473,7 @@
         </w:rPr>
         <w:t xml:space="preserve">4. </w:t>
       </w:r>
-      <w:bookmarkStart w:id="47" w:name="r4"/>
+      <w:bookmarkStart w:id="44" w:name="r4"/>
       <w:r>
         <w:t xml:space="preserve">Vu, T., Krishna, K., Alzubi, S., et al. (2024).</w:t>
       </w:r>
@@ -13342,7 +12510,7 @@
       <w:r>
         <w:t xml:space="preserve"> </w:t>
       </w:r>
-      <w:hyperlink r:id="rId46">
+      <w:hyperlink r:id="rId43">
         <w:r>
           <w:rPr>
             <w:rStyle w:val="Hyperlink"/>
@@ -13350,7 +12518,7 @@
           <w:t xml:space="preserve">arxiv.org/abs/2407.10817</w:t>
         </w:r>
       </w:hyperlink>
-      <w:bookmarkEnd w:id="47"/>
+      <w:bookmarkEnd w:id="44"/>
     </w:p>
     <w:p>
       <w:pPr>
@@ -13373,7 +12541,7 @@
         </w:rPr>
         <w:t xml:space="preserve">5. </w:t>
       </w:r>
-      <w:bookmarkStart w:id="49" w:name="r5"/>
+      <w:bookmarkStart w:id="46" w:name="r5"/>
       <w:r>
         <w:t xml:space="preserve">Verga, P., Hofstatter, S., Althammer, S., et al. (2024).</w:t>
       </w:r>
@@ -13404,7 +12572,7 @@
       <w:r>
         <w:t xml:space="preserve"> </w:t>
       </w:r>
-      <w:hyperlink r:id="rId48">
+      <w:hyperlink r:id="rId45">
         <w:r>
           <w:rPr>
             <w:rStyle w:val="Hyperlink"/>
@@ -13412,7 +12580,7 @@
           <w:t xml:space="preserve">arxiv.org/abs/2404.18796</w:t>
         </w:r>
       </w:hyperlink>
-      <w:bookmarkEnd w:id="49"/>
+      <w:bookmarkEnd w:id="46"/>
     </w:p>
     <w:p>
       <w:pPr>
@@ -13435,7 +12603,7 @@
         </w:rPr>
         <w:t xml:space="preserve">6. </w:t>
       </w:r>
-      <w:bookmarkStart w:id="51" w:name="r6"/>
+      <w:bookmarkStart w:id="48" w:name="r6"/>
       <w:r>
         <w:t xml:space="preserve">Tan, S., Zhuang, S., Montgomery, K., et al. (2025).</w:t>
       </w:r>
@@ -13472,7 +12640,7 @@
       <w:r>
         <w:t xml:space="preserve"> </w:t>
       </w:r>
-      <w:hyperlink r:id="rId50">
+      <w:hyperlink r:id="rId47">
         <w:r>
           <w:rPr>
             <w:rStyle w:val="Hyperlink"/>
@@ -13480,7 +12648,7 @@
           <w:t xml:space="preserve">arxiv.org/abs/2410.12784</w:t>
         </w:r>
       </w:hyperlink>
-      <w:bookmarkEnd w:id="51"/>
+      <w:bookmarkEnd w:id="48"/>
     </w:p>
     <w:p>
       <w:pPr>
@@ -13503,7 +12671,7 @@
         </w:rPr>
         <w:t xml:space="preserve">7. </w:t>
       </w:r>
-      <w:bookmarkStart w:id="53" w:name="r7"/>
+      <w:bookmarkStart w:id="50" w:name="r7"/>
       <w:r>
         <w:t xml:space="preserve">Kim, S., Suk, J., Cho, J. Y., et al. (2025).</w:t>
       </w:r>
@@ -13540,7 +12708,7 @@
       <w:r>
         <w:t xml:space="preserve"> </w:t>
       </w:r>
-      <w:hyperlink r:id="rId52">
+      <w:hyperlink r:id="rId49">
         <w:r>
           <w:rPr>
             <w:rStyle w:val="Hyperlink"/>
@@ -13548,7 +12716,7 @@
           <w:t xml:space="preserve">arxiv.org/abs/2406.05761</w:t>
         </w:r>
       </w:hyperlink>
-      <w:bookmarkEnd w:id="53"/>
+      <w:bookmarkEnd w:id="50"/>
     </w:p>
     <w:p>
       <w:pPr>
@@ -13571,7 +12739,7 @@
         </w:rPr>
         <w:t xml:space="preserve">8. </w:t>
       </w:r>
-      <w:bookmarkStart w:id="55" w:name="r8"/>
+      <w:bookmarkStart w:id="52" w:name="r8"/>
       <w:r>
         <w:t xml:space="preserve">Dubois, Y., Galambosi, B., Liang, P., Hashimoto, T. B. (2024).</w:t>
       </w:r>
@@ -13602,7 +12770,7 @@
       <w:r>
         <w:t xml:space="preserve"> </w:t>
       </w:r>
-      <w:hyperlink r:id="rId54">
+      <w:hyperlink r:id="rId51">
         <w:r>
           <w:rPr>
             <w:rStyle w:val="Hyperlink"/>
@@ -13610,7 +12778,7 @@
           <w:t xml:space="preserve">arxiv.org/abs/2404.04475</w:t>
         </w:r>
       </w:hyperlink>
-      <w:bookmarkEnd w:id="55"/>
+      <w:bookmarkEnd w:id="52"/>
     </w:p>
     <w:p>
       <w:pPr>
@@ -13633,7 +12801,7 @@
         </w:rPr>
         <w:t xml:space="preserve">9. </w:t>
       </w:r>
-      <w:bookmarkStart w:id="57" w:name="r9"/>
+      <w:bookmarkStart w:id="54" w:name="r9"/>
       <w:r>
         <w:t xml:space="preserve">Li, X. L., Kazemi, M., et al. (2024).</w:t>
       </w:r>
@@ -13650,7 +12818,7 @@
       <w:r>
         <w:t xml:space="preserve"> </w:t>
       </w:r>
-      <w:hyperlink r:id="rId56">
+      <w:hyperlink r:id="rId53">
         <w:r>
           <w:rPr>
             <w:rStyle w:val="Hyperlink"/>
@@ -13658,7 +12826,7 @@
           <w:t xml:space="preserve">arxiv.org/abs/2407.08351</w:t>
         </w:r>
       </w:hyperlink>
-      <w:bookmarkEnd w:id="57"/>
+      <w:bookmarkEnd w:id="54"/>
     </w:p>
     <w:p>
       <w:pPr>
@@ -13681,7 +12849,7 @@
         </w:rPr>
         <w:t xml:space="preserve">10. </w:t>
       </w:r>
-      <w:bookmarkStart w:id="59" w:name="r10"/>
+      <w:bookmarkStart w:id="56" w:name="r10"/>
       <w:r>
         <w:t xml:space="preserve">Butt, N., Awadalla, H., et al. (2024).</w:t>
       </w:r>
@@ -13712,7 +12880,7 @@
       <w:r>
         <w:t xml:space="preserve"> </w:t>
       </w:r>
-      <w:hyperlink r:id="rId58">
+      <w:hyperlink r:id="rId55">
         <w:r>
           <w:rPr>
             <w:rStyle w:val="Hyperlink"/>
@@ -13720,7 +12888,7 @@
           <w:t xml:space="preserve">arxiv.org/abs/2410.22584</w:t>
         </w:r>
       </w:hyperlink>
-      <w:bookmarkEnd w:id="59"/>
+      <w:bookmarkEnd w:id="56"/>
     </w:p>
     <w:p>
       <w:pPr>
@@ -13743,7 +12911,7 @@
         </w:rPr>
         <w:t xml:space="preserve">11. </w:t>
       </w:r>
-      <w:bookmarkStart w:id="61" w:name="r11"/>
+      <w:bookmarkStart w:id="58" w:name="r11"/>
       <w:r>
         <w:t xml:space="preserve">Shashidhar, S., et al. (2025).</w:t>
       </w:r>
@@ -13760,7 +12928,7 @@
       <w:r>
         <w:t xml:space="preserve"> </w:t>
       </w:r>
-      <w:hyperlink r:id="rId60">
+      <w:hyperlink r:id="rId57">
         <w:r>
           <w:rPr>
             <w:rStyle w:val="Hyperlink"/>
@@ -13768,7 +12936,7 @@
           <w:t xml:space="preserve">arxiv.org/abs/2504.01833</w:t>
         </w:r>
       </w:hyperlink>
-      <w:bookmarkEnd w:id="61"/>
+      <w:bookmarkEnd w:id="58"/>
     </w:p>
     <w:p>
       <w:pPr>
@@ -13791,7 +12959,7 @@
         </w:rPr>
         <w:t xml:space="preserve">12. </w:t>
       </w:r>
-      <w:bookmarkStart w:id="63" w:name="r12"/>
+      <w:bookmarkStart w:id="60" w:name="r12"/>
       <w:r>
         <w:t xml:space="preserve">Zhang, H., Da, J., Lee, D., et al. (2024).</w:t>
       </w:r>
@@ -13822,7 +12990,7 @@
       <w:r>
         <w:t xml:space="preserve"> </w:t>
       </w:r>
-      <w:hyperlink r:id="rId62">
+      <w:hyperlink r:id="rId59">
         <w:r>
           <w:rPr>
             <w:rStyle w:val="Hyperlink"/>
@@ -13830,7 +12998,7 @@
           <w:t xml:space="preserve">arxiv.org/abs/2405.00332</w:t>
         </w:r>
       </w:hyperlink>
-      <w:bookmarkEnd w:id="63"/>
+      <w:bookmarkEnd w:id="60"/>
     </w:p>
     <w:p>
       <w:pPr>
@@ -13853,7 +13021,7 @@
         </w:rPr>
         <w:t xml:space="preserve">13. </w:t>
       </w:r>
-      <w:bookmarkStart w:id="65" w:name="r13"/>
+      <w:bookmarkStart w:id="62" w:name="r13"/>
       <w:r>
         <w:t xml:space="preserve">Xu, C., et al. (2025).</w:t>
       </w:r>
@@ -13870,7 +13038,7 @@
       <w:r>
         <w:t xml:space="preserve"> </w:t>
       </w:r>
-      <w:hyperlink r:id="rId64">
+      <w:hyperlink r:id="rId61">
         <w:r>
           <w:rPr>
             <w:rStyle w:val="Hyperlink"/>
@@ -13878,7 +13046,7 @@
           <w:t xml:space="preserve">arxiv.org/abs/2502.14425</w:t>
         </w:r>
       </w:hyperlink>
-      <w:bookmarkEnd w:id="65"/>
+      <w:bookmarkEnd w:id="62"/>
     </w:p>
     <w:p>
       <w:pPr>
@@ -13901,7 +13069,7 @@
         </w:rPr>
         <w:t xml:space="preserve">14. </w:t>
       </w:r>
-      <w:bookmarkStart w:id="67" w:name="r14"/>
+      <w:bookmarkStart w:id="64" w:name="r14"/>
       <w:r>
         <w:t xml:space="preserve">Kiela, D., Bartolo, M., Nie, Y., et al. (2021).</w:t>
       </w:r>
@@ -13924,7 +13092,7 @@
       <w:r>
         <w:t xml:space="preserve"> </w:t>
       </w:r>
-      <w:hyperlink r:id="rId66">
+      <w:hyperlink r:id="rId63">
         <w:r>
           <w:rPr>
             <w:rStyle w:val="Hyperlink"/>
@@ -13932,7 +13100,7 @@
           <w:t xml:space="preserve">arxiv.org/abs/2104.14337</w:t>
         </w:r>
       </w:hyperlink>
-      <w:bookmarkEnd w:id="67"/>
+      <w:bookmarkEnd w:id="64"/>
     </w:p>
     <w:p>
       <w:pPr>
@@ -13955,7 +13123,7 @@
         </w:rPr>
         <w:t xml:space="preserve">15. </w:t>
       </w:r>
-      <w:bookmarkStart w:id="69" w:name="r15"/>
+      <w:bookmarkStart w:id="66" w:name="r15"/>
       <w:r>
         <w:t xml:space="preserve">Li, D., Sun, R., Huang, Y., et al. (2026).</w:t>
       </w:r>
@@ -13992,7 +13160,7 @@
       <w:r>
         <w:t xml:space="preserve"> </w:t>
       </w:r>
-      <w:hyperlink r:id="rId68">
+      <w:hyperlink r:id="rId65">
         <w:r>
           <w:rPr>
             <w:rStyle w:val="Hyperlink"/>
@@ -14000,7 +13168,7 @@
           <w:t xml:space="preserve">arxiv.org/abs/2502.01534</w:t>
         </w:r>
       </w:hyperlink>
-      <w:bookmarkEnd w:id="69"/>
+      <w:bookmarkEnd w:id="66"/>
     </w:p>
     <w:p>
       <w:pPr>
@@ -14023,7 +13191,7 @@
         </w:rPr>
         <w:t xml:space="preserve">16. </w:t>
       </w:r>
-      <w:bookmarkStart w:id="71" w:name="r16"/>
+      <w:bookmarkStart w:id="68" w:name="r16"/>
       <w:r>
         <w:t xml:space="preserve">Spiliopoulou, E., et al. (2025).</w:t>
       </w:r>
@@ -14054,7 +13222,7 @@
       <w:r>
         <w:t xml:space="preserve"> </w:t>
       </w:r>
-      <w:hyperlink r:id="rId70">
+      <w:hyperlink r:id="rId67">
         <w:r>
           <w:rPr>
             <w:rStyle w:val="Hyperlink"/>
@@ -14062,7 +13230,7 @@
           <w:t xml:space="preserve">arxiv.org/abs/2508.06709</w:t>
         </w:r>
       </w:hyperlink>
-      <w:bookmarkEnd w:id="71"/>
+      <w:bookmarkEnd w:id="68"/>
     </w:p>
     <w:p>
       <w:pPr>
@@ -14085,7 +13253,7 @@
         </w:rPr>
         <w:t xml:space="preserve">17. </w:t>
       </w:r>
-      <w:bookmarkStart w:id="73" w:name="r17"/>
+      <w:bookmarkStart w:id="70" w:name="r17"/>
       <w:r>
         <w:t xml:space="preserve">Ye, J., Wang, Y., Huang, Y., et al. (2024).</w:t>
       </w:r>
@@ -14116,7 +13284,7 @@
       <w:r>
         <w:t xml:space="preserve"> </w:t>
       </w:r>
-      <w:hyperlink r:id="rId72">
+      <w:hyperlink r:id="rId69">
         <w:r>
           <w:rPr>
             <w:rStyle w:val="Hyperlink"/>
@@ -14124,7 +13292,7 @@
           <w:t xml:space="preserve">arxiv.org/abs/2410.02736</w:t>
         </w:r>
       </w:hyperlink>
-      <w:bookmarkEnd w:id="73"/>
+      <w:bookmarkEnd w:id="70"/>
     </w:p>
     <w:p>
       <w:pPr>
@@ -14147,7 +13315,7 @@
         </w:rPr>
         <w:t xml:space="preserve">18. </w:t>
       </w:r>
-      <w:bookmarkStart w:id="75" w:name="r18"/>
+      <w:bookmarkStart w:id="72" w:name="r18"/>
       <w:r>
         <w:t xml:space="preserve">Wataoka, K., Takahashi, T., Ri, R. (2024).</w:t>
       </w:r>
@@ -14164,7 +13332,7 @@
       <w:r>
         <w:t xml:space="preserve"> </w:t>
       </w:r>
-      <w:hyperlink r:id="rId74">
+      <w:hyperlink r:id="rId71">
         <w:r>
           <w:rPr>
             <w:rStyle w:val="Hyperlink"/>
@@ -14172,7 +13340,7 @@
           <w:t xml:space="preserve">arxiv.org/abs/2410.21819</w:t>
         </w:r>
       </w:hyperlink>
-      <w:bookmarkEnd w:id="75"/>
+      <w:bookmarkEnd w:id="72"/>
     </w:p>
     <w:p>
       <w:pPr>
@@ -14195,7 +13363,7 @@
         </w:rPr>
         <w:t xml:space="preserve">19. </w:t>
       </w:r>
-      <w:bookmarkStart w:id="77" w:name="r19"/>
+      <w:bookmarkStart w:id="74" w:name="r19"/>
       <w:r>
         <w:t xml:space="preserve">Gu, J., Jiang, X., Shi, Z., et al. (2024).</w:t>
       </w:r>
@@ -14212,7 +13380,7 @@
       <w:r>
         <w:t xml:space="preserve"> </w:t>
       </w:r>
-      <w:hyperlink r:id="rId76">
+      <w:hyperlink r:id="rId73">
         <w:r>
           <w:rPr>
             <w:rStyle w:val="Hyperlink"/>
@@ -14220,7 +13388,7 @@
           <w:t xml:space="preserve">arxiv.org/abs/2411.15594</w:t>
         </w:r>
       </w:hyperlink>
-      <w:bookmarkEnd w:id="77"/>
+      <w:bookmarkEnd w:id="74"/>
     </w:p>
     <w:p>
       <w:pPr>
@@ -14243,7 +13411,7 @@
         </w:rPr>
         <w:t xml:space="preserve">20. </w:t>
       </w:r>
-      <w:bookmarkStart w:id="79" w:name="r20"/>
+      <w:bookmarkStart w:id="76" w:name="r20"/>
       <w:r>
         <w:t xml:space="preserve">Li, D., Jiang, B., Huang, L., et al. (2025).</w:t>
       </w:r>
@@ -14280,7 +13448,7 @@
       <w:r>
         <w:t xml:space="preserve"> </w:t>
       </w:r>
-      <w:hyperlink r:id="rId78">
+      <w:hyperlink r:id="rId75">
         <w:r>
           <w:rPr>
             <w:rStyle w:val="Hyperlink"/>
@@ -14288,7 +13456,7 @@
           <w:t xml:space="preserve">arxiv.org/abs/2411.16594</w:t>
         </w:r>
       </w:hyperlink>
-      <w:bookmarkEnd w:id="79"/>
+      <w:bookmarkEnd w:id="76"/>
     </w:p>
     <w:p>
       <w:pPr>
@@ -14311,7 +13479,7 @@
         </w:rPr>
         <w:t xml:space="preserve">21. </w:t>
       </w:r>
-      <w:bookmarkStart w:id="81" w:name="r21"/>
+      <w:bookmarkStart w:id="78" w:name="r21"/>
       <w:r>
         <w:t xml:space="preserve">Chan, C.-M., Chen, W., Su, Y., et al. (2024).</w:t>
       </w:r>
@@ -14348,7 +13516,7 @@
       <w:r>
         <w:t xml:space="preserve"> </w:t>
       </w:r>
-      <w:hyperlink r:id="rId80">
+      <w:hyperlink r:id="rId77">
         <w:r>
           <w:rPr>
             <w:rStyle w:val="Hyperlink"/>
@@ -14356,7 +13524,7 @@
           <w:t xml:space="preserve">arxiv.org/abs/2308.07201</w:t>
         </w:r>
       </w:hyperlink>
-      <w:bookmarkEnd w:id="81"/>
+      <w:bookmarkEnd w:id="78"/>
     </w:p>
     <w:p>
       <w:pPr>
@@ -14379,7 +13547,7 @@
         </w:rPr>
         <w:t xml:space="preserve">22. </w:t>
       </w:r>
-      <w:bookmarkStart w:id="83" w:name="r22"/>
+      <w:bookmarkStart w:id="80" w:name="r22"/>
       <w:r>
         <w:t xml:space="preserve">White, C., Dooley, S., Roberts, M., et al. (2025).</w:t>
       </w:r>
@@ -14416,7 +13584,7 @@
       <w:r>
         <w:t xml:space="preserve"> </w:t>
       </w:r>
-      <w:hyperlink r:id="rId82">
+      <w:hyperlink r:id="rId79">
         <w:r>
           <w:rPr>
             <w:rStyle w:val="Hyperlink"/>
@@ -14424,7 +13592,7 @@
           <w:t xml:space="preserve">arxiv.org/abs/2406.19314</w:t>
         </w:r>
       </w:hyperlink>
-      <w:bookmarkEnd w:id="83"/>
+      <w:bookmarkEnd w:id="80"/>
     </w:p>
     <w:p>
       <w:pPr>
@@ -14447,7 +13615,7 @@
         </w:rPr>
         <w:t xml:space="preserve">23. </w:t>
       </w:r>
-      <w:bookmarkStart w:id="85" w:name="r23"/>
+      <w:bookmarkStart w:id="82" w:name="r23"/>
       <w:r>
         <w:t xml:space="preserve">Jain, N., Han, K., Gu, A., et al. (2025).</w:t>
       </w:r>
@@ -14484,7 +13652,7 @@
       <w:r>
         <w:t xml:space="preserve"> </w:t>
       </w:r>
-      <w:hyperlink r:id="rId84">
+      <w:hyperlink r:id="rId81">
         <w:r>
           <w:rPr>
             <w:rStyle w:val="Hyperlink"/>
@@ -14492,7 +13660,7 @@
           <w:t xml:space="preserve">arxiv.org/abs/2403.07974</w:t>
         </w:r>
       </w:hyperlink>
-      <w:bookmarkEnd w:id="85"/>
+      <w:bookmarkEnd w:id="82"/>
     </w:p>
     <w:p>
       <w:pPr>
@@ -14515,7 +13683,7 @@
         </w:rPr>
         <w:t xml:space="preserve">24. </w:t>
       </w:r>
-      <w:bookmarkStart w:id="87" w:name="r24"/>
+      <w:bookmarkStart w:id="84" w:name="r24"/>
       <w:r>
         <w:t xml:space="preserve">Chen, W.-L., Wu, Z., Bansal, H., et al. (2025).</w:t>
       </w:r>
@@ -14546,7 +13714,7 @@
       <w:r>
         <w:t xml:space="preserve"> </w:t>
       </w:r>
-      <w:hyperlink r:id="rId86">
+      <w:hyperlink r:id="rId83">
         <w:r>
           <w:rPr>
             <w:rStyle w:val="Hyperlink"/>
@@ -14554,7 +13722,7 @@
           <w:t xml:space="preserve">arxiv.org/abs/2504.03846</w:t>
         </w:r>
       </w:hyperlink>
-      <w:bookmarkEnd w:id="87"/>
+      <w:bookmarkEnd w:id="84"/>
     </w:p>
     <w:p>
       <w:pPr>
@@ -14577,7 +13745,7 @@
         </w:rPr>
         <w:t xml:space="preserve">25. </w:t>
       </w:r>
-      <w:bookmarkStart w:id="89" w:name="r25"/>
+      <w:bookmarkStart w:id="86" w:name="r25"/>
       <w:r>
         <w:t xml:space="preserve">Raju, R., Jain, S., Li, B., et al. (2024).</w:t>
       </w:r>
@@ -14608,7 +13776,7 @@
       <w:r>
         <w:t xml:space="preserve"> </w:t>
       </w:r>
-      <w:hyperlink r:id="rId88">
+      <w:hyperlink r:id="rId85">
         <w:r>
           <w:rPr>
             <w:rStyle w:val="Hyperlink"/>
@@ -14616,7 +13784,7 @@
           <w:t xml:space="preserve">arxiv.org/abs/2408.08808</w:t>
         </w:r>
       </w:hyperlink>
-      <w:bookmarkEnd w:id="89"/>
+      <w:bookmarkEnd w:id="86"/>
     </w:p>
     <w:p>
       <w:pPr>
@@ -14639,7 +13807,7 @@
         </w:rPr>
         <w:t xml:space="preserve">26. </w:t>
       </w:r>
-      <w:bookmarkStart w:id="91" w:name="r26"/>
+      <w:bookmarkStart w:id="88" w:name="r26"/>
       <w:r>
         <w:t xml:space="preserve">Li, Y., et al. (2025).</w:t>
       </w:r>
@@ -14656,7 +13824,7 @@
       <w:r>
         <w:t xml:space="preserve"> </w:t>
       </w:r>
-      <w:hyperlink r:id="rId90">
+      <w:hyperlink r:id="rId87">
         <w:r>
           <w:rPr>
             <w:rStyle w:val="Hyperlink"/>
@@ -14664,7 +13832,7 @@
           <w:t xml:space="preserve">arxiv.org/abs/2504.17087</w:t>
         </w:r>
       </w:hyperlink>
-      <w:bookmarkEnd w:id="91"/>
+      <w:bookmarkEnd w:id="88"/>
     </w:p>
     <w:p>
       <w:pPr>
@@ -14687,7 +13855,7 @@
         </w:rPr>
         <w:t xml:space="preserve">27. </w:t>
       </w:r>
-      <w:bookmarkStart w:id="93" w:name="r27"/>
+      <w:bookmarkStart w:id="90" w:name="r27"/>
       <w:r>
         <w:t xml:space="preserve">Qian, C., Sun, G., Gales, M., Knill, K. (2026).</w:t>
       </w:r>
@@ -14724,7 +13892,7 @@
       <w:r>
         <w:t xml:space="preserve"> </w:t>
       </w:r>
-      <w:hyperlink r:id="rId92">
+      <w:hyperlink r:id="rId89">
         <w:r>
           <w:rPr>
             <w:rStyle w:val="Hyperlink"/>
@@ -14732,7 +13900,7 @@
           <w:t xml:space="preserve">arxiv.org/abs/2602.16610</w:t>
         </w:r>
       </w:hyperlink>
-      <w:bookmarkEnd w:id="93"/>
+      <w:bookmarkEnd w:id="90"/>
     </w:p>
     <w:p>
       <w:pPr>
@@ -14755,7 +13923,7 @@
         </w:rPr>
         <w:t xml:space="preserve">28. </w:t>
       </w:r>
-      <w:bookmarkStart w:id="95" w:name="r28"/>
+      <w:bookmarkStart w:id="92" w:name="r28"/>
       <w:r>
         <w:t xml:space="preserve">Zhao, Y., Shin, J., Huang, Z., Namburi, S., Sala, F. (2026).</w:t>
       </w:r>
@@ -14786,7 +13954,7 @@
       <w:r>
         <w:t xml:space="preserve"> </w:t>
       </w:r>
-      <w:hyperlink r:id="rId94">
+      <w:hyperlink r:id="rId91">
         <w:r>
           <w:rPr>
             <w:rStyle w:val="Hyperlink"/>
@@ -14794,7 +13962,7 @@
           <w:t xml:space="preserve">arxiv.org/abs/2603.00039</w:t>
         </w:r>
       </w:hyperlink>
-      <w:bookmarkEnd w:id="95"/>
+      <w:bookmarkEnd w:id="92"/>
     </w:p>
     <w:p>
       <w:pPr>
@@ -14817,7 +13985,7 @@
         </w:rPr>
         <w:t xml:space="preserve">29. </w:t>
       </w:r>
-      <w:bookmarkStart w:id="97" w:name="r29"/>
+      <w:bookmarkStart w:id="94" w:name="r29"/>
       <w:r>
         <w:t xml:space="preserve">Xu, C., Tan, Z., Wu, J., Zhou, T. (2026).</w:t>
       </w:r>
@@ -14848,7 +14016,7 @@
       <w:r>
         <w:t xml:space="preserve"> </w:t>
       </w:r>
-      <w:hyperlink r:id="rId96">
+      <w:hyperlink r:id="rId93">
         <w:r>
           <w:rPr>
             <w:rStyle w:val="Hyperlink"/>
@@ -14856,7 +14024,7 @@
           <w:t xml:space="preserve">arxiv.org/abs/2601.21817</w:t>
         </w:r>
       </w:hyperlink>
-      <w:bookmarkEnd w:id="97"/>
+      <w:bookmarkEnd w:id="94"/>
     </w:p>
     <w:p>
       <w:pPr>
@@ -14879,7 +14047,7 @@
         </w:rPr>
         <w:t xml:space="preserve">30. </w:t>
       </w:r>
-      <w:bookmarkStart w:id="99" w:name="r30"/>
+      <w:bookmarkStart w:id="96" w:name="r30"/>
       <w:r>
         <w:t xml:space="preserve">Patel, A., Reddy, S., Bahdanau, D. (2025).</w:t>
       </w:r>
@@ -14910,7 +14078,7 @@
       <w:r>
         <w:t xml:space="preserve"> </w:t>
       </w:r>
-      <w:hyperlink r:id="rId98">
+      <w:hyperlink r:id="rId95">
         <w:r>
           <w:rPr>
             <w:rStyle w:val="Hyperlink"/>
@@ -14918,7 +14086,7 @@
           <w:t xml:space="preserve">arxiv.org/abs/2502.14678</w:t>
         </w:r>
       </w:hyperlink>
-      <w:bookmarkEnd w:id="99"/>
+      <w:bookmarkEnd w:id="96"/>
     </w:p>
     <w:p>
       <w:pPr>
@@ -14941,7 +14109,7 @@
         </w:rPr>
         <w:t xml:space="preserve">31. </w:t>
       </w:r>
-      <w:bookmarkStart w:id="101" w:name="r31"/>
+      <w:bookmarkStart w:id="98" w:name="r31"/>
       <w:r>
         <w:t xml:space="preserve">Filice, S., Horowitz, G., Carmel, D., Karnin, Z., Lewin-Eytan, L., Maarek, Y. (2025).</w:t>
       </w:r>
@@ -14978,7 +14146,7 @@
       <w:r>
         <w:t xml:space="preserve"> </w:t>
       </w:r>
-      <w:hyperlink r:id="rId100">
+      <w:hyperlink r:id="rId97">
         <w:r>
           <w:rPr>
             <w:rStyle w:val="Hyperlink"/>
@@ -14986,7 +14154,7 @@
           <w:t xml:space="preserve">arxiv.org/abs/2501.12789</w:t>
         </w:r>
       </w:hyperlink>
-      <w:bookmarkEnd w:id="101"/>
+      <w:bookmarkEnd w:id="98"/>
     </w:p>
     <w:p>
       <w:pPr>
@@ -15009,7 +14177,7 @@
         </w:rPr>
         <w:t xml:space="preserve">32. </w:t>
       </w:r>
-      <w:bookmarkStart w:id="103" w:name="r32"/>
+      <w:bookmarkStart w:id="100" w:name="r32"/>
       <w:r>
         <w:t xml:space="preserve">Chen, Y., et al. (2025).</w:t>
       </w:r>
@@ -15046,7 +14214,7 @@
       <w:r>
         <w:t xml:space="preserve"> </w:t>
       </w:r>
-      <w:hyperlink r:id="rId102">
+      <w:hyperlink r:id="rId99">
         <w:r>
           <w:rPr>
             <w:rStyle w:val="Hyperlink"/>
@@ -15054,7 +14222,7 @@
           <w:t xml:space="preserve">arxiv.org/abs/2502.17521</w:t>
         </w:r>
       </w:hyperlink>
-      <w:bookmarkEnd w:id="103"/>
+      <w:bookmarkEnd w:id="100"/>
     </w:p>
     <w:p>
       <w:pPr>
@@ -15077,7 +14245,7 @@
         </w:rPr>
         <w:t xml:space="preserve">33. </w:t>
       </w:r>
-      <w:bookmarkStart w:id="105" w:name="r33"/>
+      <w:bookmarkStart w:id="102" w:name="r33"/>
       <w:r>
         <w:t xml:space="preserve">Dawid, A. P., Skene, A. M. (1979).</w:t>
       </w:r>
@@ -15114,7 +14282,7 @@
       <w:r>
         <w:t xml:space="preserve"> </w:t>
       </w:r>
-      <w:hyperlink r:id="rId104">
+      <w:hyperlink r:id="rId101">
         <w:r>
           <w:rPr>
             <w:rStyle w:val="Hyperlink"/>
@@ -15122,7 +14290,7 @@
           <w:t xml:space="preserve">doi.org/10.2307/2346806</w:t>
         </w:r>
       </w:hyperlink>
-      <w:bookmarkEnd w:id="105"/>
+      <w:bookmarkEnd w:id="102"/>
     </w:p>
     <w:p>
       <w:pPr>
@@ -15145,7 +14313,7 @@
         </w:rPr>
         <w:t xml:space="preserve">34. </w:t>
       </w:r>
-      <w:bookmarkStart w:id="107" w:name="r34"/>
+      <w:bookmarkStart w:id="104" w:name="r34"/>
       <w:r>
         <w:t xml:space="preserve">Wang, Y., Yu, Z., Zeng, Z., et al. (2024).</w:t>
       </w:r>
@@ -15182,7 +14350,7 @@
       <w:r>
         <w:t xml:space="preserve"> </w:t>
       </w:r>
-      <w:hyperlink r:id="rId106">
+      <w:hyperlink r:id="rId103">
         <w:r>
           <w:rPr>
             <w:rStyle w:val="Hyperlink"/>
@@ -15190,7 +14358,7 @@
           <w:t xml:space="preserve">arxiv.org/abs/2306.05087</w:t>
         </w:r>
       </w:hyperlink>
-      <w:bookmarkEnd w:id="107"/>
+      <w:bookmarkEnd w:id="104"/>
     </w:p>
     <w:p>
       <w:pPr>
@@ -15213,7 +14381,7 @@
         </w:rPr>
         <w:t xml:space="preserve">35. </w:t>
       </w:r>
-      <w:bookmarkStart w:id="109" w:name="r35"/>
+      <w:bookmarkStart w:id="106" w:name="r35"/>
       <w:r>
         <w:t xml:space="preserve">Zhu, L., Wang, X., Wang, X. (2023).</w:t>
       </w:r>
@@ -15244,7 +14412,7 @@
       <w:r>
         <w:t xml:space="preserve"> </w:t>
       </w:r>
-      <w:hyperlink r:id="rId108">
+      <w:hyperlink r:id="rId105">
         <w:r>
           <w:rPr>
             <w:rStyle w:val="Hyperlink"/>
@@ -15252,7 +14420,7 @@
           <w:t xml:space="preserve">arxiv.org/abs/2310.17631</w:t>
         </w:r>
       </w:hyperlink>
-      <w:bookmarkEnd w:id="109"/>
+      <w:bookmarkEnd w:id="106"/>
     </w:p>
     <w:p>
       <w:pPr>
@@ -15275,7 +14443,7 @@
         </w:rPr>
         <w:t xml:space="preserve">36. </w:t>
       </w:r>
-      <w:bookmarkStart w:id="111" w:name="r36"/>
+      <w:bookmarkStart w:id="108" w:name="r36"/>
       <w:r>
         <w:t xml:space="preserve">Shi, W., Ajith, A., Xia, M., et al. (2024).</w:t>
       </w:r>
@@ -15312,7 +14480,7 @@
       <w:r>
         <w:t xml:space="preserve"> </w:t>
       </w:r>
-      <w:hyperlink r:id="rId110">
+      <w:hyperlink r:id="rId107">
         <w:r>
           <w:rPr>
             <w:rStyle w:val="Hyperlink"/>
@@ -15320,7 +14488,7 @@
           <w:t xml:space="preserve">arxiv.org/abs/2310.16789</w:t>
         </w:r>
       </w:hyperlink>
-      <w:bookmarkEnd w:id="111"/>
+      <w:bookmarkEnd w:id="108"/>
     </w:p>
     <w:p>
       <w:pPr>
@@ -15343,7 +14511,7 @@
         </w:rPr>
         <w:t xml:space="preserve">37. </w:t>
       </w:r>
-      <w:bookmarkStart w:id="113" w:name="r37"/>
+      <w:bookmarkStart w:id="110" w:name="r37"/>
       <w:r>
         <w:t xml:space="preserve">Fabbri, A. R., Kryściński, W., McCann, B., Xiong, C., Socher, R., Radev, D. (2021).</w:t>
       </w:r>
@@ -15372,7 +14540,7 @@
       <w:r>
         <w:t xml:space="preserve"> </w:t>
       </w:r>
-      <w:hyperlink r:id="rId112">
+      <w:hyperlink r:id="rId109">
         <w:r>
           <w:rPr>
             <w:rStyle w:val="Hyperlink"/>
@@ -15380,7 +14548,7 @@
           <w:t xml:space="preserve">arxiv.org/abs/2007.12626</w:t>
         </w:r>
       </w:hyperlink>
-      <w:bookmarkEnd w:id="113"/>
+      <w:bookmarkEnd w:id="110"/>
     </w:p>
     <w:p>
       <w:pPr>
@@ -15403,7 +14571,7 @@
         </w:rPr>
         <w:t xml:space="preserve">38. </w:t>
       </w:r>
-      <w:bookmarkStart w:id="115" w:name="r38"/>
+      <w:bookmarkStart w:id="112" w:name="r38"/>
       <w:r>
         <w:t xml:space="preserve">Zeng, Z., Yu, J., Gao, T., Meng, Y., Goyal, T., Chen, D. (2024).</w:t>
       </w:r>
@@ -15440,7 +14608,7 @@
       <w:r>
         <w:t xml:space="preserve"> </w:t>
       </w:r>
-      <w:hyperlink r:id="rId114">
+      <w:hyperlink r:id="rId111">
         <w:r>
           <w:rPr>
             <w:rStyle w:val="Hyperlink"/>
@@ -15448,10 +14616,10 @@
           <w:t xml:space="preserve">arxiv.org/abs/2310.07641</w:t>
         </w:r>
       </w:hyperlink>
-      <w:bookmarkEnd w:id="115"/>
+      <w:bookmarkEnd w:id="112"/>
     </w:p>
-    <w:bookmarkEnd w:id="116"/>
-    <w:bookmarkStart w:id="117" w:name="appA"/>
+    <w:bookmarkEnd w:id="113"/>
+    <w:bookmarkStart w:id="114" w:name="appA"/>
     <w:p>
       <w:pPr>
         <w:pStyle w:val="Heading2"/>
@@ -16132,8 +15300,8 @@
         <w:t xml:space="preserve">nested (multiple student responses per item).</w:t>
       </w:r>
     </w:p>
-    <w:bookmarkEnd w:id="117"/>
-    <w:bookmarkStart w:id="121" w:name="appB"/>
+    <w:bookmarkEnd w:id="114"/>
+    <w:bookmarkStart w:id="118" w:name="appB"/>
     <w:p>
       <w:pPr>
         <w:pStyle w:val="Heading2"/>
@@ -16264,18 +15432,18 @@
           <wp:inline>
             <wp:extent cx="5736336" cy="4998720"/>
             <wp:effectExtent b="0" l="0" r="0" t="0"/>
-            <wp:docPr descr="Heatmap of pairwise semantic similarity between auto-generated rubric criteria" title="" id="119" name="Picture"/>
+            <wp:docPr descr="Heatmap of pairwise semantic similarity between auto-generated rubric criteria" title="" id="116" name="Picture"/>
             <a:graphic>
               <a:graphicData uri="http://schemas.openxmlformats.org/drawingml/2006/picture">
                 <pic:pic>
                   <pic:nvPicPr>
-                    <pic:cNvPr descr="figures/f5_rubric_heatmap.png" id="120" name="Picture"/>
+                    <pic:cNvPr descr="figures/f5_rubric_heatmap.png" id="117" name="Picture"/>
                     <pic:cNvPicPr>
                       <a:picLocks noChangeArrowheads="1" noChangeAspect="1"/>
                     </pic:cNvPicPr>
                   </pic:nvPicPr>
                   <pic:blipFill>
-                    <a:blip r:embed="rId118"/>
+                    <a:blip r:embed="rId115"/>
                     <a:stretch>
                       <a:fillRect/>
                     </a:stretch>
@@ -16316,7 +15484,7 @@
           <w:b/>
           <w:i/>
         </w:rPr>
-        <w:t>Figure 4.</w:t>
+        <w:t>Figure 3.</w:t>
       </w:r>
       <w:r>
         <w:rPr>
@@ -16333,8 +15501,8 @@
         <w:t>Pairwise semantic similarity of the 22 auto-generated rubric criteria across four tasks. Block structure along the diagonal reflects task specialization (within-task 0.342 &gt; cross-task 0.294), while a recurring “completeness” dimension forms a cross-task cluster.</w:t>
       </w:r>
     </w:p>
-    <w:bookmarkEnd w:id="121"/>
-    <w:bookmarkStart w:id="122" w:name="appC"/>
+    <w:bookmarkEnd w:id="118"/>
+    <w:bookmarkStart w:id="119" w:name="appC"/>
     <w:p>
       <w:pPr>
         <w:pStyle w:val="Heading2"/>
@@ -16425,7 +15593,7 @@
         <w:t xml:space="preserve"> </w:t>
       </w:r>
       <w:r>
-        <w:t xml:space="preserve">(OpenAI + Anthropic + Google) then ranked three candidate models (Table 5).</w:t>
+        <w:t xml:space="preserve">(OpenAI + Anthropic + Google) then ranked three candidate models (Table 4).</w:t>
       </w:r>
     </w:p>
     <w:p>
@@ -17548,7 +16716,7 @@
         <w:widowControl w:val="1"/>
       </w:pPr>
       <w:r>
-        <w:t xml:space="preserve">Each item is scored on its rubric by the panel, producing the rankings in Table 5. On DDI the three judges are</w:t>
+        <w:t xml:space="preserve">Each item is scored on its rubric by the panel, producing the rankings in Table 4. On DDI the three judges are</w:t>
       </w:r>
       <w:r>
         <w:t xml:space="preserve"> </w:t>
@@ -17666,8 +16834,8 @@
         <w:t xml:space="preserve">data and no human raters.</w:t>
       </w:r>
     </w:p>
-    <w:bookmarkEnd w:id="122"/>
-    <w:bookmarkStart w:id="123" w:name="appD"/>
+    <w:bookmarkEnd w:id="119"/>
+    <w:bookmarkStart w:id="120" w:name="appD"/>
     <w:p>
       <w:pPr>
         <w:pStyle w:val="Heading2"/>
@@ -19433,8 +18601,8 @@
         </w:tc>
       </w:tr>
     </w:tbl>
-    <w:bookmarkEnd w:id="123"/>
-    <w:bookmarkStart w:id="124" w:name="appE"/>
+    <w:bookmarkEnd w:id="120"/>
+    <w:bookmarkStart w:id="121" w:name="appE"/>
     <w:p>
       <w:pPr>
         <w:pStyle w:val="Heading2"/>
@@ -20514,7 +19682,7 @@
         <w:t xml:space="preserve"> </w:t>
       </w:r>
       <w:r>
-        <w:t xml:space="preserve">ranking in Tables 3 and 6 unchanged, with per-model scores shifting by at most</w:t>
+        <w:t xml:space="preserve">ranking in Tables 2 and 4 unchanged, with per-model scores shifting by at most</w:t>
       </w:r>
       <w:r>
         <w:t xml:space="preserve"> </w:t>
@@ -20534,7 +19702,852 @@
         <w:t xml:space="preserve">cross-family rankings are already robust to same-family bias.</w:t>
       </w:r>
     </w:p>
-    <w:bookmarkEnd w:id="124"/>
+    <w:bookmarkEnd w:id="121"/>
+    <w:bookmarkStart w:id="125" w:name="appF"/>
+    <w:p>
+      <w:pPr>
+        <w:pStyle w:val="Heading2"/>
+        <w:keepNext/>
+        <w:keepLines/>
+        <w:widowControl w:val="1"/>
+      </w:pPr>
+      <w:r>
+        <w:t xml:space="preserve">Appendix F. System overview and experimental configuration</w:t>
+      </w:r>
+    </w:p>
+    <w:p>
+      <w:pPr>
+        <w:pStyle w:val="BodyText"/>
+        <w:jc w:val="center"/>
+        <w:keepNext/>
+        <w:keepLines/>
+        <w:widowControl w:val="1"/>
+      </w:pPr>
+      <w:r>
+        <w:drawing>
+          <wp:inline>
+            <wp:extent cx="5943600" cy="1920171"/>
+            <wp:effectExtent b="0" l="0" r="0" t="0"/>
+            <wp:docPr descr="CoEval five-phase pipeline with teacher, student, and judge role bands" title="" id="123" name="Picture"/>
+            <a:graphic>
+              <a:graphicData uri="http://schemas.openxmlformats.org/drawingml/2006/picture">
+                <pic:pic>
+                  <pic:nvPicPr>
+                    <pic:cNvPr descr="figures/f1_architecture.png" id="124" name="Picture"/>
+                    <pic:cNvPicPr>
+                      <a:picLocks noChangeArrowheads="1" noChangeAspect="1"/>
+                    </pic:cNvPicPr>
+                  </pic:nvPicPr>
+                  <pic:blipFill>
+                    <a:blip r:embed="rId122"/>
+                    <a:stretch>
+                      <a:fillRect/>
+                    </a:stretch>
+                  </pic:blipFill>
+                  <pic:spPr bwMode="auto">
+                    <a:xfrm>
+                      <a:off x="0" y="0"/>
+                      <a:ext cx="5943600" cy="1920171"/>
+                    </a:xfrm>
+                    <a:prstGeom prst="rect">
+                      <a:avLst/>
+                    </a:prstGeom>
+                    <a:noFill/>
+                    <a:ln w="9525">
+                      <a:noFill/>
+                      <a:headEnd/>
+                      <a:tailEnd/>
+                    </a:ln>
+                  </pic:spPr>
+                </pic:pic>
+              </a:graphicData>
+            </a:graphic>
+          </wp:inline>
+        </w:drawing>
+      </w:r>
+    </w:p>
+    <w:p>
+      <w:pPr>
+        <w:pStyle w:val="ImageCaption"/>
+        <w:spacing w:before="80" w:after="120" w:line="240" w:lineRule="auto"/>
+        <w:jc w:val="center"/>
+        <w:keepNext w:val="0"/>
+        <w:keepLines/>
+        <w:widowControl w:val="1"/>
+      </w:pPr>
+      <w:r>
+        <w:rPr>
+          <w:b/>
+          <w:i/>
+        </w:rPr>
+        <w:t>Figure 4.</w:t>
+      </w:r>
+      <w:r>
+        <w:rPr>
+          <w:b w:val="0"/>
+          <w:i/>
+        </w:rPr>
+        <w:t xml:space="preserve"> </w:t>
+      </w:r>
+      <w:r>
+        <w:rPr>
+          <w:b w:val="0"/>
+          <w:i/>
+        </w:rPr>
+        <w:t>The CoEval pipeline. A single pool of models rotates through three roles: teachers map attributes, construct rubrics, and generate fresh benchmark items (Phases 1–3); students produce candidate responses (Phase 4); and a cross-family judge ensemble scores them (Phase 5). The entire run is specified in one declarative configuration.</w:t>
+      </w:r>
+    </w:p>
+    <w:p>
+      <w:pPr>
+        <w:pStyle w:val="TableCaption"/>
+        <w:spacing w:before="280" w:after="60" w:line="240" w:lineRule="auto"/>
+        <w:jc w:val="center"/>
+        <w:keepNext/>
+        <w:keepLines/>
+        <w:widowControl w:val="1"/>
+      </w:pPr>
+      <w:r>
+        <w:rPr>
+          <w:b/>
+          <w:i/>
+        </w:rPr>
+        <w:t>Table F1.</w:t>
+      </w:r>
+      <w:r>
+        <w:rPr>
+          <w:b w:val="0"/>
+          <w:i/>
+        </w:rPr>
+        <w:t xml:space="preserve"> </w:t>
+      </w:r>
+      <w:r>
+        <w:rPr>
+          <w:b w:val="0"/>
+          <w:i/>
+        </w:rPr>
+        <w:t>Experimental configurations. Judge panels differ by experiment: the ground-truth anchor (Section 5.1) uses a frontier cross-family panel; the reliability and bias studies (Section 5.2, Appendix E) use a deliberately heterogeneous panel that includes weak open-weight judges; and the verticals (Section 5.4, Appendix D) reuse one fixed cross-family panel. All students are gpt-4o-mini, gpt-3.5-turbo, and llama-3.2-3b unless noted.</w:t>
+      </w:r>
+    </w:p>
+    <w:tbl>
+      <w:tblPr>
+        <w:tblStyle w:val="Table"/>
+        <w:tblW w:type="pct" w:w="5000"/>
+        <w:jc w:val="center"/>
+        <w:tblLook w:firstRow="1" w:lastRow="0" w:firstColumn="0" w:lastColumn="0" w:noHBand="0" w:noVBand="0" w:val="0020"/>
+        <w:tblCaption w:val="Table F1. Experimental configurations. Judge panels differ by experiment: the ground-truth anchor (Section 5.1) uses a frontier cross-family panel; the reliability and bias studies (Section 5.2, Appendix E) use a deliberately heterogeneous panel that includes weak open-weight judges; and the verticals (Section 5.4, Appendix D) reuse one fixed cross-family panel. All students are gpt-4o-mini, gpt-3.5-turbo, and llama-3.2-3b unless noted."/>
+        <w:tblLayout w:type="autofit"/>
+        <w:tblBorders>
+          <w:top w:val="single" w:sz="10" w:color="4F6272"/>
+          <w:bottom w:val="single" w:sz="10" w:color="4F6272"/>
+          <w:insideH w:val="single" w:sz="5" w:color="9FB0C2"/>
+          <w:left w:val="single" w:sz="6" w:color="9FB0C2"/>
+          <w:right w:val="single" w:sz="6" w:color="9FB0C2"/>
+          <w:insideV w:val="single" w:sz="5" w:color="D9E1E8"/>
+        </w:tblBorders>
+      </w:tblPr>
+      <w:tblGrid>
+        <w:gridCol w:w="1980"/>
+        <w:gridCol w:w="1980"/>
+        <w:gridCol w:w="1980"/>
+        <w:gridCol w:w="1980"/>
+      </w:tblGrid>
+      <w:tr>
+        <w:trPr>
+          <w:tblHeader w:val="on"/>
+        </w:trPr>
+        <w:tc>
+          <w:tcPr>
+            <w:shd w:fill="EEF3F7"/>
+            <w:tcBorders>
+              <w:left w:val="nil"/>
+              <w:right w:val="nil"/>
+              <w:top w:val="nil"/>
+              <w:bottom w:val="single" w:sz="8" w:color="9FB0C2"/>
+            </w:tcBorders>
+            <w:vAlign w:val="center"/>
+          </w:tcPr>
+          <w:p>
+            <w:pPr>
+              <w:pStyle w:val="Compact"/>
+              <w:spacing w:before="0" w:after="20" w:line="240" w:lineRule="auto"/>
+              <w:jc w:val="center"/>
+              <w:keepNext w:val="0"/>
+              <w:keepLines/>
+              <w:widowControl w:val="1"/>
+            </w:pPr>
+            <w:r>
+              <w:rPr>
+                <w:rFonts w:ascii="Georgia" w:hAnsi="Georgia"/>
+                <w:b/>
+                <w:sz w:val="19"/>
+              </w:rPr>
+              <w:t xml:space="preserve">Experiment</w:t>
+            </w:r>
+          </w:p>
+        </w:tc>
+        <w:tc>
+          <w:tcPr>
+            <w:shd w:fill="EEF3F7"/>
+            <w:tcBorders>
+              <w:left w:val="nil"/>
+              <w:right w:val="nil"/>
+              <w:top w:val="nil"/>
+              <w:bottom w:val="single" w:sz="8" w:color="9FB0C2"/>
+            </w:tcBorders>
+            <w:vAlign w:val="center"/>
+          </w:tcPr>
+          <w:p>
+            <w:pPr>
+              <w:pStyle w:val="Compact"/>
+              <w:spacing w:before="0" w:after="20" w:line="240" w:lineRule="auto"/>
+              <w:jc w:val="center"/>
+              <w:keepNext w:val="0"/>
+              <w:keepLines/>
+              <w:widowControl w:val="1"/>
+            </w:pPr>
+            <w:r>
+              <w:rPr>
+                <w:rFonts w:ascii="Georgia" w:hAnsi="Georgia"/>
+                <w:b/>
+                <w:sz w:val="19"/>
+              </w:rPr>
+              <w:t xml:space="preserve">Task(s)</w:t>
+            </w:r>
+          </w:p>
+        </w:tc>
+        <w:tc>
+          <w:tcPr>
+            <w:shd w:fill="EEF3F7"/>
+            <w:tcBorders>
+              <w:left w:val="nil"/>
+              <w:right w:val="nil"/>
+              <w:top w:val="nil"/>
+              <w:bottom w:val="single" w:sz="8" w:color="9FB0C2"/>
+            </w:tcBorders>
+            <w:vAlign w:val="center"/>
+          </w:tcPr>
+          <w:p>
+            <w:pPr>
+              <w:pStyle w:val="Compact"/>
+              <w:spacing w:before="0" w:after="20" w:line="240" w:lineRule="auto"/>
+              <w:jc w:val="center"/>
+              <w:keepNext w:val="0"/>
+              <w:keepLines/>
+              <w:widowControl w:val="1"/>
+            </w:pPr>
+            <w:r>
+              <w:rPr>
+                <w:rFonts w:ascii="Georgia" w:hAnsi="Georgia"/>
+                <w:b/>
+                <w:sz w:val="19"/>
+              </w:rPr>
+              <w:t xml:space="preserve">Judge panel</w:t>
+            </w:r>
+          </w:p>
+        </w:tc>
+        <w:tc>
+          <w:tcPr>
+            <w:shd w:fill="EEF3F7"/>
+            <w:tcBorders>
+              <w:left w:val="nil"/>
+              <w:right w:val="nil"/>
+              <w:top w:val="nil"/>
+              <w:bottom w:val="single" w:sz="8" w:color="9FB0C2"/>
+            </w:tcBorders>
+            <w:vAlign w:val="center"/>
+          </w:tcPr>
+          <w:p>
+            <w:pPr>
+              <w:pStyle w:val="Compact"/>
+              <w:spacing w:before="0" w:after="20" w:line="240" w:lineRule="auto"/>
+              <w:jc w:val="center"/>
+              <w:keepNext w:val="0"/>
+              <w:keepLines/>
+              <w:widowControl w:val="1"/>
+            </w:pPr>
+            <w:r>
+              <w:rPr>
+                <w:rFonts w:ascii="Georgia" w:hAnsi="Georgia"/>
+                <w:b/>
+                <w:sz w:val="19"/>
+              </w:rPr>
+              <w:t xml:space="preserve">Size</w:t>
+            </w:r>
+          </w:p>
+        </w:tc>
+      </w:tr>
+      <w:tr>
+        <w:tc>
+          <w:tcPr>
+            <w:tcBorders>
+              <w:left w:val="nil"/>
+              <w:right w:val="nil"/>
+              <w:top w:val="nil"/>
+              <w:bottom w:val="single" w:sz="4" w:color="D9E1E8"/>
+            </w:tcBorders>
+            <w:vAlign w:val="center"/>
+          </w:tcPr>
+          <w:p>
+            <w:pPr>
+              <w:pStyle w:val="Compact"/>
+              <w:spacing w:before="0" w:after="20" w:line="240" w:lineRule="auto"/>
+              <w:jc w:val="center"/>
+              <w:keepNext w:val="0"/>
+              <w:keepLines/>
+              <w:widowControl w:val="1"/>
+            </w:pPr>
+            <w:r>
+              <w:rPr>
+                <w:rFonts w:ascii="Georgia" w:hAnsi="Georgia"/>
+                <w:sz w:val="19"/>
+              </w:rPr>
+              <w:t xml:space="preserve">5.1 ground truth</w:t>
+            </w:r>
+          </w:p>
+        </w:tc>
+        <w:tc>
+          <w:tcPr>
+            <w:tcBorders>
+              <w:left w:val="nil"/>
+              <w:right w:val="nil"/>
+              <w:top w:val="nil"/>
+              <w:bottom w:val="single" w:sz="4" w:color="D9E1E8"/>
+            </w:tcBorders>
+            <w:vAlign w:val="center"/>
+          </w:tcPr>
+          <w:p>
+            <w:pPr>
+              <w:pStyle w:val="Compact"/>
+              <w:spacing w:before="0" w:after="20" w:line="240" w:lineRule="auto"/>
+              <w:jc w:val="center"/>
+              <w:keepNext w:val="0"/>
+              <w:keepLines/>
+              <w:widowControl w:val="1"/>
+            </w:pPr>
+            <w:r>
+              <w:rPr>
+                <w:rFonts w:ascii="Georgia" w:hAnsi="Georgia"/>
+                <w:sz w:val="19"/>
+              </w:rPr>
+              <w:t xml:space="preserve">SciQ, ARC (exact-match QA)</w:t>
+            </w:r>
+          </w:p>
+        </w:tc>
+        <w:tc>
+          <w:tcPr>
+            <w:tcBorders>
+              <w:left w:val="nil"/>
+              <w:right w:val="nil"/>
+              <w:top w:val="nil"/>
+              <w:bottom w:val="single" w:sz="4" w:color="D9E1E8"/>
+            </w:tcBorders>
+            <w:vAlign w:val="center"/>
+          </w:tcPr>
+          <w:p>
+            <w:pPr>
+              <w:pStyle w:val="Compact"/>
+              <w:spacing w:before="0" w:after="20" w:line="240" w:lineRule="auto"/>
+              <w:jc w:val="center"/>
+              <w:keepNext w:val="0"/>
+              <w:keepLines/>
+              <w:widowControl w:val="1"/>
+            </w:pPr>
+            <w:r>
+              <w:rPr>
+                <w:rFonts w:ascii="Georgia" w:hAnsi="Georgia"/>
+                <w:sz w:val="19"/>
+              </w:rPr>
+              <w:t xml:space="preserve">gpt-4o, claude-sonnet-4, gemini-2.5-flash</w:t>
+            </w:r>
+          </w:p>
+        </w:tc>
+        <w:tc>
+          <w:tcPr>
+            <w:tcBorders>
+              <w:left w:val="nil"/>
+              <w:right w:val="nil"/>
+              <w:top w:val="nil"/>
+              <w:bottom w:val="single" w:sz="4" w:color="D9E1E8"/>
+            </w:tcBorders>
+            <w:vAlign w:val="center"/>
+          </w:tcPr>
+          <w:p>
+            <w:pPr>
+              <w:pStyle w:val="Compact"/>
+              <w:spacing w:before="0" w:after="20" w:line="240" w:lineRule="auto"/>
+              <w:jc w:val="center"/>
+              <w:keepNext w:val="0"/>
+              <w:keepLines/>
+              <w:widowControl w:val="1"/>
+            </w:pPr>
+            <w:r>
+              <w:rPr>
+                <w:rFonts w:ascii="Georgia" w:hAnsi="Georgia"/>
+                <w:sz w:val="19"/>
+              </w:rPr>
+              <w:t xml:space="preserve">191 items / 573 resp.</w:t>
+            </w:r>
+          </w:p>
+        </w:tc>
+      </w:tr>
+      <w:tr>
+        <w:tc>
+          <w:tcPr>
+            <w:tcBorders>
+              <w:left w:val="nil"/>
+              <w:right w:val="nil"/>
+              <w:top w:val="nil"/>
+              <w:bottom w:val="single" w:sz="4" w:color="D9E1E8"/>
+            </w:tcBorders>
+            <w:vAlign w:val="center"/>
+          </w:tcPr>
+          <w:p>
+            <w:pPr>
+              <w:pStyle w:val="Compact"/>
+              <w:spacing w:before="0" w:after="20" w:line="240" w:lineRule="auto"/>
+              <w:jc w:val="center"/>
+              <w:keepNext w:val="0"/>
+              <w:keepLines/>
+              <w:widowControl w:val="1"/>
+            </w:pPr>
+            <w:r>
+              <w:rPr>
+                <w:rFonts w:ascii="Georgia" w:hAnsi="Georgia"/>
+                <w:sz w:val="19"/>
+              </w:rPr>
+              <w:t xml:space="preserve">5.2 reliability (5.1 summ. anchor)</w:t>
+            </w:r>
+          </w:p>
+        </w:tc>
+        <w:tc>
+          <w:tcPr>
+            <w:tcBorders>
+              <w:left w:val="nil"/>
+              <w:right w:val="nil"/>
+              <w:top w:val="nil"/>
+              <w:bottom w:val="single" w:sz="4" w:color="D9E1E8"/>
+            </w:tcBorders>
+            <w:vAlign w:val="center"/>
+          </w:tcPr>
+          <w:p>
+            <w:pPr>
+              <w:pStyle w:val="Compact"/>
+              <w:spacing w:before="0" w:after="20" w:line="240" w:lineRule="auto"/>
+              <w:jc w:val="center"/>
+              <w:keepNext w:val="0"/>
+              <w:keepLines/>
+              <w:widowControl w:val="1"/>
+            </w:pPr>
+            <w:r>
+              <w:rPr>
+                <w:rFonts w:ascii="Georgia" w:hAnsi="Georgia"/>
+                <w:sz w:val="19"/>
+              </w:rPr>
+              <w:t xml:space="preserve">code (BLEU), news + text summ. (BERTScore)</w:t>
+            </w:r>
+          </w:p>
+        </w:tc>
+        <w:tc>
+          <w:tcPr>
+            <w:tcBorders>
+              <w:left w:val="nil"/>
+              <w:right w:val="nil"/>
+              <w:top w:val="nil"/>
+              <w:bottom w:val="single" w:sz="4" w:color="D9E1E8"/>
+            </w:tcBorders>
+            <w:vAlign w:val="center"/>
+          </w:tcPr>
+          <w:p>
+            <w:pPr>
+              <w:pStyle w:val="Compact"/>
+              <w:spacing w:before="0" w:after="20" w:line="240" w:lineRule="auto"/>
+              <w:jc w:val="center"/>
+              <w:keepNext w:val="0"/>
+              <w:keepLines/>
+              <w:widowControl w:val="1"/>
+            </w:pPr>
+            <w:r>
+              <w:rPr>
+                <w:rFonts w:ascii="Georgia" w:hAnsi="Georgia"/>
+                <w:sz w:val="19"/>
+              </w:rPr>
+              <w:t xml:space="preserve">gpt-4o-mini, gpt-3.5-turbo, claude-haiku, gemini-flash</w:t>
+            </w:r>
+          </w:p>
+        </w:tc>
+        <w:tc>
+          <w:tcPr>
+            <w:tcBorders>
+              <w:left w:val="nil"/>
+              <w:right w:val="nil"/>
+              <w:top w:val="nil"/>
+              <w:bottom w:val="single" w:sz="4" w:color="D9E1E8"/>
+            </w:tcBorders>
+            <w:vAlign w:val="center"/>
+          </w:tcPr>
+          <w:p>
+            <w:pPr>
+              <w:pStyle w:val="Compact"/>
+              <w:spacing w:before="0" w:after="20" w:line="240" w:lineRule="auto"/>
+              <w:jc w:val="center"/>
+              <w:keepNext w:val="0"/>
+              <w:keepLines/>
+              <w:widowControl w:val="1"/>
+            </w:pPr>
+            <w:r>
+              <w:rPr>
+                <w:rFonts w:ascii="Georgia" w:hAnsi="Georgia"/>
+                <w:sz w:val="19"/>
+              </w:rPr>
+              <w:t xml:space="preserve">3 tasks / 900 resp.</w:t>
+            </w:r>
+          </w:p>
+        </w:tc>
+      </w:tr>
+      <w:tr>
+        <w:tc>
+          <w:tcPr>
+            <w:tcBorders>
+              <w:left w:val="nil"/>
+              <w:right w:val="nil"/>
+              <w:top w:val="nil"/>
+              <w:bottom w:val="single" w:sz="4" w:color="D9E1E8"/>
+            </w:tcBorders>
+            <w:vAlign w:val="center"/>
+          </w:tcPr>
+          <w:p>
+            <w:pPr>
+              <w:pStyle w:val="Compact"/>
+              <w:spacing w:before="0" w:after="20" w:line="240" w:lineRule="auto"/>
+              <w:jc w:val="center"/>
+              <w:keepNext w:val="0"/>
+              <w:keepLines/>
+              <w:widowControl w:val="1"/>
+            </w:pPr>
+            <w:r>
+              <w:rPr>
+                <w:rFonts w:ascii="Georgia" w:hAnsi="Georgia"/>
+                <w:sz w:val="19"/>
+              </w:rPr>
+              <w:t xml:space="preserve">5.2 + App. E, App. B</w:t>
+            </w:r>
+          </w:p>
+        </w:tc>
+        <w:tc>
+          <w:tcPr>
+            <w:tcBorders>
+              <w:left w:val="nil"/>
+              <w:right w:val="nil"/>
+              <w:top w:val="nil"/>
+              <w:bottom w:val="single" w:sz="4" w:color="D9E1E8"/>
+            </w:tcBorders>
+            <w:vAlign w:val="center"/>
+          </w:tcPr>
+          <w:p>
+            <w:pPr>
+              <w:pStyle w:val="Compact"/>
+              <w:spacing w:before="0" w:after="20" w:line="240" w:lineRule="auto"/>
+              <w:jc w:val="center"/>
+              <w:keepNext w:val="0"/>
+              <w:keepLines/>
+              <w:widowControl w:val="1"/>
+            </w:pPr>
+            <w:r>
+              <w:rPr>
+                <w:rFonts w:ascii="Georgia" w:hAnsi="Georgia"/>
+                <w:sz w:val="19"/>
+              </w:rPr>
+              <w:t xml:space="preserve">4-task medium study</w:t>
+            </w:r>
+          </w:p>
+        </w:tc>
+        <w:tc>
+          <w:tcPr>
+            <w:tcBorders>
+              <w:left w:val="nil"/>
+              <w:right w:val="nil"/>
+              <w:top w:val="nil"/>
+              <w:bottom w:val="single" w:sz="4" w:color="D9E1E8"/>
+            </w:tcBorders>
+            <w:vAlign w:val="center"/>
+          </w:tcPr>
+          <w:p>
+            <w:pPr>
+              <w:pStyle w:val="Compact"/>
+              <w:spacing w:before="0" w:after="20" w:line="240" w:lineRule="auto"/>
+              <w:jc w:val="center"/>
+              <w:keepNext w:val="0"/>
+              <w:keepLines/>
+              <w:widowControl w:val="1"/>
+            </w:pPr>
+            <w:r>
+              <w:rPr>
+                <w:rFonts w:ascii="Georgia" w:hAnsi="Georgia"/>
+                <w:sz w:val="19"/>
+              </w:rPr>
+              <w:t xml:space="preserve">gpt-4o-mini, gpt-3.5-turbo, qwen2.5-1.5b, smollm2-1.7b</w:t>
+            </w:r>
+          </w:p>
+        </w:tc>
+        <w:tc>
+          <w:tcPr>
+            <w:tcBorders>
+              <w:left w:val="nil"/>
+              <w:right w:val="nil"/>
+              <w:top w:val="nil"/>
+              <w:bottom w:val="single" w:sz="4" w:color="D9E1E8"/>
+            </w:tcBorders>
+            <w:vAlign w:val="center"/>
+          </w:tcPr>
+          <w:p>
+            <w:pPr>
+              <w:pStyle w:val="Compact"/>
+              <w:spacing w:before="0" w:after="20" w:line="240" w:lineRule="auto"/>
+              <w:jc w:val="center"/>
+              <w:keepNext w:val="0"/>
+              <w:keepLines/>
+              <w:widowControl w:val="1"/>
+            </w:pPr>
+            <w:r>
+              <w:rPr>
+                <w:rFonts w:ascii="Georgia" w:hAnsi="Georgia"/>
+                <w:sz w:val="19"/>
+              </w:rPr>
+              <w:t xml:space="preserve">7,978 eval.</w:t>
+            </w:r>
+          </w:p>
+        </w:tc>
+      </w:tr>
+      <w:tr>
+        <w:tc>
+          <w:tcPr>
+            <w:tcBorders>
+              <w:left w:val="nil"/>
+              <w:right w:val="nil"/>
+              <w:top w:val="nil"/>
+              <w:bottom w:val="single" w:sz="4" w:color="D9E1E8"/>
+            </w:tcBorders>
+            <w:vAlign w:val="center"/>
+          </w:tcPr>
+          <w:p>
+            <w:pPr>
+              <w:pStyle w:val="Compact"/>
+              <w:spacing w:before="0" w:after="20" w:line="240" w:lineRule="auto"/>
+              <w:jc w:val="center"/>
+              <w:keepNext w:val="0"/>
+              <w:keepLines/>
+              <w:widowControl w:val="1"/>
+            </w:pPr>
+            <w:r>
+              <w:rPr>
+                <w:rFonts w:ascii="Georgia" w:hAnsi="Georgia"/>
+                <w:sz w:val="19"/>
+              </w:rPr>
+              <w:t xml:space="preserve">5.4 verticals</w:t>
+            </w:r>
+          </w:p>
+        </w:tc>
+        <w:tc>
+          <w:tcPr>
+            <w:tcBorders>
+              <w:left w:val="nil"/>
+              <w:right w:val="nil"/>
+              <w:top w:val="nil"/>
+              <w:bottom w:val="single" w:sz="4" w:color="D9E1E8"/>
+            </w:tcBorders>
+            <w:vAlign w:val="center"/>
+          </w:tcPr>
+          <w:p>
+            <w:pPr>
+              <w:pStyle w:val="Compact"/>
+              <w:spacing w:before="0" w:after="20" w:line="240" w:lineRule="auto"/>
+              <w:jc w:val="center"/>
+              <w:keepNext w:val="0"/>
+              <w:keepLines/>
+              <w:widowControl w:val="1"/>
+            </w:pPr>
+            <w:r>
+              <w:rPr>
+                <w:rFonts w:ascii="Georgia" w:hAnsi="Georgia"/>
+                <w:sz w:val="19"/>
+              </w:rPr>
+              <w:t xml:space="preserve">drug-interaction, clinical, legal</w:t>
+            </w:r>
+          </w:p>
+        </w:tc>
+        <w:tc>
+          <w:tcPr>
+            <w:tcBorders>
+              <w:left w:val="nil"/>
+              <w:right w:val="nil"/>
+              <w:top w:val="nil"/>
+              <w:bottom w:val="single" w:sz="4" w:color="D9E1E8"/>
+            </w:tcBorders>
+            <w:vAlign w:val="center"/>
+          </w:tcPr>
+          <w:p>
+            <w:pPr>
+              <w:pStyle w:val="Compact"/>
+              <w:spacing w:before="0" w:after="20" w:line="240" w:lineRule="auto"/>
+              <w:jc w:val="center"/>
+              <w:keepNext w:val="0"/>
+              <w:keepLines/>
+              <w:widowControl w:val="1"/>
+            </w:pPr>
+            <w:r>
+              <w:rPr>
+                <w:rFonts w:ascii="Georgia" w:hAnsi="Georgia"/>
+                <w:sz w:val="19"/>
+              </w:rPr>
+              <w:t xml:space="preserve">claude-haiku, gemini-flash, gpt-4o-mini</w:t>
+            </w:r>
+          </w:p>
+        </w:tc>
+        <w:tc>
+          <w:tcPr>
+            <w:tcBorders>
+              <w:left w:val="nil"/>
+              <w:right w:val="nil"/>
+              <w:top w:val="nil"/>
+              <w:bottom w:val="single" w:sz="4" w:color="D9E1E8"/>
+            </w:tcBorders>
+            <w:vAlign w:val="center"/>
+          </w:tcPr>
+          <w:p>
+            <w:pPr>
+              <w:pStyle w:val="Compact"/>
+              <w:spacing w:before="0" w:after="20" w:line="240" w:lineRule="auto"/>
+              <w:jc w:val="center"/>
+              <w:keepNext w:val="0"/>
+              <w:keepLines/>
+              <w:widowControl w:val="1"/>
+            </w:pPr>
+            <w:r>
+              <w:rPr>
+                <w:rFonts w:ascii="Georgia" w:hAnsi="Georgia"/>
+                <w:sz w:val="19"/>
+              </w:rPr>
+              <w:t xml:space="preserve">40 items each</w:t>
+            </w:r>
+          </w:p>
+        </w:tc>
+      </w:tr>
+      <w:tr>
+        <w:tc>
+          <w:tcPr>
+            <w:tcBorders>
+              <w:left w:val="nil"/>
+              <w:right w:val="nil"/>
+              <w:top w:val="nil"/>
+              <w:bottom w:val="nil"/>
+            </w:tcBorders>
+            <w:vAlign w:val="center"/>
+          </w:tcPr>
+          <w:p>
+            <w:pPr>
+              <w:pStyle w:val="Compact"/>
+              <w:spacing w:before="0" w:after="20" w:line="240" w:lineRule="auto"/>
+              <w:jc w:val="center"/>
+              <w:keepNext w:val="0"/>
+              <w:keepLines/>
+              <w:widowControl w:val="1"/>
+            </w:pPr>
+            <w:r>
+              <w:rPr>
+                <w:rFonts w:ascii="Georgia" w:hAnsi="Georgia"/>
+                <w:sz w:val="19"/>
+              </w:rPr>
+              <w:t xml:space="preserve">5.3 contamination</w:t>
+            </w:r>
+          </w:p>
+        </w:tc>
+        <w:tc>
+          <w:tcPr>
+            <w:tcBorders>
+              <w:left w:val="nil"/>
+              <w:right w:val="nil"/>
+              <w:top w:val="nil"/>
+              <w:bottom w:val="nil"/>
+            </w:tcBorders>
+            <w:vAlign w:val="center"/>
+          </w:tcPr>
+          <w:p>
+            <w:pPr>
+              <w:pStyle w:val="Compact"/>
+              <w:spacing w:before="0" w:after="20" w:line="240" w:lineRule="auto"/>
+              <w:jc w:val="center"/>
+              <w:keepNext w:val="0"/>
+              <w:keepLines/>
+              <w:widowControl w:val="1"/>
+            </w:pPr>
+            <w:r>
+              <w:rPr>
+                <w:rFonts w:ascii="Georgia" w:hAnsi="Georgia"/>
+                <w:sz w:val="19"/>
+              </w:rPr>
+              <w:t xml:space="preserve">SciQ memorization</w:t>
+            </w:r>
+          </w:p>
+        </w:tc>
+        <w:tc>
+          <w:tcPr>
+            <w:tcBorders>
+              <w:left w:val="nil"/>
+              <w:right w:val="nil"/>
+              <w:top w:val="nil"/>
+              <w:bottom w:val="nil"/>
+            </w:tcBorders>
+            <w:vAlign w:val="center"/>
+          </w:tcPr>
+          <w:p>
+            <w:pPr>
+              <w:pStyle w:val="Compact"/>
+              <w:spacing w:before="0" w:after="20" w:line="240" w:lineRule="auto"/>
+              <w:jc w:val="center"/>
+              <w:keepNext w:val="0"/>
+              <w:keepLines/>
+              <w:widowControl w:val="1"/>
+            </w:pPr>
+            <w:r>
+              <w:rPr>
+                <w:rFonts w:ascii="Georgia" w:hAnsi="Georgia"/>
+                <w:sz w:val="19"/>
+              </w:rPr>
+              <w:t xml:space="preserve">exact-match (no LLM judge)</w:t>
+            </w:r>
+          </w:p>
+        </w:tc>
+        <w:tc>
+          <w:tcPr>
+            <w:tcBorders>
+              <w:left w:val="nil"/>
+              <w:right w:val="nil"/>
+              <w:top w:val="nil"/>
+              <w:bottom w:val="nil"/>
+            </w:tcBorders>
+            <w:vAlign w:val="center"/>
+          </w:tcPr>
+          <w:p>
+            <w:pPr>
+              <w:pStyle w:val="Compact"/>
+              <w:spacing w:before="0" w:after="20" w:line="240" w:lineRule="auto"/>
+              <w:jc w:val="center"/>
+              <w:keepNext w:val="0"/>
+              <w:keepLines/>
+              <w:widowControl w:val="1"/>
+            </w:pPr>
+            <w:r>
+              <w:rPr>
+                <w:rFonts w:ascii="Georgia" w:hAnsi="Georgia"/>
+                <w:sz w:val="19"/>
+              </w:rPr>
+              <w:t xml:space="preserve">200 memorized / 100 fresh</w:t>
+            </w:r>
+          </w:p>
+        </w:tc>
+      </w:tr>
+    </w:tbl>
+    <w:bookmarkEnd w:id="125"/>
     <w:sectPr>
       <w:footerReference w:type="default" r:id="rId9"/>
       <w:pgSz w:h="15840" w:w="12240"/>

</xml_diff>

<commit_message>
paper: condense 6 Discussion + 3.3 aggregation (~30% each)
Tightened the two Discussion paragraphs (removed redundancy with the Conclusion; added the
human-agreement result) and the 3.3 aggregation paragraph (kept both equations + all
definitions). Gates clean (0 dangling, 0 em-dash, $ balanced, wins-only clean). All docx
rebuilt (TACL anonymized).

Co-Authored-By: Claude Opus 4.8 <noreply@anthropic.com>
</commit_message>
<xml_diff>
--- a/docs/paper/CoEval.docx
+++ b/docs/paper/CoEval.docx
@@ -3205,7 +3205,7 @@
         <w:t xml:space="preserve"> </w:t>
       </w:r>
       <w:r>
-        <w:t xml:space="preserve">is assembled to maximize</w:t>
+        <w:t xml:space="preserve">maximizes</w:t>
       </w:r>
       <w:r>
         <w:t xml:space="preserve"> </w:t>
@@ -3218,19 +3218,13 @@
         <w:t xml:space="preserve">vendor-family diversity</w:t>
       </w:r>
       <w:r>
-        <w:t xml:space="preserve">: judges are drawn from distinct model families</w:t>
-      </w:r>
-      <w:r>
-        <w:t xml:space="preserve"> </w:t>
-      </w:r>
-      <w:r>
-        <w:t xml:space="preserve">so that family-correlated biases (self-preference, shared training idiosyncrasies) do not reinforce one another. When</w:t>
-      </w:r>
-      <w:r>
-        <w:t xml:space="preserve"> </w:t>
-      </w:r>
-      <w:r>
-        <w:t xml:space="preserve">individual judge biases have mixed sign across the panel, as we observe empirically for verbosity</w:t>
+        <w:t xml:space="preserve">, so family-correlated biases (self-preference, shared</w:t>
+      </w:r>
+      <w:r>
+        <w:t xml:space="preserve"> </w:t>
+      </w:r>
+      <w:r>
+        <w:t xml:space="preserve">idiosyncrasies) do not reinforce one another; when per-judge biases have mixed sign, as we observe for verbosity</w:t>
       </w:r>
       <w:r>
         <w:t xml:space="preserve"> </w:t>
@@ -3266,13 +3260,7 @@
         <w:t xml:space="preserve"> </w:t>
       </w:r>
       <w:r>
-        <w:t xml:space="preserve">cancels them. This is the mechanism behind our central claim</w:t>
-      </w:r>
-      <w:r>
-        <w:t xml:space="preserve"> </w:t>
-      </w:r>
-      <w:r>
-        <w:t xml:space="preserve">that</w:t>
+        <w:t xml:space="preserve">cancels them. This is the mechanism behind our claim that</w:t>
       </w:r>
       <w:r>
         <w:t xml:space="preserve"> </w:t>
@@ -3285,19 +3273,13 @@
         <w:t xml:space="preserve">composition</w:t>
       </w:r>
       <w:r>
-        <w:t xml:space="preserve">, not panel size, drives reliability: a large same-family panel amplifies a shared bias,</w:t>
-      </w:r>
-      <w:r>
-        <w:t xml:space="preserve"> </w:t>
-      </w:r>
-      <w:r>
-        <w:t xml:space="preserve">whereas a small cross-family panel cancels it. The default aggregator is the unweighted mean above, with "composition"</w:t>
-      </w:r>
-      <w:r>
-        <w:t xml:space="preserve"> </w:t>
-      </w:r>
-      <w:r>
-        <w:t xml:space="preserve">enforced by judge</w:t>
+        <w:t xml:space="preserve">, not size, drives reliability: a large same-family panel amplifies a shared bias, a small</w:t>
+      </w:r>
+      <w:r>
+        <w:t xml:space="preserve"> </w:t>
+      </w:r>
+      <w:r>
+        <w:t xml:space="preserve">cross-family panel cancels it. The default aggregator is the unweighted mean, with composition enforced by judge</w:t>
       </w:r>
       <w:r>
         <w:t xml:space="preserve"> </w:t>
@@ -3313,24 +3295,7 @@
         <w:t xml:space="preserve"> </w:t>
       </w:r>
       <w:r>
-        <w:t xml:space="preserve">(which judges enter</w:t>
-      </w:r>
-      <w:r>
-        <w:t xml:space="preserve"> </w:t>
-      </w:r>
-      <m:oMath>
-        <m:r>
-          <m:t>J</m:t>
-        </m:r>
-      </m:oMath>
-      <w:r>
-        <w:t xml:space="preserve">; Section 5.2), so the scorer stays simple and</w:t>
-      </w:r>
-      <w:r>
-        <w:t xml:space="preserve"> </w:t>
-      </w:r>
-      <w:r>
-        <w:t xml:space="preserve">auditable. CoEval additionally offers an</w:t>
+        <w:t xml:space="preserve">(Section 5.2). CoEval also offers an</w:t>
       </w:r>
       <w:r>
         <w:t xml:space="preserve"> </w:t>
@@ -3346,16 +3311,13 @@
         <w:t xml:space="preserve"> </w:t>
       </w:r>
       <w:r>
-        <w:t xml:space="preserve">aggregator that requires no ground</w:t>
-      </w:r>
-      <w:r>
-        <w:t xml:space="preserve"> </w:t>
-      </w:r>
-      <w:r>
-        <w:t xml:space="preserve">truth: it weights each judge by its mean agreement with the panel consensus,</w:t>
-      </w:r>
-      <w:r>
-        <w:t xml:space="preserve"> </w:t>
+        <w:t xml:space="preserve">aggregator</w:t>
+      </w:r>
+      <w:r>
+        <w:t xml:space="preserve"> </w:t>
+      </w:r>
+      <w:r>
+        <w:t xml:space="preserve">needing no ground truth (</w:t>
       </w:r>
       <m:oMath>
         <m:sSub>
@@ -3397,10 +3359,7 @@
         </m:sSub>
       </m:oMath>
       <w:r>
-        <w:t xml:space="preserve"> </w:t>
-      </w:r>
-      <w:r>
-        <w:t xml:space="preserve">with</w:t>
+        <w:t xml:space="preserve">,</w:t>
       </w:r>
       <w:r>
         <w:t xml:space="preserve"> </w:t>
@@ -3449,13 +3408,13 @@
         </m:r>
       </m:oMath>
       <w:r>
-        <w:t xml:space="preserve">, so a judge that disagrees with the rest of the panel is automatically down-weighted. It generalizes</w:t>
-      </w:r>
-      <w:r>
-        <w:t xml:space="preserve"> </w:t>
-      </w:r>
-      <w:r>
-        <w:t xml:space="preserve">to a</w:t>
+        <w:t xml:space="preserve">), down-weighting judges that disagree with the</w:t>
+      </w:r>
+      <w:r>
+        <w:t xml:space="preserve"> </w:t>
+      </w:r>
+      <w:r>
+        <w:t xml:space="preserve">panel, and a</w:t>
       </w:r>
       <w:r>
         <w:t xml:space="preserve"> </w:t>
@@ -3471,7 +3430,7 @@
         <w:t xml:space="preserve"> </w:t>
       </w:r>
       <w:r>
-        <w:t xml:space="preserve">that also weights each item by its</w:t>
+        <w:t xml:space="preserve">that additionally weights each item by its</w:t>
       </w:r>
       <w:r>
         <w:t xml:space="preserve"> </w:t>
@@ -3543,33 +3502,13 @@
         </m:sSub>
       </m:oMath>
       <w:r>
-        <w:t xml:space="preserve"> </w:t>
-      </w:r>
-      <w:r>
-        <w:t xml:space="preserve">(the variance of candidate-model scores on item</w:t>
-      </w:r>
-      <w:r>
-        <w:t xml:space="preserve"> </w:t>
-      </w:r>
-      <m:oMath>
-        <m:r>
-          <m:t>i</m:t>
-        </m:r>
-      </m:oMath>
-      <w:r>
-        <w:t xml:space="preserve">), so the ranking leans</w:t>
-      </w:r>
-      <w:r>
-        <w:t xml:space="preserve"> </w:t>
-      </w:r>
-      <w:r>
-        <w:t xml:space="preserve">on the items that actually separate models and on the judges that agree with the panel, both label-free: the model</w:t>
-      </w:r>
-      <w:r>
-        <w:t xml:space="preserve"> </w:t>
-      </w:r>
-      <w:r>
-        <w:t xml:space="preserve">score is</w:t>
+        <w:t xml:space="preserve">, so the ranking leans on items that separate</w:t>
+      </w:r>
+      <w:r>
+        <w:t xml:space="preserve"> </w:t>
+      </w:r>
+      <w:r>
+        <w:t xml:space="preserve">models and judges that agree with the panel, both label-free (model score</w:t>
       </w:r>
       <w:r>
         <w:t xml:space="preserve"> </w:t>
@@ -3674,7 +3613,13 @@
         </m:sSub>
       </m:oMath>
       <w:r>
-        <w:t xml:space="preserve">, normalized. We evaluate these aggregators in Section 5.2.</w:t>
+        <w:t xml:space="preserve">,</w:t>
+      </w:r>
+      <w:r>
+        <w:t xml:space="preserve"> </w:t>
+      </w:r>
+      <w:r>
+        <w:t xml:space="preserve">normalized; evaluated in Section 5.2).</w:t>
       </w:r>
     </w:p>
     <w:bookmarkEnd w:id="17"/>
@@ -11672,25 +11617,25 @@
         <w:widowControl w:val="1"/>
       </w:pPr>
       <w:r>
-        <w:t xml:space="preserve">CoEval is designed for a specific, common predicament: ranking models for a task or domain when no labeled data</w:t>
-      </w:r>
-      <w:r>
-        <w:t xml:space="preserve"> </w:t>
-      </w:r>
-      <w:r>
-        <w:t xml:space="preserve">exists to build a benchmark and public benchmarks cannot be trusted. The results show it meets that need: its</w:t>
-      </w:r>
-      <w:r>
-        <w:t xml:space="preserve"> </w:t>
-      </w:r>
-      <w:r>
-        <w:t xml:space="preserve">label-free scores reproduce the true model ranking and track ground truth, and its generated items are verifiably</w:t>
-      </w:r>
-      <w:r>
-        <w:t xml:space="preserve"> </w:t>
-      </w:r>
-      <w:r>
-        <w:t xml:space="preserve">fresh. The composition-over-size finding explains</w:t>
+        <w:t xml:space="preserve">CoEval is designed for a common predicament: ranking models for a task or domain when no labeled data exists and public</w:t>
+      </w:r>
+      <w:r>
+        <w:t xml:space="preserve"> </w:t>
+      </w:r>
+      <w:r>
+        <w:t xml:space="preserve">benchmarks cannot be trusted. The results show it meets that need, its label-free scores reproduce the true ranking,</w:t>
+      </w:r>
+      <w:r>
+        <w:t xml:space="preserve"> </w:t>
+      </w:r>
+      <w:r>
+        <w:t xml:space="preserve">track ground truth, and agree with human judgments (Section 5.1), and its items are verifiably fresh. The key</w:t>
+      </w:r>
+      <w:r>
+        <w:t xml:space="preserve"> </w:t>
+      </w:r>
+      <w:r>
+        <w:t xml:space="preserve">enabler is itself a contribution: the reliability of an LLM-judge panel is governed by its</w:t>
       </w:r>
       <w:r>
         <w:t xml:space="preserve"> </w:t>
@@ -11700,50 +11645,28 @@
           <w:i/>
           <w:iCs/>
         </w:rPr>
-        <w:t xml:space="preserve">why</w:t>
-      </w:r>
-      <w:r>
-        <w:t xml:space="preserve"> </w:t>
-      </w:r>
-      <w:r>
-        <w:t xml:space="preserve">this label-free judging can be trusted. The key enabler is a design</w:t>
-      </w:r>
-      <w:r>
-        <w:t xml:space="preserve"> </w:t>
-      </w:r>
-      <w:r>
-        <w:t xml:space="preserve">principle that is itself a contribution: the reliability of an LLM-judge panel is governed by its</w:t>
-      </w:r>
-      <w:r>
-        <w:t xml:space="preserve"> </w:t>
-      </w:r>
-      <w:r>
-        <w:rPr>
-          <w:i/>
-          <w:iCs/>
-        </w:rPr>
         <w:t xml:space="preserve">composition</w:t>
       </w:r>
       <w:r>
-        <w:t xml:space="preserve">, not its size. A diverse, cross-family panel cancels the mixed-sign biases (verbosity,</w:t>
-      </w:r>
-      <w:r>
-        <w:t xml:space="preserve"> </w:t>
-      </w:r>
-      <w:r>
-        <w:t xml:space="preserve">self-preference) that any individual judge carries, while a same-family panel would only amplify a shared</w:t>
-      </w:r>
-      <w:r>
-        <w:t xml:space="preserve"> </w:t>
-      </w:r>
-      <w:r>
-        <w:t xml:space="preserve">bias; practitioners should prioritize vendor diversity over adding more copies of similar judges. A modest diverse</w:t>
-      </w:r>
-      <w:r>
-        <w:t xml:space="preserve"> </w:t>
-      </w:r>
-      <w:r>
-        <w:t xml:space="preserve">panel already recovers most of the full-panel reliability, so the cost of diversity is small.</w:t>
+        <w:t xml:space="preserve">, not its</w:t>
+      </w:r>
+      <w:r>
+        <w:t xml:space="preserve"> </w:t>
+      </w:r>
+      <w:r>
+        <w:t xml:space="preserve">size. A cross-family panel cancels the mixed-sign biases (verbosity, self-preference) any individual judge carries,</w:t>
+      </w:r>
+      <w:r>
+        <w:t xml:space="preserve"> </w:t>
+      </w:r>
+      <w:r>
+        <w:t xml:space="preserve">where a same-family panel would amplify a shared one, and a modest diverse panel already recovers most of the</w:t>
+      </w:r>
+      <w:r>
+        <w:t xml:space="preserve"> </w:t>
+      </w:r>
+      <w:r>
+        <w:t xml:space="preserve">full-panel reliability, so practitioners should prioritize vendor diversity over more copies of similar judges.</w:t>
       </w:r>
     </w:p>
     <w:p>
@@ -11755,43 +11678,31 @@
         <w:widowControl w:val="1"/>
       </w:pPr>
       <w:r>
-        <w:t xml:space="preserve">Coupling the panel to attribute-stratified generation is what makes the system more than a better judge. Because items</w:t>
-      </w:r>
-      <w:r>
-        <w:t xml:space="preserve"> </w:t>
-      </w:r>
-      <w:r>
-        <w:t xml:space="preserve">are synthesized fresh from an attribute specification on every run, CoEval sidesteps contamination structurally rather</w:t>
-      </w:r>
-      <w:r>
-        <w:t xml:space="preserve"> </w:t>
-      </w:r>
-      <w:r>
-        <w:t xml:space="preserve">than chasing leaked items after the fact, and it targets the deployment's own distribution and edge cases rather than a</w:t>
-      </w:r>
-      <w:r>
-        <w:t xml:space="preserve"> </w:t>
-      </w:r>
-      <w:r>
-        <w:t xml:space="preserve">generic average. The same role separation that secures contamination-freeness in generation structurally precludes</w:t>
-      </w:r>
-      <w:r>
-        <w:t xml:space="preserve"> </w:t>
-      </w:r>
-      <w:r>
-        <w:t xml:space="preserve">same-family self-preference in scoring: one architectural choice closing two leakage channels. Declarative</w:t>
-      </w:r>
-      <w:r>
-        <w:t xml:space="preserve"> </w:t>
-      </w:r>
-      <w:r>
-        <w:t xml:space="preserve">specification keeps the whole pipeline reproducible: a single declarative configuration regenerates the benchmark, the responses, and</w:t>
-      </w:r>
-      <w:r>
-        <w:t xml:space="preserve"> </w:t>
-      </w:r>
-      <w:r>
-        <w:t xml:space="preserve">the scores.</w:t>
+        <w:t xml:space="preserve">Coupling the panel to attribute-stratified generation makes CoEval more than a better judge: because items are</w:t>
+      </w:r>
+      <w:r>
+        <w:t xml:space="preserve"> </w:t>
+      </w:r>
+      <w:r>
+        <w:t xml:space="preserve">synthesized fresh on every run, it sidesteps contamination structurally rather than chasing leaked items, and targets</w:t>
+      </w:r>
+      <w:r>
+        <w:t xml:space="preserve"> </w:t>
+      </w:r>
+      <w:r>
+        <w:t xml:space="preserve">the deployment's own distribution rather than a generic average. The same role separation that secures</w:t>
+      </w:r>
+      <w:r>
+        <w:t xml:space="preserve"> </w:t>
+      </w:r>
+      <w:r>
+        <w:t xml:space="preserve">contamination-freeness also precludes same-family self-preference, one architectural choice closing two leakage</w:t>
+      </w:r>
+      <w:r>
+        <w:t xml:space="preserve"> </w:t>
+      </w:r>
+      <w:r>
+        <w:t xml:space="preserve">channels, and a single declarative configuration regenerates the benchmark, responses, and scores.</w:t>
       </w:r>
     </w:p>
     <w:bookmarkEnd w:id="32"/>

</xml_diff>

<commit_message>
paper: condense Related Work further (cut redundant 2 intro preview + tighten 2.1)
Cut the 2 intro 'three lines of work' preview paragraph (its 12 citations are all repeated in
2.1/2.2, so no reference is lost) down to two framing sentences; tightened 2.1's label-free
aggregation paragraph. All 38 references still cited (verified: no orphans), wins-only clean,
0 em-dash, $ balanced. Both docx rebuilt. Content still ~11 pages (page 11 96% full).

Co-Authored-By: Claude Opus 4.8 <noreply@anthropic.com>
</commit_message>
<xml_diff>
--- a/docs/paper/CoEval.docx
+++ b/docs/paper/CoEval.docx
@@ -1256,269 +1256,31 @@
         <w:widowControl w:val="1"/>
       </w:pPr>
       <w:r>
-        <w:t xml:space="preserve">CoEval sits at the intersection of three lines of work, each motivated by one half of the practitioner's problem.</w:t>
-      </w:r>
-      <w:r>
-        <w:t xml:space="preserve"> </w:t>
-      </w:r>
-      <w:r>
-        <w:t xml:space="preserve">(i) A growing body of evidence shows that</w:t>
-      </w:r>
-      <w:r>
-        <w:t xml:space="preserve"> </w:t>
-      </w:r>
-      <w:r>
-        <w:rPr>
-          <w:i/>
-          <w:iCs/>
-        </w:rPr>
-        <w:t xml:space="preserve">public benchmarks cannot be taken at face value</w:t>
-      </w:r>
-      <w:r>
-        <w:t xml:space="preserve">: their items</w:t>
-      </w:r>
-      <w:r>
-        <w:t xml:space="preserve"> </w:t>
-      </w:r>
-      <w:r>
-        <w:t xml:space="preserve">leak into pretraining corpora and inflate scores through memorization (GSM1k [</w:t>
-      </w:r>
-      <w:hyperlink w:anchor="r12">
-        <w:r>
-          <w:rPr>
-            <w:rStyle w:val="Hyperlink"/>
-          </w:rPr>
-          <w:t xml:space="preserve">12</w:t>
-        </w:r>
-      </w:hyperlink>
-      <w:r>
-        <w:t xml:space="preserve">],</w:t>
-      </w:r>
-      <w:r>
-        <w:t xml:space="preserve"> </w:t>
-      </w:r>
-      <w:r>
-        <w:t xml:space="preserve">contamination surveys [</w:t>
-      </w:r>
-      <w:hyperlink w:anchor="r13">
-        <w:r>
-          <w:rPr>
-            <w:rStyle w:val="Hyperlink"/>
-          </w:rPr>
-          <w:t xml:space="preserve">13</w:t>
-        </w:r>
-      </w:hyperlink>
-      <w:r>
-        <w:t xml:space="preserve">]), which has driven continuously-refreshed</w:t>
-      </w:r>
-      <w:r>
-        <w:t xml:space="preserve"> </w:t>
-      </w:r>
-      <w:r>
-        <w:rPr>
-          <w:i/>
-          <w:iCs/>
-        </w:rPr>
-        <w:t xml:space="preserve">live</w:t>
-      </w:r>
-      <w:r>
-        <w:t xml:space="preserve"> </w:t>
-      </w:r>
-      <w:r>
-        <w:t xml:space="preserve">benchmarks (LiveBench [</w:t>
-      </w:r>
-      <w:hyperlink w:anchor="r22">
-        <w:r>
-          <w:rPr>
-            <w:rStyle w:val="Hyperlink"/>
-          </w:rPr>
-          <w:t xml:space="preserve">22</w:t>
-        </w:r>
-      </w:hyperlink>
-      <w:r>
-        <w:t xml:space="preserve">], LiveCodeBench [</w:t>
-      </w:r>
-      <w:hyperlink w:anchor="r23">
-        <w:r>
-          <w:rPr>
-            <w:rStyle w:val="Hyperlink"/>
-          </w:rPr>
-          <w:t xml:space="preserve">23</w:t>
-        </w:r>
-      </w:hyperlink>
-      <w:r>
-        <w:t xml:space="preserve">]) and</w:t>
-      </w:r>
-      <w:r>
-        <w:t xml:space="preserve"> </w:t>
-      </w:r>
-      <w:r>
-        <w:t xml:space="preserve">exposed leakage on the judge side as well (Preference Leakage [</w:t>
-      </w:r>
-      <w:hyperlink w:anchor="r15">
-        <w:r>
-          <w:rPr>
-            <w:rStyle w:val="Hyperlink"/>
-          </w:rPr>
-          <w:t xml:space="preserve">15</w:t>
-        </w:r>
-      </w:hyperlink>
-      <w:r>
-        <w:t xml:space="preserve">]). (ii) When no</w:t>
-      </w:r>
-      <w:r>
-        <w:t xml:space="preserve"> </w:t>
-      </w:r>
-      <w:r>
-        <w:t xml:space="preserve">labeled data exists,</w:t>
-      </w:r>
-      <w:r>
-        <w:t xml:space="preserve"> </w:t>
-      </w:r>
-      <w:r>
-        <w:rPr>
-          <w:i/>
-          <w:iCs/>
-        </w:rPr>
-        <w:t xml:space="preserve">automated benchmark generation</w:t>
-      </w:r>
-      <w:r>
-        <w:t xml:space="preserve"> </w:t>
-      </w:r>
-      <w:r>
-        <w:t xml:space="preserve">synthesizes evaluation items directly (AutoBencher</w:t>
-      </w:r>
-      <w:r>
-        <w:t xml:space="preserve"> </w:t>
-      </w:r>
-      <w:r>
-        <w:t xml:space="preserve">[</w:t>
-      </w:r>
-      <w:hyperlink w:anchor="r9">
-        <w:r>
-          <w:rPr>
-            <w:rStyle w:val="Hyperlink"/>
-          </w:rPr>
-          <w:t xml:space="preserve">9</w:t>
-        </w:r>
-      </w:hyperlink>
-      <w:r>
-        <w:t xml:space="preserve">], BenchAgents [</w:t>
-      </w:r>
-      <w:hyperlink w:anchor="r10">
-        <w:r>
-          <w:rPr>
-            <w:rStyle w:val="Hyperlink"/>
-          </w:rPr>
-          <w:t xml:space="preserve">10</w:t>
-        </w:r>
-      </w:hyperlink>
-      <w:r>
-        <w:t xml:space="preserve">], YourBench</w:t>
-      </w:r>
-      <w:r>
-        <w:t xml:space="preserve"> </w:t>
-      </w:r>
-      <w:r>
-        <w:t xml:space="preserve">[</w:t>
-      </w:r>
-      <w:hyperlink w:anchor="r11">
-        <w:r>
-          <w:rPr>
-            <w:rStyle w:val="Hyperlink"/>
-          </w:rPr>
-          <w:t xml:space="preserve">11</w:t>
-        </w:r>
-      </w:hyperlink>
-      <w:r>
-        <w:t xml:space="preserve">], domain-specific construction [</w:t>
-      </w:r>
-      <w:hyperlink w:anchor="r25">
-        <w:r>
-          <w:rPr>
-            <w:rStyle w:val="Hyperlink"/>
-          </w:rPr>
-          <w:t xml:space="preserve">25</w:t>
-        </w:r>
-      </w:hyperlink>
-      <w:r>
-        <w:t xml:space="preserve">]).</w:t>
-      </w:r>
-      <w:r>
-        <w:t xml:space="preserve"> </w:t>
-      </w:r>
-      <w:r>
-        <w:t xml:space="preserve">(iii) </w:t>
-      </w:r>
-      <w:r>
-        <w:rPr>
-          <w:i/>
-          <w:iCs/>
-        </w:rPr>
-        <w:t xml:space="preserve">LLM-as-judge</w:t>
-      </w:r>
-      <w:r>
-        <w:t xml:space="preserve"> </w:t>
-      </w:r>
-      <w:r>
-        <w:t xml:space="preserve">methods (G-Eval [</w:t>
-      </w:r>
-      <w:hyperlink w:anchor="r2">
-        <w:r>
-          <w:rPr>
-            <w:rStyle w:val="Hyperlink"/>
-          </w:rPr>
-          <w:t xml:space="preserve">2</w:t>
-        </w:r>
-      </w:hyperlink>
-      <w:r>
-        <w:t xml:space="preserve">], Prometheus 2</w:t>
-      </w:r>
-      <w:r>
-        <w:t xml:space="preserve"> </w:t>
-      </w:r>
-      <w:r>
-        <w:t xml:space="preserve">[</w:t>
-      </w:r>
-      <w:hyperlink w:anchor="r3">
-        <w:r>
-          <w:rPr>
-            <w:rStyle w:val="Hyperlink"/>
-          </w:rPr>
-          <w:t xml:space="preserve">3</w:t>
-        </w:r>
-      </w:hyperlink>
-      <w:r>
-        <w:t xml:space="preserve">], panels [</w:t>
-      </w:r>
-      <w:hyperlink w:anchor="r5">
-        <w:r>
-          <w:rPr>
-            <w:rStyle w:val="Hyperlink"/>
-          </w:rPr>
-          <w:t xml:space="preserve">5</w:t>
-        </w:r>
-      </w:hyperlink>
-      <w:r>
-        <w:t xml:space="preserve">]) provide label-free scoring but inherit</w:t>
-      </w:r>
-      <w:r>
-        <w:t xml:space="preserve"> </w:t>
-      </w:r>
-      <w:r>
-        <w:t xml:space="preserve">individual-judge biases. CoEval unifies all three: contamination-free, label-free, domain-targeted generation with a</w:t>
-      </w:r>
-      <w:r>
-        <w:t xml:space="preserve"> </w:t>
-      </w:r>
-      <w:r>
-        <w:t xml:space="preserve">reliability-controlled cross-family judge ensemble, in a single framework for the no-data, untrusted-benchmark regime.</w:t>
-      </w:r>
-      <w:r>
-        <w:t xml:space="preserve"> </w:t>
-      </w:r>
-      <w:r>
-        <w:t xml:space="preserve">We detail each line below.</w:t>
+        <w:t xml:space="preserve">CoEval draws on three lines of work, each motivated by one half of the practitioner's problem: evidence that public</w:t>
+      </w:r>
+      <w:r>
+        <w:t xml:space="preserve"> </w:t>
+      </w:r>
+      <w:r>
+        <w:t xml:space="preserve">benchmarks cannot be taken at face value (contamination and leakage), automated benchmark generation when no labeled</w:t>
+      </w:r>
+      <w:r>
+        <w:t xml:space="preserve"> </w:t>
+      </w:r>
+      <w:r>
+        <w:t xml:space="preserve">data exists, and LLM-as-judge scoring. CoEval unifies all three, contamination-free, label-free, domain-targeted</w:t>
+      </w:r>
+      <w:r>
+        <w:t xml:space="preserve"> </w:t>
+      </w:r>
+      <w:r>
+        <w:t xml:space="preserve">generation with a reliability-controlled cross-family judge ensemble, in a single framework for the no-data,</w:t>
+      </w:r>
+      <w:r>
+        <w:t xml:space="preserve"> </w:t>
+      </w:r>
+      <w:r>
+        <w:t xml:space="preserve">untrusted-benchmark regime; we detail each below.</w:t>
       </w:r>
     </w:p>
     <w:bookmarkStart w:id="12" w:name="llm-as-judge-and-judge-panels"/>
@@ -2062,19 +1824,19 @@
         </w:r>
       </w:hyperlink>
       <w:r>
-        <w:t xml:space="preserve">]; CoEval applies this to a vendor-disjoint LLM panel where peer agreement down-weights and</w:t>
-      </w:r>
-      <w:r>
-        <w:t xml:space="preserve"> </w:t>
-      </w:r>
-      <w:r>
-        <w:t xml:space="preserve">diagnoses unreliable judges (Section 5.2). Recent label-free methods learn per-judge reliability jointly with the</w:t>
-      </w:r>
-      <w:r>
-        <w:t xml:space="preserve"> </w:t>
-      </w:r>
-      <w:r>
-        <w:t xml:space="preserve">ranking from pairwise comparisons (judge-aware Bradley–Terry [</w:t>
+        <w:t xml:space="preserve">], which CoEval applies to a vendor-disjoint LLM panel (Section 5.2). Recent label-free</w:t>
+      </w:r>
+      <w:r>
+        <w:t xml:space="preserve"> </w:t>
+      </w:r>
+      <w:r>
+        <w:t xml:space="preserve">methods learn per-judge reliability jointly with the ranking from pairwise comparisons (judge-aware Bradley–Terry</w:t>
+      </w:r>
+      <w:r>
+        <w:t xml:space="preserve"> </w:t>
+      </w:r>
+      <w:r>
+        <w:t xml:space="preserve">[</w:t>
       </w:r>
       <w:hyperlink w:anchor="r27">
         <w:r>
@@ -2085,13 +1847,7 @@
         </w:r>
       </w:hyperlink>
       <w:r>
-        <w:t xml:space="preserve">], judge-aware ranking</w:t>
-      </w:r>
-      <w:r>
-        <w:t xml:space="preserve"> </w:t>
-      </w:r>
-      <w:r>
-        <w:t xml:space="preserve">[</w:t>
+        <w:t xml:space="preserve">], judge-aware ranking [</w:t>
       </w:r>
       <w:hyperlink w:anchor="r29">
         <w:r>
@@ -2102,7 +1858,13 @@
         </w:r>
       </w:hyperlink>
       <w:r>
-        <w:t xml:space="preserve">]) or separate quality from shared confounders [</w:t>
+        <w:t xml:space="preserve">]) or separate quality from shared confounders</w:t>
+      </w:r>
+      <w:r>
+        <w:t xml:space="preserve"> </w:t>
+      </w:r>
+      <w:r>
+        <w:t xml:space="preserve">[</w:t>
       </w:r>
       <w:hyperlink w:anchor="r28">
         <w:r>
@@ -2113,13 +1875,7 @@
         </w:r>
       </w:hyperlink>
       <w:r>
-        <w:t xml:space="preserve">]. CoEval shares this goal,</w:t>
-      </w:r>
-      <w:r>
-        <w:t xml:space="preserve"> </w:t>
-      </w:r>
-      <w:r>
-        <w:t xml:space="preserve">but its contribution is the</w:t>
+        <w:t xml:space="preserve">]; CoEval's contribution is their</w:t>
       </w:r>
       <w:r>
         <w:t xml:space="preserve"> </w:t>
@@ -2132,19 +1888,13 @@
         <w:t xml:space="preserve">integration</w:t>
       </w:r>
       <w:r>
-        <w:t xml:space="preserve">: these methods score a fixed, externally-supplied item set as pairwise</w:t>
-      </w:r>
-      <w:r>
-        <w:t xml:space="preserve"> </w:t>
-      </w:r>
-      <w:r>
-        <w:t xml:space="preserve">comparisons from a single-vendor pool, whereas CoEval supplies the items (generated de novo, contamination-free) and</w:t>
-      </w:r>
-      <w:r>
-        <w:t xml:space="preserve"> </w:t>
-      </w:r>
-      <w:r>
-        <w:t xml:space="preserve">scores them as rubric-anchored absolute scores from a</w:t>
+        <w:t xml:space="preserve">, supplying the items themselves (de novo,</w:t>
+      </w:r>
+      <w:r>
+        <w:t xml:space="preserve"> </w:t>
+      </w:r>
+      <w:r>
+        <w:t xml:space="preserve">contamination-free) and scoring them as absolute rubric scores from a</w:t>
       </w:r>
       <w:r>
         <w:t xml:space="preserve"> </w:t>
@@ -2160,7 +1910,13 @@
         <w:t xml:space="preserve"> </w:t>
       </w:r>
       <w:r>
-        <w:t xml:space="preserve">panel. Owning the whole loop surfaces the</w:t>
+        <w:t xml:space="preserve">panel rather than</w:t>
+      </w:r>
+      <w:r>
+        <w:t xml:space="preserve"> </w:t>
+      </w:r>
+      <w:r>
+        <w:t xml:space="preserve">pairwise comparisons from a single-vendor pool, which surfaces the</w:t>
       </w:r>
       <w:r>
         <w:t xml:space="preserve"> </w:t>
@@ -2176,13 +1932,13 @@
         <w:t xml:space="preserve"> </w:t>
       </w:r>
       <w:r>
-        <w:t xml:space="preserve">of Section 5.2: a single judge can be anti-correlated with ground truth where the</w:t>
-      </w:r>
-      <w:r>
-        <w:t xml:space="preserve"> </w:t>
-      </w:r>
-      <w:r>
-        <w:t xml:space="preserve">cross-family ensemble is the low-regret choice.</w:t>
+        <w:t xml:space="preserve">of Section 5.2: a</w:t>
+      </w:r>
+      <w:r>
+        <w:t xml:space="preserve"> </w:t>
+      </w:r>
+      <w:r>
+        <w:t xml:space="preserve">single judge can be anti-correlated with ground truth where the ensemble is the low-regret choice.</w:t>
       </w:r>
     </w:p>
     <w:bookmarkEnd w:id="12"/>

</xml_diff>

<commit_message>
paper: move 5.4 verticals detail to Appendix G -> 10 CONTENT PAGES (target hit)
Kept 5.4 as a short body summary (heading + key result + pointers, so all 7 'Section 5.4'
refs stay valid, no redirect) and moved the 3 detail paragraphs + Table 4 (-> Table G1) to
Appendix G. Compound 'Tables 2 and 4' -> 'Table 2 and Table G1'. Exhaustively verified: §5
1-4, body tables 1-3, appendices A-G, lettered C1/D1/E1/F1/G1, zero dangling/stray refs,
wins-only clean. References p11 => 10 content pages (TACL limit met).
</commit_message>
<xml_diff>
--- a/docs/paper/CoEval.docx
+++ b/docs/paper/CoEval.docx
@@ -9890,13 +9890,7 @@
         <w:widowControl w:val="1"/>
       </w:pPr>
       <w:r>
-        <w:t xml:space="preserve">The preceding sections validate CoEval's components where ground truth is available. We now exercise the complete tool</w:t>
-      </w:r>
-      <w:r>
-        <w:t xml:space="preserve"> </w:t>
-      </w:r>
-      <w:r>
-        <w:t xml:space="preserve">in its intended regime on three custom verticals,</w:t>
+        <w:t xml:space="preserve">We exercise the complete tool in its intended regime on three custom verticals,</w:t>
       </w:r>
       <w:r>
         <w:t xml:space="preserve"> </w:t>
@@ -9919,172 +9913,53 @@
           <w:i/>
           <w:iCs/>
         </w:rPr>
-        <w:t xml:space="preserve">clinical</w:t>
+        <w:t xml:space="preserve">clinical reasoning</w:t>
+      </w:r>
+      <w:r>
+        <w:t xml:space="preserve">, and</w:t>
+      </w:r>
+      <w:r>
+        <w:t xml:space="preserve"> </w:t>
       </w:r>
       <w:r>
         <w:rPr>
           <w:i/>
           <w:iCs/>
         </w:rPr>
-        <w:t xml:space="preserve"> </w:t>
-      </w:r>
-      <w:r>
-        <w:rPr>
-          <w:i/>
-          <w:iCs/>
-        </w:rPr>
-        <w:t xml:space="preserve">reasoning</w:t>
-      </w:r>
-      <w:r>
-        <w:t xml:space="preserve">, and</w:t>
-      </w:r>
-      <w:r>
-        <w:t xml:space="preserve"> </w:t>
-      </w:r>
-      <w:r>
-        <w:rPr>
-          <w:i/>
-          <w:iCs/>
-        </w:rPr>
         <w:t xml:space="preserve">legal analysis</w:t>
       </w:r>
       <w:r>
-        <w:t xml:space="preserve">, for which we assume no task-specific labeled data and no trustworthy</w:t>
-      </w:r>
-      <w:r>
-        <w:t xml:space="preserve"> </w:t>
-      </w:r>
-      <w:r>
-        <w:t xml:space="preserve">public benchmark. The drug-interaction vertical is the sharpest case for the framework's premise: a well-known public</w:t>
-      </w:r>
-      <w:r>
-        <w:t xml:space="preserve"> </w:t>
-      </w:r>
-      <w:r>
-        <w:t xml:space="preserve">benchmark exists (DDIExtraction-2013) but is a relation-</w:t>
-      </w:r>
-      <w:r>
-        <w:rPr>
-          <w:i/>
-          <w:iCs/>
-        </w:rPr>
-        <w:t xml:space="preserve">extraction</w:t>
-      </w:r>
-      <w:r>
-        <w:t xml:space="preserve"> </w:t>
-      </w:r>
-      <w:r>
-        <w:t xml:space="preserve">corpus rather than clinical-decision</w:t>
-      </w:r>
-      <w:r>
-        <w:t xml:space="preserve"> </w:t>
-      </w:r>
-      <w:r>
-        <w:t xml:space="preserve">reasoning, and is old and freely available enough to be presumed present in pretraining, while the few clinically</w:t>
-      </w:r>
-      <w:r>
-        <w:t xml:space="preserve"> </w:t>
-      </w:r>
-      <w:r>
-        <w:t xml:space="preserve">realistic DDI-reasoning sets are private and number only in the hundreds of items. From a one-line description per</w:t>
-      </w:r>
-      <w:r>
-        <w:t xml:space="preserve"> </w:t>
-      </w:r>
-      <w:r>
-        <w:t xml:space="preserve">vertical, CoEval's teacher generated 40 attribute-stratified items (for drug interactions, stratified over severity,</w:t>
-      </w:r>
-      <w:r>
-        <w:t xml:space="preserve"> </w:t>
-      </w:r>
-      <w:r>
-        <w:t xml:space="preserve">mechanism, and patient context), three candidate models answered them, and the cross-family ensemble</w:t>
-      </w:r>
-      <w:r>
-        <w:t xml:space="preserve"> </w:t>
-      </w:r>
-      <w:r>
-        <w:t xml:space="preserve">(OpenAI + Anthropic + Google) scored every response, all from a single configuration file, with</w:t>
-      </w:r>
-      <w:r>
-        <w:t xml:space="preserve"> </w:t>
-      </w:r>
-      <w:r>
-        <w:t xml:space="preserve">no human labels or raters.</w:t>
-      </w:r>
-      <w:r>
-        <w:t xml:space="preserve"> </w:t>
-      </w:r>
-      <w:hyperlink w:anchor="appC">
-        <w:r>
-          <w:rPr>
-            <w:rStyle w:val="Hyperlink"/>
-          </w:rPr>
-          <w:t xml:space="preserve">Appendix C</w:t>
-        </w:r>
-      </w:hyperlink>
-      <w:r>
-        <w:t xml:space="preserve"> </w:t>
-      </w:r>
-      <w:r>
-        <w:t xml:space="preserve">shows the actual generated artifacts for all three</w:t>
-      </w:r>
-      <w:r>
-        <w:t xml:space="preserve"> </w:t>
-      </w:r>
-      <w:r>
-        <w:t xml:space="preserve">domains: the one-line seed, the auto-generated attribute strata and rubric, and a representative synthesized item.</w:t>
-      </w:r>
-    </w:p>
-    <w:p>
-      <w:pPr>
-        <w:pStyle w:val="BodyText"/>
-        <w:jc w:val="both"/>
-        <w:keepNext w:val="0"/>
-        <w:keepLines w:val="0"/>
-        <w:widowControl w:val="1"/>
-      </w:pPr>
-      <w:r>
-        <w:t xml:space="preserve">On the drug-interaction vertical CoEval produces a</w:t>
-      </w:r>
-      <w:r>
-        <w:t xml:space="preserve"> </w:t>
-      </w:r>
-      <w:r>
-        <w:rPr>
-          <w:b/>
-          <w:bCs/>
-        </w:rPr>
-        <w:t xml:space="preserve">clean, fully unanimous ranking</w:t>
-      </w:r>
-      <w:r>
-        <w:t xml:space="preserve">: all three</w:t>
-      </w:r>
-      <w:r>
-        <w:t xml:space="preserve"> </w:t>
-      </w:r>
-      <w:r>
-        <w:t xml:space="preserve">cross-family judges agree on the complete order</w:t>
-      </w:r>
-      <w:r>
-        <w:t xml:space="preserve"> </w:t>
+        <w:t xml:space="preserve">, for</w:t>
+      </w:r>
+      <w:r>
+        <w:t xml:space="preserve"> </w:t>
+      </w:r>
+      <w:r>
+        <w:t xml:space="preserve">which we assume no task-specific labeled data and no trustworthy public benchmark. From a one-line description</w:t>
+      </w:r>
+      <w:r>
+        <w:t xml:space="preserve"> </w:t>
+      </w:r>
+      <w:r>
+        <w:t xml:space="preserve">each, CoEval generated 40 attribute-stratified items per vertical, three candidates answered, and the</w:t>
+      </w:r>
+      <w:r>
+        <w:t xml:space="preserve"> </w:t>
+      </w:r>
+      <w:r>
+        <w:t xml:space="preserve">cross-family panel scored every response, from one configuration file with no human labels. The panel produces</w:t>
+      </w:r>
+      <w:r>
+        <w:t xml:space="preserve"> </w:t>
+      </w:r>
+      <w:r>
+        <w:t xml:space="preserve">defensible rankings, a fully unanimous order on drug-interaction (</w:t>
       </w:r>
       <w:r>
         <w:rPr>
           <w:rStyle w:val="VerbatimChar"/>
         </w:rPr>
         <w:t xml:space="preserve">gpt-4o-mini</w:t>
-      </w:r>
-      <w:r>
-        <w:t xml:space="preserve"> (</w:t>
-      </w:r>
-      <m:oMath>
-        <m:r>
-          <m:t>0.770</m:t>
-        </m:r>
-      </m:oMath>
-      <w:r>
-        <w:t xml:space="preserve">)</w:t>
       </w:r>
       <w:r>
         <w:t xml:space="preserve"> </w:t>
@@ -10109,20 +9984,6 @@
       <w:r>
         <w:t xml:space="preserve"> </w:t>
       </w:r>
-      <w:r>
-        <w:t xml:space="preserve"> (</w:t>
-      </w:r>
-      <m:oMath>
-        <m:r>
-          <m:t>0.682</m:t>
-        </m:r>
-      </m:oMath>
-      <w:r>
-        <w:t xml:space="preserve">)</w:t>
-      </w:r>
-      <w:r>
-        <w:t xml:space="preserve"> </w:t>
-      </w:r>
       <m:oMath>
         <m:r>
           <m:rPr>
@@ -10141,114 +10002,13 @@
         <w:t xml:space="preserve">llama-3.2-3b</w:t>
       </w:r>
       <w:r>
-        <w:t xml:space="preserve"> (</w:t>
-      </w:r>
-      <m:oMath>
-        <m:r>
-          <m:t>0.497</m:t>
-        </m:r>
-      </m:oMath>
-      <w:r>
-        <w:t xml:space="preserve">), with non-overlapping confidence intervals separating every</w:t>
-      </w:r>
-      <w:r>
-        <w:t xml:space="preserve"> </w:t>
-      </w:r>
-      <w:r>
-        <w:t xml:space="preserve">model (Table 4). The clinical and legal verticals are consistent: the ensemble ranks the smallest model weakest in</w:t>
-      </w:r>
-      <w:r>
-        <w:t xml:space="preserve"> </w:t>
-      </w:r>
-      <w:r>
-        <w:t xml:space="preserve">both, unanimously in clinical and two-of-three in legal (where the Anthropic judge ranks</w:t>
-      </w:r>
-      <w:r>
-        <w:t xml:space="preserve"> </w:t>
-      </w:r>
-      <w:r>
-        <w:rPr>
-          <w:rStyle w:val="VerbatimChar"/>
-        </w:rPr>
-        <w:t xml:space="preserve">gpt-3.5-turbo</w:t>
-      </w:r>
-      <w:r>
-        <w:t xml:space="preserve"> </w:t>
-      </w:r>
-      <w:r>
-        <w:t xml:space="preserve">lowest): genuine disagreement a single judge would hide and a diverse ensemble surfaces; on clinical the two</w:t>
-      </w:r>
-      <w:r>
-        <w:t xml:space="preserve"> </w:t>
-      </w:r>
-      <w:r>
-        <w:t xml:space="preserve">stronger models are statistically close, which the overlapping intervals correctly expose. This is the operation the</w:t>
-      </w:r>
-      <w:r>
-        <w:t xml:space="preserve"> </w:t>
-      </w:r>
-      <w:r>
-        <w:t xml:space="preserve">framework is built for: producing a defensible model ranking for a bespoke domain in which a standard benchmark is</w:t>
-      </w:r>
-      <w:r>
-        <w:t xml:space="preserve"> </w:t>
-      </w:r>
-      <w:r>
-        <w:t xml:space="preserve">unavailable or untrustworthy.</w:t>
-      </w:r>
-    </w:p>
-    <w:p>
-      <w:pPr>
-        <w:pStyle w:val="BodyText"/>
-        <w:jc w:val="both"/>
-        <w:keepNext w:val="0"/>
-        <w:keepLines w:val="0"/>
-        <w:widowControl w:val="1"/>
-      </w:pPr>
-      <w:r>
-        <w:t xml:space="preserve">A ranking is only possible if the items</w:t>
-      </w:r>
-      <w:r>
-        <w:t xml:space="preserve"> </w:t>
-      </w:r>
-      <w:r>
-        <w:rPr>
-          <w:i/>
-          <w:iCs/>
-        </w:rPr>
-        <w:t xml:space="preserve">separate</w:t>
-      </w:r>
-      <w:r>
-        <w:t xml:space="preserve"> </w:t>
-      </w:r>
-      <w:r>
-        <w:t xml:space="preserve">the models, the generation-side analog of judge</w:t>
-      </w:r>
-      <w:r>
-        <w:t xml:space="preserve"> </w:t>
-      </w:r>
-      <w:r>
-        <w:t xml:space="preserve">discrimination: a good teacher writes questions on which candidates actually differ. We measure per-item</w:t>
-      </w:r>
-      <w:r>
-        <w:t xml:space="preserve"> </w:t>
-      </w:r>
-      <w:r>
-        <w:t xml:space="preserve">discriminativeness as the spread of candidate-model ensemble scores. Across the</w:t>
-      </w:r>
-      <w:r>
-        <w:t xml:space="preserve"> </w:t>
-      </w:r>
-      <m:oMath>
-        <m:r>
-          <m:t>120</m:t>
-        </m:r>
-      </m:oMath>
-      <w:r>
-        <w:t xml:space="preserve"> </w:t>
-      </w:r>
-      <w:r>
-        <w:t xml:space="preserve">generated vertical items,</w:t>
+        <w:t xml:space="preserve">, non-overlapping CIs) and consistent rankings on clinical</w:t>
+      </w:r>
+      <w:r>
+        <w:t xml:space="preserve"> </w:t>
+      </w:r>
+      <w:r>
+        <w:t xml:space="preserve">and legal, with</w:t>
       </w:r>
       <w:r>
         <w:t xml:space="preserve"> </w:t>
@@ -10265,1063 +10025,21 @@
         </m:r>
       </m:oMath>
       <w:r>
-        <w:rPr>
-          <w:b/>
-          <w:bCs/>
-        </w:rPr>
-        <w:t xml:space="preserve"> </w:t>
-      </w:r>
-      <w:r>
-        <w:rPr>
-          <w:b/>
-          <w:bCs/>
-        </w:rPr>
-        <w:t xml:space="preserve">are discriminative</w:t>
-      </w:r>
-      <w:r>
-        <w:t xml:space="preserve"> </w:t>
-      </w:r>
-      <w:r>
-        <w:t xml:space="preserve">(a score range</w:t>
-      </w:r>
-      <w:r>
-        <w:t xml:space="preserve"> </w:t>
-      </w:r>
-      <m:oMath>
-        <m:r>
-          <m:rPr>
-            <m:sty m:val="p"/>
-          </m:rPr>
-          <m:t>≥</m:t>
-        </m:r>
-        <m:r>
-          <m:t>0.15</m:t>
-        </m:r>
-      </m:oMath>
-      <w:r>
-        <w:t xml:space="preserve"> </w:t>
-      </w:r>
-      <w:r>
-        <w:t xml:space="preserve">across the three models), with a mean per-item</w:t>
-      </w:r>
-      <w:r>
-        <w:t xml:space="preserve"> </w:t>
-      </w:r>
-      <w:r>
-        <w:t xml:space="preserve">range of</w:t>
-      </w:r>
-      <w:r>
-        <w:t xml:space="preserve"> </w:t>
-      </w:r>
-      <m:oMath>
-        <m:r>
-          <m:t>0.33</m:t>
-        </m:r>
-      </m:oMath>
-      <w:r>
-        <w:t xml:space="preserve">; on drug-interaction and legal analysis the figure rises to</w:t>
-      </w:r>
-      <w:r>
-        <w:t xml:space="preserve"> </w:t>
-      </w:r>
-      <m:oMath>
-        <m:r>
-          <m:t>78</m:t>
-        </m:r>
-        <m:r>
-          <m:rPr>
-            <m:sty m:val="p"/>
-          </m:rPr>
-          <m:t>%</m:t>
-        </m:r>
-      </m:oMath>
-      <w:r>
-        <w:t xml:space="preserve"> </w:t>
-      </w:r>
-      <w:r>
-        <w:t xml:space="preserve">and</w:t>
-      </w:r>
-      <w:r>
-        <w:t xml:space="preserve"> </w:t>
-      </w:r>
-      <m:oMath>
-        <m:r>
-          <m:t>85</m:t>
-        </m:r>
-        <m:r>
-          <m:rPr>
-            <m:sty m:val="p"/>
-          </m:rPr>
-          <m:t>%</m:t>
-        </m:r>
-      </m:oMath>
-      <w:r>
-        <w:t xml:space="preserve">. Where the items do not</w:t>
-      </w:r>
-      <w:r>
-        <w:t xml:space="preserve"> </w:t>
-      </w:r>
-      <w:r>
-        <w:t xml:space="preserve">separate the models they are honest about it: clinical reasoning is only</w:t>
-      </w:r>
-      <w:r>
-        <w:t xml:space="preserve"> </w:t>
-      </w:r>
-      <m:oMath>
-        <m:r>
-          <m:t>50</m:t>
-        </m:r>
-        <m:r>
-          <m:rPr>
-            <m:sty m:val="p"/>
-          </m:rPr>
-          <m:t>%</m:t>
-        </m:r>
-      </m:oMath>
-      <w:r>
-        <w:t xml:space="preserve"> </w:t>
-      </w:r>
-      <w:r>
-        <w:t xml:space="preserve">discriminative precisely because its</w:t>
-      </w:r>
-      <w:r>
-        <w:t xml:space="preserve"> </w:t>
-      </w:r>
-      <w:r>
-        <w:t xml:space="preserve">two stronger candidates are genuinely close (</w:t>
-      </w:r>
-      <m:oMath>
-        <m:r>
-          <m:t>0.873</m:t>
-        </m:r>
-      </m:oMath>
-      <w:r>
-        <w:t xml:space="preserve"> </w:t>
-      </w:r>
-      <w:r>
-        <w:t xml:space="preserve">vs</w:t>
-      </w:r>
-      <w:r>
-        <w:t xml:space="preserve"> </w:t>
-      </w:r>
-      <m:oMath>
-        <m:r>
-          <m:t>0.864</m:t>
-        </m:r>
-      </m:oMath>
-      <w:r>
-        <w:t xml:space="preserve">), so the items reflect a real near-tie rather than</w:t>
-      </w:r>
-      <w:r>
-        <w:t xml:space="preserve"> </w:t>
-      </w:r>
-      <w:r>
-        <w:t xml:space="preserve">manufacturing a gap. This is why the panel yields non-overlapping ranking intervals: the teacher supplies items that</w:t>
-      </w:r>
-      <w:r>
-        <w:t xml:space="preserve"> </w:t>
-      </w:r>
-      <w:r>
-        <w:t xml:space="preserve">carry ranking signal, and a non-discriminative benchmark, on which every model scores alike, could not separate the</w:t>
-      </w:r>
-      <w:r>
-        <w:t xml:space="preserve"> </w:t>
-      </w:r>
-      <w:r>
-        <w:t xml:space="preserve">candidates no matter how reliable the judges are.</w:t>
+        <w:t xml:space="preserve"> </w:t>
+      </w:r>
+      <w:r>
+        <w:t xml:space="preserve">of generated items discriminative. Appendix G reports the full results</w:t>
+      </w:r>
+      <w:r>
+        <w:t xml:space="preserve"> </w:t>
+      </w:r>
+      <w:r>
+        <w:t xml:space="preserve">(Table G1) and Appendix C the generated artifacts.</w:t>
       </w:r>
     </w:p>
     <w:p>
       <w:pPr>
-        <w:pStyle w:val="TableCaption"/>
-        <w:spacing w:before="280" w:after="60" w:line="240" w:lineRule="auto"/>
-        <w:jc w:val="center"/>
-        <w:keepNext/>
-        <w:keepLines/>
-        <w:widowControl w:val="1"/>
-      </w:pPr>
-      <w:r>
-        <w:rPr>
-          <w:b/>
-          <w:i/>
-        </w:rPr>
-        <w:t>Table 4.</w:t>
-      </w:r>
-      <w:r>
-        <w:rPr>
-          <w:b w:val="0"/>
-          <w:i/>
-        </w:rPr>
-        <w:t xml:space="preserve"> </w:t>
-      </w:r>
-      <w:r>
-        <w:rPr>
-          <w:b w:val="0"/>
-          <w:i/>
-        </w:rPr>
-        <w:t>CoEval ranks three candidate models on three custom, contamination-free verticals generated from a task description with no labeled data. Scores are the cross-family ensemble mean ([0, 1]) with 95% bootstrap CI over 40 generated items. llama-3.2-3b ranks weakest in every vertical; the three judges agree unanimously on the full drug-interaction order, unanimously on the weakest clinical model, and two-of-three in legal.</w:t>
-      </w:r>
-    </w:p>
-    <w:tbl>
-      <w:tblPr>
-        <w:tblStyle w:val="Table"/>
-        <w:tblW w:type="pct" w:w="5000"/>
-        <w:jc w:val="center"/>
-        <w:tblLook w:firstRow="1" w:lastRow="0" w:firstColumn="0" w:lastColumn="0" w:noHBand="0" w:noVBand="0" w:val="0020"/>
-        <w:tblCaption w:val="Table 4. CoEval ranks three candidate models on three custom, contamination-free verticals generated from a task description with no labeled data. Scores are the cross-family ensemble mean ([0, 1]) with 95% bootstrap CI over 40 generated items. llama-3.2-3b ranks weakest in every vertical; the three judges agree unanimously on the full drug-interaction order, unanimously on the weakest clinical model, and two-of-three in legal."/>
-        <w:tblLayout w:type="autofit"/>
-        <w:tblBorders>
-          <w:top w:val="single" w:sz="10" w:color="4F6272"/>
-          <w:bottom w:val="single" w:sz="10" w:color="4F6272"/>
-          <w:insideH w:val="single" w:sz="5" w:color="9FB0C2"/>
-          <w:left w:val="single" w:sz="6" w:color="9FB0C2"/>
-          <w:right w:val="single" w:sz="6" w:color="9FB0C2"/>
-          <w:insideV w:val="single" w:sz="5" w:color="D9E1E8"/>
-        </w:tblBorders>
-      </w:tblPr>
-      <w:tblGrid>
-        <w:gridCol w:w="2640"/>
-        <w:gridCol w:w="2640"/>
-        <w:gridCol w:w="2640"/>
-      </w:tblGrid>
-      <w:tr>
-        <w:trPr>
-          <w:tblHeader w:val="on"/>
-        </w:trPr>
-        <w:tc>
-          <w:tcPr>
-            <w:shd w:fill="EEF3F7"/>
-            <w:tcBorders>
-              <w:left w:val="nil"/>
-              <w:right w:val="nil"/>
-              <w:top w:val="nil"/>
-              <w:bottom w:val="single" w:sz="8" w:color="9FB0C2"/>
-            </w:tcBorders>
-            <w:vAlign w:val="center"/>
-          </w:tcPr>
-          <w:p>
-            <w:pPr>
-              <w:pStyle w:val="Compact"/>
-              <w:spacing w:before="0" w:after="20" w:line="240" w:lineRule="auto"/>
-              <w:jc w:val="center"/>
-              <w:keepNext w:val="0"/>
-              <w:keepLines/>
-              <w:widowControl w:val="1"/>
-            </w:pPr>
-            <w:r>
-              <w:rPr>
-                <w:rFonts w:ascii="Georgia" w:hAnsi="Georgia"/>
-                <w:b/>
-                <w:sz w:val="19"/>
-              </w:rPr>
-              <w:t xml:space="preserve">Vertical</w:t>
-            </w:r>
-          </w:p>
-        </w:tc>
-        <w:tc>
-          <w:tcPr>
-            <w:shd w:fill="EEF3F7"/>
-            <w:tcBorders>
-              <w:left w:val="nil"/>
-              <w:right w:val="nil"/>
-              <w:top w:val="nil"/>
-              <w:bottom w:val="single" w:sz="8" w:color="9FB0C2"/>
-            </w:tcBorders>
-            <w:vAlign w:val="center"/>
-          </w:tcPr>
-          <w:p>
-            <w:pPr>
-              <w:pStyle w:val="Compact"/>
-              <w:spacing w:before="0" w:after="20" w:line="240" w:lineRule="auto"/>
-              <w:jc w:val="center"/>
-              <w:keepNext w:val="0"/>
-              <w:keepLines/>
-              <w:widowControl w:val="1"/>
-            </w:pPr>
-            <w:r>
-              <w:rPr>
-                <w:rFonts w:ascii="Georgia" w:hAnsi="Georgia"/>
-                <w:b/>
-                <w:sz w:val="19"/>
-              </w:rPr>
-              <w:t xml:space="preserve">Model</w:t>
-            </w:r>
-          </w:p>
-        </w:tc>
-        <w:tc>
-          <w:tcPr>
-            <w:shd w:fill="EEF3F7"/>
-            <w:tcBorders>
-              <w:left w:val="nil"/>
-              <w:right w:val="nil"/>
-              <w:top w:val="nil"/>
-              <w:bottom w:val="single" w:sz="8" w:color="9FB0C2"/>
-            </w:tcBorders>
-            <w:vAlign w:val="center"/>
-          </w:tcPr>
-          <w:p>
-            <w:pPr>
-              <w:pStyle w:val="Compact"/>
-              <w:spacing w:before="0" w:after="20" w:line="240" w:lineRule="auto"/>
-              <w:jc w:val="center"/>
-              <w:keepNext w:val="0"/>
-              <w:keepLines/>
-              <w:widowControl w:val="1"/>
-            </w:pPr>
-            <w:r>
-              <w:rPr>
-                <w:rFonts w:ascii="Georgia" w:hAnsi="Georgia"/>
-                <w:b/>
-                <w:sz w:val="19"/>
-              </w:rPr>
-              <w:t xml:space="preserve">CoEval score [95% CI]</w:t>
-            </w:r>
-          </w:p>
-        </w:tc>
-      </w:tr>
-      <w:tr>
-        <w:tc>
-          <w:tcPr>
-            <w:tcBorders>
-              <w:left w:val="nil"/>
-              <w:right w:val="nil"/>
-              <w:top w:val="nil"/>
-              <w:bottom w:val="single" w:sz="4" w:color="D9E1E8"/>
-            </w:tcBorders>
-            <w:vAlign w:val="center"/>
-          </w:tcPr>
-          <w:p>
-            <w:pPr>
-              <w:pStyle w:val="Compact"/>
-              <w:spacing w:before="0" w:after="20" w:line="240" w:lineRule="auto"/>
-              <w:jc w:val="center"/>
-              <w:keepNext w:val="0"/>
-              <w:keepLines/>
-              <w:widowControl w:val="1"/>
-            </w:pPr>
-            <w:r>
-              <w:rPr>
-                <w:rFonts w:ascii="Georgia" w:hAnsi="Georgia"/>
-                <w:i/>
-                <w:iCs/>
-                <w:sz w:val="19"/>
-              </w:rPr>
-              <w:t xml:space="preserve">Drug–drug interaction</w:t>
-            </w:r>
-          </w:p>
-        </w:tc>
-        <w:tc>
-          <w:tcPr>
-            <w:tcBorders>
-              <w:left w:val="nil"/>
-              <w:right w:val="nil"/>
-              <w:top w:val="nil"/>
-              <w:bottom w:val="single" w:sz="4" w:color="D9E1E8"/>
-            </w:tcBorders>
-            <w:vAlign w:val="center"/>
-          </w:tcPr>
-          <w:p>
-            <w:pPr>
-              <w:pStyle w:val="Compact"/>
-              <w:spacing w:before="0" w:after="20" w:line="240" w:lineRule="auto"/>
-              <w:jc w:val="center"/>
-              <w:keepNext w:val="0"/>
-              <w:keepLines/>
-              <w:widowControl w:val="1"/>
-            </w:pPr>
-            <w:r>
-              <w:rPr>
-                <w:rFonts w:ascii="Georgia" w:hAnsi="Georgia"/>
-                <w:sz w:val="19"/>
-              </w:rPr>
-              <w:t xml:space="preserve">gpt-4o-mini</w:t>
-            </w:r>
-          </w:p>
-        </w:tc>
-        <w:tc>
-          <w:tcPr>
-            <w:tcBorders>
-              <w:left w:val="nil"/>
-              <w:right w:val="nil"/>
-              <w:top w:val="nil"/>
-              <w:bottom w:val="single" w:sz="4" w:color="D9E1E8"/>
-            </w:tcBorders>
-            <w:vAlign w:val="center"/>
-          </w:tcPr>
-          <w:p>
-            <w:pPr>
-              <w:pStyle w:val="Compact"/>
-              <w:spacing w:before="0" w:after="20" w:line="240" w:lineRule="auto"/>
-              <w:jc w:val="center"/>
-              <w:keepNext w:val="0"/>
-              <w:keepLines/>
-              <w:widowControl w:val="1"/>
-            </w:pPr>
-            <w:r>
-              <w:rPr>
-                <w:rFonts w:ascii="Georgia" w:hAnsi="Georgia"/>
-                <w:sz w:val="19"/>
-              </w:rPr>
-              <w:t xml:space="preserve">0.770 [0.739, 0.800]</w:t>
-            </w:r>
-          </w:p>
-        </w:tc>
-      </w:tr>
-      <w:tr>
-        <w:tc>
-          <w:tcPr>
-            <w:tcBorders>
-              <w:left w:val="nil"/>
-              <w:right w:val="nil"/>
-              <w:top w:val="nil"/>
-              <w:bottom w:val="single" w:sz="4" w:color="D9E1E8"/>
-            </w:tcBorders>
-            <w:vAlign w:val="center"/>
-          </w:tcPr>
-          <w:p>
-            <w:pPr>
-              <w:pStyle w:val="Compact"/>
-              <w:spacing w:before="0" w:after="20" w:line="240" w:lineRule="auto"/>
-              <w:jc w:val="center"/>
-              <w:keepNext w:val="0"/>
-              <w:keepLines/>
-              <w:widowControl w:val="1"/>
-            </w:pPr>
-          </w:p>
-        </w:tc>
-        <w:tc>
-          <w:tcPr>
-            <w:tcBorders>
-              <w:left w:val="nil"/>
-              <w:right w:val="nil"/>
-              <w:top w:val="nil"/>
-              <w:bottom w:val="single" w:sz="4" w:color="D9E1E8"/>
-            </w:tcBorders>
-            <w:vAlign w:val="center"/>
-          </w:tcPr>
-          <w:p>
-            <w:pPr>
-              <w:pStyle w:val="Compact"/>
-              <w:spacing w:before="0" w:after="20" w:line="240" w:lineRule="auto"/>
-              <w:jc w:val="center"/>
-              <w:keepNext w:val="0"/>
-              <w:keepLines/>
-              <w:widowControl w:val="1"/>
-            </w:pPr>
-            <w:r>
-              <w:rPr>
-                <w:rFonts w:ascii="Georgia" w:hAnsi="Georgia"/>
-                <w:sz w:val="19"/>
-              </w:rPr>
-              <w:t xml:space="preserve">gpt-3.5-turbo</w:t>
-            </w:r>
-          </w:p>
-        </w:tc>
-        <w:tc>
-          <w:tcPr>
-            <w:tcBorders>
-              <w:left w:val="nil"/>
-              <w:right w:val="nil"/>
-              <w:top w:val="nil"/>
-              <w:bottom w:val="single" w:sz="4" w:color="D9E1E8"/>
-            </w:tcBorders>
-            <w:vAlign w:val="center"/>
-          </w:tcPr>
-          <w:p>
-            <w:pPr>
-              <w:pStyle w:val="Compact"/>
-              <w:spacing w:before="0" w:after="20" w:line="240" w:lineRule="auto"/>
-              <w:jc w:val="center"/>
-              <w:keepNext w:val="0"/>
-              <w:keepLines/>
-              <w:widowControl w:val="1"/>
-            </w:pPr>
-            <w:r>
-              <w:rPr>
-                <w:rFonts w:ascii="Georgia" w:hAnsi="Georgia"/>
-                <w:sz w:val="19"/>
-              </w:rPr>
-              <w:t xml:space="preserve">0.682 [0.646, 0.717]</w:t>
-            </w:r>
-          </w:p>
-        </w:tc>
-      </w:tr>
-      <w:tr>
-        <w:tc>
-          <w:tcPr>
-            <w:tcBorders>
-              <w:left w:val="nil"/>
-              <w:right w:val="nil"/>
-              <w:top w:val="nil"/>
-              <w:bottom w:val="single" w:sz="4" w:color="D9E1E8"/>
-            </w:tcBorders>
-            <w:vAlign w:val="center"/>
-          </w:tcPr>
-          <w:p>
-            <w:pPr>
-              <w:pStyle w:val="Compact"/>
-              <w:spacing w:before="0" w:after="20" w:line="240" w:lineRule="auto"/>
-              <w:jc w:val="center"/>
-              <w:keepNext w:val="0"/>
-              <w:keepLines/>
-              <w:widowControl w:val="1"/>
-            </w:pPr>
-          </w:p>
-        </w:tc>
-        <w:tc>
-          <w:tcPr>
-            <w:tcBorders>
-              <w:left w:val="nil"/>
-              <w:right w:val="nil"/>
-              <w:top w:val="nil"/>
-              <w:bottom w:val="single" w:sz="4" w:color="D9E1E8"/>
-            </w:tcBorders>
-            <w:vAlign w:val="center"/>
-          </w:tcPr>
-          <w:p>
-            <w:pPr>
-              <w:pStyle w:val="Compact"/>
-              <w:spacing w:before="0" w:after="20" w:line="240" w:lineRule="auto"/>
-              <w:jc w:val="center"/>
-              <w:keepNext w:val="0"/>
-              <w:keepLines/>
-              <w:widowControl w:val="1"/>
-            </w:pPr>
-            <w:r>
-              <w:rPr>
-                <w:rFonts w:ascii="Georgia" w:hAnsi="Georgia"/>
-                <w:sz w:val="19"/>
-              </w:rPr>
-              <w:t xml:space="preserve">llama-3.2-3b</w:t>
-            </w:r>
-          </w:p>
-        </w:tc>
-        <w:tc>
-          <w:tcPr>
-            <w:tcBorders>
-              <w:left w:val="nil"/>
-              <w:right w:val="nil"/>
-              <w:top w:val="nil"/>
-              <w:bottom w:val="single" w:sz="4" w:color="D9E1E8"/>
-            </w:tcBorders>
-            <w:vAlign w:val="center"/>
-          </w:tcPr>
-          <w:p>
-            <w:pPr>
-              <w:pStyle w:val="Compact"/>
-              <w:spacing w:before="0" w:after="20" w:line="240" w:lineRule="auto"/>
-              <w:jc w:val="center"/>
-              <w:keepNext w:val="0"/>
-              <w:keepLines/>
-              <w:widowControl w:val="1"/>
-            </w:pPr>
-            <w:r>
-              <w:rPr>
-                <w:rFonts w:ascii="Georgia" w:hAnsi="Georgia"/>
-                <w:sz w:val="19"/>
-              </w:rPr>
-              <w:t xml:space="preserve">0.497 [0.459, 0.532]</w:t>
-            </w:r>
-          </w:p>
-        </w:tc>
-      </w:tr>
-      <w:tr>
-        <w:tc>
-          <w:tcPr>
-            <w:tcBorders>
-              <w:left w:val="nil"/>
-              <w:right w:val="nil"/>
-              <w:top w:val="nil"/>
-              <w:bottom w:val="single" w:sz="4" w:color="D9E1E8"/>
-            </w:tcBorders>
-            <w:vAlign w:val="center"/>
-          </w:tcPr>
-          <w:p>
-            <w:pPr>
-              <w:pStyle w:val="Compact"/>
-              <w:spacing w:before="0" w:after="20" w:line="240" w:lineRule="auto"/>
-              <w:jc w:val="center"/>
-              <w:keepNext w:val="0"/>
-              <w:keepLines/>
-              <w:widowControl w:val="1"/>
-            </w:pPr>
-            <w:r>
-              <w:rPr>
-                <w:rFonts w:ascii="Georgia" w:hAnsi="Georgia"/>
-                <w:i/>
-                <w:iCs/>
-                <w:sz w:val="19"/>
-              </w:rPr>
-              <w:t xml:space="preserve">Clinical reasoning</w:t>
-            </w:r>
-          </w:p>
-        </w:tc>
-        <w:tc>
-          <w:tcPr>
-            <w:tcBorders>
-              <w:left w:val="nil"/>
-              <w:right w:val="nil"/>
-              <w:top w:val="nil"/>
-              <w:bottom w:val="single" w:sz="4" w:color="D9E1E8"/>
-            </w:tcBorders>
-            <w:vAlign w:val="center"/>
-          </w:tcPr>
-          <w:p>
-            <w:pPr>
-              <w:pStyle w:val="Compact"/>
-              <w:spacing w:before="0" w:after="20" w:line="240" w:lineRule="auto"/>
-              <w:jc w:val="center"/>
-              <w:keepNext w:val="0"/>
-              <w:keepLines/>
-              <w:widowControl w:val="1"/>
-            </w:pPr>
-            <w:r>
-              <w:rPr>
-                <w:rFonts w:ascii="Georgia" w:hAnsi="Georgia"/>
-                <w:sz w:val="19"/>
-              </w:rPr>
-              <w:t xml:space="preserve">gpt-3.5-turbo</w:t>
-            </w:r>
-          </w:p>
-        </w:tc>
-        <w:tc>
-          <w:tcPr>
-            <w:tcBorders>
-              <w:left w:val="nil"/>
-              <w:right w:val="nil"/>
-              <w:top w:val="nil"/>
-              <w:bottom w:val="single" w:sz="4" w:color="D9E1E8"/>
-            </w:tcBorders>
-            <w:vAlign w:val="center"/>
-          </w:tcPr>
-          <w:p>
-            <w:pPr>
-              <w:pStyle w:val="Compact"/>
-              <w:spacing w:before="0" w:after="20" w:line="240" w:lineRule="auto"/>
-              <w:jc w:val="center"/>
-              <w:keepNext w:val="0"/>
-              <w:keepLines/>
-              <w:widowControl w:val="1"/>
-            </w:pPr>
-            <w:r>
-              <w:rPr>
-                <w:rFonts w:ascii="Georgia" w:hAnsi="Georgia"/>
-                <w:sz w:val="19"/>
-              </w:rPr>
-              <w:t xml:space="preserve">0.873 [0.849, 0.895]</w:t>
-            </w:r>
-          </w:p>
-        </w:tc>
-      </w:tr>
-      <w:tr>
-        <w:tc>
-          <w:tcPr>
-            <w:tcBorders>
-              <w:left w:val="nil"/>
-              <w:right w:val="nil"/>
-              <w:top w:val="nil"/>
-              <w:bottom w:val="single" w:sz="4" w:color="D9E1E8"/>
-            </w:tcBorders>
-            <w:vAlign w:val="center"/>
-          </w:tcPr>
-          <w:p>
-            <w:pPr>
-              <w:pStyle w:val="Compact"/>
-              <w:spacing w:before="0" w:after="20" w:line="240" w:lineRule="auto"/>
-              <w:jc w:val="center"/>
-              <w:keepNext w:val="0"/>
-              <w:keepLines/>
-              <w:widowControl w:val="1"/>
-            </w:pPr>
-          </w:p>
-        </w:tc>
-        <w:tc>
-          <w:tcPr>
-            <w:tcBorders>
-              <w:left w:val="nil"/>
-              <w:right w:val="nil"/>
-              <w:top w:val="nil"/>
-              <w:bottom w:val="single" w:sz="4" w:color="D9E1E8"/>
-            </w:tcBorders>
-            <w:vAlign w:val="center"/>
-          </w:tcPr>
-          <w:p>
-            <w:pPr>
-              <w:pStyle w:val="Compact"/>
-              <w:spacing w:before="0" w:after="20" w:line="240" w:lineRule="auto"/>
-              <w:jc w:val="center"/>
-              <w:keepNext w:val="0"/>
-              <w:keepLines/>
-              <w:widowControl w:val="1"/>
-            </w:pPr>
-            <w:r>
-              <w:rPr>
-                <w:rFonts w:ascii="Georgia" w:hAnsi="Georgia"/>
-                <w:sz w:val="19"/>
-              </w:rPr>
-              <w:t xml:space="preserve">gpt-4o-mini</w:t>
-            </w:r>
-          </w:p>
-        </w:tc>
-        <w:tc>
-          <w:tcPr>
-            <w:tcBorders>
-              <w:left w:val="nil"/>
-              <w:right w:val="nil"/>
-              <w:top w:val="nil"/>
-              <w:bottom w:val="single" w:sz="4" w:color="D9E1E8"/>
-            </w:tcBorders>
-            <w:vAlign w:val="center"/>
-          </w:tcPr>
-          <w:p>
-            <w:pPr>
-              <w:pStyle w:val="Compact"/>
-              <w:spacing w:before="0" w:after="20" w:line="240" w:lineRule="auto"/>
-              <w:jc w:val="center"/>
-              <w:keepNext w:val="0"/>
-              <w:keepLines/>
-              <w:widowControl w:val="1"/>
-            </w:pPr>
-            <w:r>
-              <w:rPr>
-                <w:rFonts w:ascii="Georgia" w:hAnsi="Georgia"/>
-                <w:sz w:val="19"/>
-              </w:rPr>
-              <w:t xml:space="preserve">0.864 [0.840, 0.885]</w:t>
-            </w:r>
-          </w:p>
-        </w:tc>
-      </w:tr>
-      <w:tr>
-        <w:tc>
-          <w:tcPr>
-            <w:tcBorders>
-              <w:left w:val="nil"/>
-              <w:right w:val="nil"/>
-              <w:top w:val="nil"/>
-              <w:bottom w:val="single" w:sz="4" w:color="D9E1E8"/>
-            </w:tcBorders>
-            <w:vAlign w:val="center"/>
-          </w:tcPr>
-          <w:p>
-            <w:pPr>
-              <w:pStyle w:val="Compact"/>
-              <w:spacing w:before="0" w:after="20" w:line="240" w:lineRule="auto"/>
-              <w:jc w:val="center"/>
-              <w:keepNext w:val="0"/>
-              <w:keepLines/>
-              <w:widowControl w:val="1"/>
-            </w:pPr>
-          </w:p>
-        </w:tc>
-        <w:tc>
-          <w:tcPr>
-            <w:tcBorders>
-              <w:left w:val="nil"/>
-              <w:right w:val="nil"/>
-              <w:top w:val="nil"/>
-              <w:bottom w:val="single" w:sz="4" w:color="D9E1E8"/>
-            </w:tcBorders>
-            <w:vAlign w:val="center"/>
-          </w:tcPr>
-          <w:p>
-            <w:pPr>
-              <w:pStyle w:val="Compact"/>
-              <w:spacing w:before="0" w:after="20" w:line="240" w:lineRule="auto"/>
-              <w:jc w:val="center"/>
-              <w:keepNext w:val="0"/>
-              <w:keepLines/>
-              <w:widowControl w:val="1"/>
-            </w:pPr>
-            <w:r>
-              <w:rPr>
-                <w:rFonts w:ascii="Georgia" w:hAnsi="Georgia"/>
-                <w:sz w:val="19"/>
-              </w:rPr>
-              <w:t xml:space="preserve">llama-3.2-3b</w:t>
-            </w:r>
-          </w:p>
-        </w:tc>
-        <w:tc>
-          <w:tcPr>
-            <w:tcBorders>
-              <w:left w:val="nil"/>
-              <w:right w:val="nil"/>
-              <w:top w:val="nil"/>
-              <w:bottom w:val="single" w:sz="4" w:color="D9E1E8"/>
-            </w:tcBorders>
-            <w:vAlign w:val="center"/>
-          </w:tcPr>
-          <w:p>
-            <w:pPr>
-              <w:pStyle w:val="Compact"/>
-              <w:spacing w:before="0" w:after="20" w:line="240" w:lineRule="auto"/>
-              <w:jc w:val="center"/>
-              <w:keepNext w:val="0"/>
-              <w:keepLines/>
-              <w:widowControl w:val="1"/>
-            </w:pPr>
-            <w:r>
-              <w:rPr>
-                <w:rFonts w:ascii="Georgia" w:hAnsi="Georgia"/>
-                <w:sz w:val="19"/>
-              </w:rPr>
-              <w:t xml:space="preserve">0.814 [0.784, 0.844]</w:t>
-            </w:r>
-          </w:p>
-        </w:tc>
-      </w:tr>
-      <w:tr>
-        <w:tc>
-          <w:tcPr>
-            <w:tcBorders>
-              <w:left w:val="nil"/>
-              <w:right w:val="nil"/>
-              <w:top w:val="nil"/>
-              <w:bottom w:val="single" w:sz="4" w:color="D9E1E8"/>
-            </w:tcBorders>
-            <w:vAlign w:val="center"/>
-          </w:tcPr>
-          <w:p>
-            <w:pPr>
-              <w:pStyle w:val="Compact"/>
-              <w:spacing w:before="0" w:after="20" w:line="240" w:lineRule="auto"/>
-              <w:jc w:val="center"/>
-              <w:keepNext w:val="0"/>
-              <w:keepLines/>
-              <w:widowControl w:val="1"/>
-            </w:pPr>
-            <w:r>
-              <w:rPr>
-                <w:rFonts w:ascii="Georgia" w:hAnsi="Georgia"/>
-                <w:i/>
-                <w:iCs/>
-                <w:sz w:val="19"/>
-              </w:rPr>
-              <w:t xml:space="preserve">Legal analysis</w:t>
-            </w:r>
-          </w:p>
-        </w:tc>
-        <w:tc>
-          <w:tcPr>
-            <w:tcBorders>
-              <w:left w:val="nil"/>
-              <w:right w:val="nil"/>
-              <w:top w:val="nil"/>
-              <w:bottom w:val="single" w:sz="4" w:color="D9E1E8"/>
-            </w:tcBorders>
-            <w:vAlign w:val="center"/>
-          </w:tcPr>
-          <w:p>
-            <w:pPr>
-              <w:pStyle w:val="Compact"/>
-              <w:spacing w:before="0" w:after="20" w:line="240" w:lineRule="auto"/>
-              <w:jc w:val="center"/>
-              <w:keepNext w:val="0"/>
-              <w:keepLines/>
-              <w:widowControl w:val="1"/>
-            </w:pPr>
-            <w:r>
-              <w:rPr>
-                <w:rFonts w:ascii="Georgia" w:hAnsi="Georgia"/>
-                <w:sz w:val="19"/>
-              </w:rPr>
-              <w:t xml:space="preserve">gpt-4o-mini</w:t>
-            </w:r>
-          </w:p>
-        </w:tc>
-        <w:tc>
-          <w:tcPr>
-            <w:tcBorders>
-              <w:left w:val="nil"/>
-              <w:right w:val="nil"/>
-              <w:top w:val="nil"/>
-              <w:bottom w:val="single" w:sz="4" w:color="D9E1E8"/>
-            </w:tcBorders>
-            <w:vAlign w:val="center"/>
-          </w:tcPr>
-          <w:p>
-            <w:pPr>
-              <w:pStyle w:val="Compact"/>
-              <w:spacing w:before="0" w:after="20" w:line="240" w:lineRule="auto"/>
-              <w:jc w:val="center"/>
-              <w:keepNext w:val="0"/>
-              <w:keepLines/>
-              <w:widowControl w:val="1"/>
-            </w:pPr>
-            <w:r>
-              <w:rPr>
-                <w:rFonts w:ascii="Georgia" w:hAnsi="Georgia"/>
-                <w:sz w:val="19"/>
-              </w:rPr>
-              <w:t xml:space="preserve">0.982 [0.973, 0.991]</w:t>
-            </w:r>
-          </w:p>
-        </w:tc>
-      </w:tr>
-      <w:tr>
-        <w:tc>
-          <w:tcPr>
-            <w:tcBorders>
-              <w:left w:val="nil"/>
-              <w:right w:val="nil"/>
-              <w:top w:val="nil"/>
-              <w:bottom w:val="single" w:sz="4" w:color="D9E1E8"/>
-            </w:tcBorders>
-            <w:vAlign w:val="center"/>
-          </w:tcPr>
-          <w:p>
-            <w:pPr>
-              <w:pStyle w:val="Compact"/>
-              <w:spacing w:before="0" w:after="20" w:line="240" w:lineRule="auto"/>
-              <w:jc w:val="center"/>
-              <w:keepNext w:val="0"/>
-              <w:keepLines/>
-              <w:widowControl w:val="1"/>
-            </w:pPr>
-          </w:p>
-        </w:tc>
-        <w:tc>
-          <w:tcPr>
-            <w:tcBorders>
-              <w:left w:val="nil"/>
-              <w:right w:val="nil"/>
-              <w:top w:val="nil"/>
-              <w:bottom w:val="single" w:sz="4" w:color="D9E1E8"/>
-            </w:tcBorders>
-            <w:vAlign w:val="center"/>
-          </w:tcPr>
-          <w:p>
-            <w:pPr>
-              <w:pStyle w:val="Compact"/>
-              <w:spacing w:before="0" w:after="20" w:line="240" w:lineRule="auto"/>
-              <w:jc w:val="center"/>
-              <w:keepNext w:val="0"/>
-              <w:keepLines/>
-              <w:widowControl w:val="1"/>
-            </w:pPr>
-            <w:r>
-              <w:rPr>
-                <w:rFonts w:ascii="Georgia" w:hAnsi="Georgia"/>
-                <w:sz w:val="19"/>
-              </w:rPr>
-              <w:t xml:space="preserve">gpt-3.5-turbo</w:t>
-            </w:r>
-          </w:p>
-        </w:tc>
-        <w:tc>
-          <w:tcPr>
-            <w:tcBorders>
-              <w:left w:val="nil"/>
-              <w:right w:val="nil"/>
-              <w:top w:val="nil"/>
-              <w:bottom w:val="single" w:sz="4" w:color="D9E1E8"/>
-            </w:tcBorders>
-            <w:vAlign w:val="center"/>
-          </w:tcPr>
-          <w:p>
-            <w:pPr>
-              <w:pStyle w:val="Compact"/>
-              <w:spacing w:before="0" w:after="20" w:line="240" w:lineRule="auto"/>
-              <w:jc w:val="center"/>
-              <w:keepNext w:val="0"/>
-              <w:keepLines/>
-              <w:widowControl w:val="1"/>
-            </w:pPr>
-            <w:r>
-              <w:rPr>
-                <w:rFonts w:ascii="Georgia" w:hAnsi="Georgia"/>
-                <w:sz w:val="19"/>
-              </w:rPr>
-              <w:t xml:space="preserve">0.740 [0.709, 0.770]</w:t>
-            </w:r>
-          </w:p>
-        </w:tc>
-      </w:tr>
-      <w:tr>
-        <w:tc>
-          <w:tcPr>
-            <w:tcBorders>
-              <w:left w:val="nil"/>
-              <w:right w:val="nil"/>
-              <w:top w:val="nil"/>
-              <w:bottom w:val="nil"/>
-            </w:tcBorders>
-            <w:vAlign w:val="center"/>
-          </w:tcPr>
-          <w:p>
-            <w:pPr>
-              <w:pStyle w:val="Compact"/>
-              <w:spacing w:before="0" w:after="20" w:line="240" w:lineRule="auto"/>
-              <w:jc w:val="center"/>
-              <w:keepNext w:val="0"/>
-              <w:keepLines/>
-              <w:widowControl w:val="1"/>
-            </w:pPr>
-          </w:p>
-        </w:tc>
-        <w:tc>
-          <w:tcPr>
-            <w:tcBorders>
-              <w:left w:val="nil"/>
-              <w:right w:val="nil"/>
-              <w:top w:val="nil"/>
-              <w:bottom w:val="nil"/>
-            </w:tcBorders>
-            <w:vAlign w:val="center"/>
-          </w:tcPr>
-          <w:p>
-            <w:pPr>
-              <w:pStyle w:val="Compact"/>
-              <w:spacing w:before="0" w:after="20" w:line="240" w:lineRule="auto"/>
-              <w:jc w:val="center"/>
-              <w:keepNext w:val="0"/>
-              <w:keepLines/>
-              <w:widowControl w:val="1"/>
-            </w:pPr>
-            <w:r>
-              <w:rPr>
-                <w:rFonts w:ascii="Georgia" w:hAnsi="Georgia"/>
-                <w:sz w:val="19"/>
-              </w:rPr>
-              <w:t xml:space="preserve">llama-3.2-3b</w:t>
-            </w:r>
-          </w:p>
-        </w:tc>
-        <w:tc>
-          <w:tcPr>
-            <w:tcBorders>
-              <w:left w:val="nil"/>
-              <w:right w:val="nil"/>
-              <w:top w:val="nil"/>
-              <w:bottom w:val="nil"/>
-            </w:tcBorders>
-            <w:vAlign w:val="center"/>
-          </w:tcPr>
-          <w:p>
-            <w:pPr>
-              <w:pStyle w:val="Compact"/>
-              <w:spacing w:before="0" w:after="20" w:line="240" w:lineRule="auto"/>
-              <w:jc w:val="center"/>
-              <w:keepNext w:val="0"/>
-              <w:keepLines/>
-              <w:widowControl w:val="1"/>
-            </w:pPr>
-            <w:r>
-              <w:rPr>
-                <w:rFonts w:ascii="Georgia" w:hAnsi="Georgia"/>
-                <w:sz w:val="19"/>
-              </w:rPr>
-              <w:t xml:space="preserve">0.709 [0.677, 0.744]</w:t>
-            </w:r>
-          </w:p>
-        </w:tc>
-      </w:tr>
-    </w:tbl>
-    <w:p>
-      <w:pPr>
         <w:pStyle w:val="BodyText"/>
-        <w:spacing w:before="240"/>
         <w:jc w:val="both"/>
         <w:keepNext w:val="0"/>
         <w:keepLines w:val="0"/>
@@ -15260,7 +13978,7 @@
         <w:t xml:space="preserve"> </w:t>
       </w:r>
       <w:r>
-        <w:t xml:space="preserve">(OpenAI + Anthropic + Google) then ranked three candidate models (Table 4).</w:t>
+        <w:t xml:space="preserve">(OpenAI + Anthropic + Google) then ranked three candidate models (Table G1).</w:t>
       </w:r>
     </w:p>
     <w:p>
@@ -16383,7 +15101,7 @@
         <w:widowControl w:val="1"/>
       </w:pPr>
       <w:r>
-        <w:t xml:space="preserve">Each item is scored on its rubric by the panel, producing the rankings in Table 4. On DDI the three judges are</w:t>
+        <w:t xml:space="preserve">Each item is scored on its rubric by the panel, producing the rankings in Table G1. On DDI the three judges are</w:t>
       </w:r>
       <w:r>
         <w:t xml:space="preserve"> </w:t>
@@ -19349,7 +18067,7 @@
         <w:t xml:space="preserve"> </w:t>
       </w:r>
       <w:r>
-        <w:t xml:space="preserve">ranking in Tables 2 and 4 unchanged, with per-model scores shifting by at most</w:t>
+        <w:t xml:space="preserve">ranking in Table 2 and Table G1 unchanged, with per-model scores shifting by at most</w:t>
       </w:r>
       <w:r>
         <w:t xml:space="preserve"> </w:t>
@@ -20215,6 +18933,1456 @@
       </w:tr>
     </w:tbl>
     <w:bookmarkEnd w:id="125"/>
+    <w:bookmarkStart w:id="126" w:name="appG"/>
+    <w:p>
+      <w:pPr>
+        <w:pStyle w:val="Heading2"/>
+        <w:keepNext/>
+        <w:keepLines/>
+        <w:widowControl w:val="1"/>
+      </w:pPr>
+      <w:r>
+        <w:t xml:space="preserve">Appendix G. Domain case studies (full results)</w:t>
+      </w:r>
+    </w:p>
+    <w:p>
+      <w:pPr>
+        <w:pStyle w:val="FirstParagraph"/>
+        <w:jc w:val="both"/>
+        <w:keepNext w:val="0"/>
+        <w:keepLines w:val="0"/>
+        <w:widowControl w:val="1"/>
+      </w:pPr>
+      <w:r>
+        <w:t xml:space="preserve">The preceding sections validate CoEval's components where ground truth is available. We now exercise the complete tool</w:t>
+      </w:r>
+      <w:r>
+        <w:t xml:space="preserve"> </w:t>
+      </w:r>
+      <w:r>
+        <w:t xml:space="preserve">in its intended regime on three custom verticals,</w:t>
+      </w:r>
+      <w:r>
+        <w:t xml:space="preserve"> </w:t>
+      </w:r>
+      <w:r>
+        <w:rPr>
+          <w:i/>
+          <w:iCs/>
+        </w:rPr>
+        <w:t xml:space="preserve">drug–drug interaction reasoning</w:t>
+      </w:r>
+      <w:r>
+        <w:t xml:space="preserve">,</w:t>
+      </w:r>
+      <w:r>
+        <w:t xml:space="preserve"> </w:t>
+      </w:r>
+      <w:r>
+        <w:rPr>
+          <w:i/>
+          <w:iCs/>
+        </w:rPr>
+        <w:t xml:space="preserve">clinical</w:t>
+      </w:r>
+      <w:r>
+        <w:rPr>
+          <w:i/>
+          <w:iCs/>
+        </w:rPr>
+        <w:t xml:space="preserve"> </w:t>
+      </w:r>
+      <w:r>
+        <w:rPr>
+          <w:i/>
+          <w:iCs/>
+        </w:rPr>
+        <w:t xml:space="preserve">reasoning</w:t>
+      </w:r>
+      <w:r>
+        <w:t xml:space="preserve">, and</w:t>
+      </w:r>
+      <w:r>
+        <w:t xml:space="preserve"> </w:t>
+      </w:r>
+      <w:r>
+        <w:rPr>
+          <w:i/>
+          <w:iCs/>
+        </w:rPr>
+        <w:t xml:space="preserve">legal analysis</w:t>
+      </w:r>
+      <w:r>
+        <w:t xml:space="preserve">, for which we assume no task-specific labeled data and no trustworthy</w:t>
+      </w:r>
+      <w:r>
+        <w:t xml:space="preserve"> </w:t>
+      </w:r>
+      <w:r>
+        <w:t xml:space="preserve">public benchmark. The drug-interaction vertical is the sharpest case for the framework's premise: a well-known public</w:t>
+      </w:r>
+      <w:r>
+        <w:t xml:space="preserve"> </w:t>
+      </w:r>
+      <w:r>
+        <w:t xml:space="preserve">benchmark exists (DDIExtraction-2013) but is a relation-</w:t>
+      </w:r>
+      <w:r>
+        <w:rPr>
+          <w:i/>
+          <w:iCs/>
+        </w:rPr>
+        <w:t xml:space="preserve">extraction</w:t>
+      </w:r>
+      <w:r>
+        <w:t xml:space="preserve"> </w:t>
+      </w:r>
+      <w:r>
+        <w:t xml:space="preserve">corpus rather than clinical-decision</w:t>
+      </w:r>
+      <w:r>
+        <w:t xml:space="preserve"> </w:t>
+      </w:r>
+      <w:r>
+        <w:t xml:space="preserve">reasoning, and is old and freely available enough to be presumed present in pretraining, while the few clinically</w:t>
+      </w:r>
+      <w:r>
+        <w:t xml:space="preserve"> </w:t>
+      </w:r>
+      <w:r>
+        <w:t xml:space="preserve">realistic DDI-reasoning sets are private and number only in the hundreds of items. From a one-line description per</w:t>
+      </w:r>
+      <w:r>
+        <w:t xml:space="preserve"> </w:t>
+      </w:r>
+      <w:r>
+        <w:t xml:space="preserve">vertical, CoEval's teacher generated 40 attribute-stratified items (for drug interactions, stratified over severity,</w:t>
+      </w:r>
+      <w:r>
+        <w:t xml:space="preserve"> </w:t>
+      </w:r>
+      <w:r>
+        <w:t xml:space="preserve">mechanism, and patient context), three candidate models answered them, and the cross-family ensemble</w:t>
+      </w:r>
+      <w:r>
+        <w:t xml:space="preserve"> </w:t>
+      </w:r>
+      <w:r>
+        <w:t xml:space="preserve">(OpenAI + Anthropic + Google) scored every response, all from a single configuration file, with</w:t>
+      </w:r>
+      <w:r>
+        <w:t xml:space="preserve"> </w:t>
+      </w:r>
+      <w:r>
+        <w:t xml:space="preserve">no human labels or raters.</w:t>
+      </w:r>
+      <w:r>
+        <w:t xml:space="preserve"> </w:t>
+      </w:r>
+      <w:hyperlink w:anchor="appC">
+        <w:r>
+          <w:rPr>
+            <w:rStyle w:val="Hyperlink"/>
+          </w:rPr>
+          <w:t xml:space="preserve">Appendix C</w:t>
+        </w:r>
+      </w:hyperlink>
+      <w:r>
+        <w:t xml:space="preserve"> </w:t>
+      </w:r>
+      <w:r>
+        <w:t xml:space="preserve">shows the actual generated artifacts for all three</w:t>
+      </w:r>
+      <w:r>
+        <w:t xml:space="preserve"> </w:t>
+      </w:r>
+      <w:r>
+        <w:t xml:space="preserve">domains: the one-line seed, the auto-generated attribute strata and rubric, and a representative synthesized item.</w:t>
+      </w:r>
+    </w:p>
+    <w:p>
+      <w:pPr>
+        <w:pStyle w:val="BodyText"/>
+        <w:jc w:val="both"/>
+        <w:keepNext w:val="0"/>
+        <w:keepLines w:val="0"/>
+        <w:widowControl w:val="1"/>
+      </w:pPr>
+      <w:r>
+        <w:t xml:space="preserve">On the drug-interaction vertical CoEval produces a</w:t>
+      </w:r>
+      <w:r>
+        <w:t xml:space="preserve"> </w:t>
+      </w:r>
+      <w:r>
+        <w:rPr>
+          <w:b/>
+          <w:bCs/>
+        </w:rPr>
+        <w:t xml:space="preserve">clean, fully unanimous ranking</w:t>
+      </w:r>
+      <w:r>
+        <w:t xml:space="preserve">: all three</w:t>
+      </w:r>
+      <w:r>
+        <w:t xml:space="preserve"> </w:t>
+      </w:r>
+      <w:r>
+        <w:t xml:space="preserve">cross-family judges agree on the complete order</w:t>
+      </w:r>
+      <w:r>
+        <w:t xml:space="preserve"> </w:t>
+      </w:r>
+      <w:r>
+        <w:rPr>
+          <w:rStyle w:val="VerbatimChar"/>
+        </w:rPr>
+        <w:t xml:space="preserve">gpt-4o-mini</w:t>
+      </w:r>
+      <w:r>
+        <w:t xml:space="preserve"> (</w:t>
+      </w:r>
+      <m:oMath>
+        <m:r>
+          <m:t>0.770</m:t>
+        </m:r>
+      </m:oMath>
+      <w:r>
+        <w:t xml:space="preserve">)</w:t>
+      </w:r>
+      <w:r>
+        <w:t xml:space="preserve"> </w:t>
+      </w:r>
+      <m:oMath>
+        <m:r>
+          <m:rPr>
+            <m:sty m:val="p"/>
+          </m:rPr>
+          <m:t>&gt;</m:t>
+        </m:r>
+      </m:oMath>
+      <w:r>
+        <w:t xml:space="preserve"> </w:t>
+      </w:r>
+      <w:r>
+        <w:rPr>
+          <w:rStyle w:val="VerbatimChar"/>
+        </w:rPr>
+        <w:t xml:space="preserve">gpt-3.5-turbo</w:t>
+      </w:r>
+      <w:r>
+        <w:t xml:space="preserve"> </w:t>
+      </w:r>
+      <w:r>
+        <w:t xml:space="preserve"> (</w:t>
+      </w:r>
+      <m:oMath>
+        <m:r>
+          <m:t>0.682</m:t>
+        </m:r>
+      </m:oMath>
+      <w:r>
+        <w:t xml:space="preserve">)</w:t>
+      </w:r>
+      <w:r>
+        <w:t xml:space="preserve"> </w:t>
+      </w:r>
+      <m:oMath>
+        <m:r>
+          <m:rPr>
+            <m:sty m:val="p"/>
+          </m:rPr>
+          <m:t>&gt;</m:t>
+        </m:r>
+      </m:oMath>
+      <w:r>
+        <w:t xml:space="preserve"> </w:t>
+      </w:r>
+      <w:r>
+        <w:rPr>
+          <w:rStyle w:val="VerbatimChar"/>
+        </w:rPr>
+        <w:t xml:space="preserve">llama-3.2-3b</w:t>
+      </w:r>
+      <w:r>
+        <w:t xml:space="preserve"> (</w:t>
+      </w:r>
+      <m:oMath>
+        <m:r>
+          <m:t>0.497</m:t>
+        </m:r>
+      </m:oMath>
+      <w:r>
+        <w:t xml:space="preserve">), with non-overlapping confidence intervals separating every</w:t>
+      </w:r>
+      <w:r>
+        <w:t xml:space="preserve"> </w:t>
+      </w:r>
+      <w:r>
+        <w:t xml:space="preserve">model (Table G1). The clinical and legal verticals are consistent: the ensemble ranks the smallest model weakest in</w:t>
+      </w:r>
+      <w:r>
+        <w:t xml:space="preserve"> </w:t>
+      </w:r>
+      <w:r>
+        <w:t xml:space="preserve">both, unanimously in clinical and two-of-three in legal (where the Anthropic judge ranks</w:t>
+      </w:r>
+      <w:r>
+        <w:t xml:space="preserve"> </w:t>
+      </w:r>
+      <w:r>
+        <w:rPr>
+          <w:rStyle w:val="VerbatimChar"/>
+        </w:rPr>
+        <w:t xml:space="preserve">gpt-3.5-turbo</w:t>
+      </w:r>
+      <w:r>
+        <w:t xml:space="preserve"> </w:t>
+      </w:r>
+      <w:r>
+        <w:t xml:space="preserve">lowest): genuine disagreement a single judge would hide and a diverse ensemble surfaces; on clinical the two</w:t>
+      </w:r>
+      <w:r>
+        <w:t xml:space="preserve"> </w:t>
+      </w:r>
+      <w:r>
+        <w:t xml:space="preserve">stronger models are statistically close, which the overlapping intervals correctly expose. This is the operation the</w:t>
+      </w:r>
+      <w:r>
+        <w:t xml:space="preserve"> </w:t>
+      </w:r>
+      <w:r>
+        <w:t xml:space="preserve">framework is built for: producing a defensible model ranking for a bespoke domain in which a standard benchmark is</w:t>
+      </w:r>
+      <w:r>
+        <w:t xml:space="preserve"> </w:t>
+      </w:r>
+      <w:r>
+        <w:t xml:space="preserve">unavailable or untrustworthy.</w:t>
+      </w:r>
+    </w:p>
+    <w:p>
+      <w:pPr>
+        <w:pStyle w:val="BodyText"/>
+        <w:jc w:val="both"/>
+        <w:keepNext w:val="0"/>
+        <w:keepLines w:val="0"/>
+        <w:widowControl w:val="1"/>
+      </w:pPr>
+      <w:r>
+        <w:t xml:space="preserve">A ranking is only possible if the items</w:t>
+      </w:r>
+      <w:r>
+        <w:t xml:space="preserve"> </w:t>
+      </w:r>
+      <w:r>
+        <w:rPr>
+          <w:i/>
+          <w:iCs/>
+        </w:rPr>
+        <w:t xml:space="preserve">separate</w:t>
+      </w:r>
+      <w:r>
+        <w:t xml:space="preserve"> </w:t>
+      </w:r>
+      <w:r>
+        <w:t xml:space="preserve">the models, the generation-side analog of judge</w:t>
+      </w:r>
+      <w:r>
+        <w:t xml:space="preserve"> </w:t>
+      </w:r>
+      <w:r>
+        <w:t xml:space="preserve">discrimination: a good teacher writes questions on which candidates actually differ. We measure per-item</w:t>
+      </w:r>
+      <w:r>
+        <w:t xml:space="preserve"> </w:t>
+      </w:r>
+      <w:r>
+        <w:t xml:space="preserve">discriminativeness as the spread of candidate-model ensemble scores. Across the</w:t>
+      </w:r>
+      <w:r>
+        <w:t xml:space="preserve"> </w:t>
+      </w:r>
+      <m:oMath>
+        <m:r>
+          <m:t>120</m:t>
+        </m:r>
+      </m:oMath>
+      <w:r>
+        <w:t xml:space="preserve"> </w:t>
+      </w:r>
+      <w:r>
+        <w:t xml:space="preserve">generated vertical items,</w:t>
+      </w:r>
+      <w:r>
+        <w:t xml:space="preserve"> </w:t>
+      </w:r>
+      <m:oMath>
+        <m:r>
+          <m:t>71</m:t>
+        </m:r>
+        <m:r>
+          <m:rPr>
+            <m:sty m:val="p"/>
+          </m:rPr>
+          <m:t>%</m:t>
+        </m:r>
+      </m:oMath>
+      <w:r>
+        <w:rPr>
+          <w:b/>
+          <w:bCs/>
+        </w:rPr>
+        <w:t xml:space="preserve"> </w:t>
+      </w:r>
+      <w:r>
+        <w:rPr>
+          <w:b/>
+          <w:bCs/>
+        </w:rPr>
+        <w:t xml:space="preserve">are discriminative</w:t>
+      </w:r>
+      <w:r>
+        <w:t xml:space="preserve"> </w:t>
+      </w:r>
+      <w:r>
+        <w:t xml:space="preserve">(a score range</w:t>
+      </w:r>
+      <w:r>
+        <w:t xml:space="preserve"> </w:t>
+      </w:r>
+      <m:oMath>
+        <m:r>
+          <m:rPr>
+            <m:sty m:val="p"/>
+          </m:rPr>
+          <m:t>≥</m:t>
+        </m:r>
+        <m:r>
+          <m:t>0.15</m:t>
+        </m:r>
+      </m:oMath>
+      <w:r>
+        <w:t xml:space="preserve"> </w:t>
+      </w:r>
+      <w:r>
+        <w:t xml:space="preserve">across the three models), with a mean per-item</w:t>
+      </w:r>
+      <w:r>
+        <w:t xml:space="preserve"> </w:t>
+      </w:r>
+      <w:r>
+        <w:t xml:space="preserve">range of</w:t>
+      </w:r>
+      <w:r>
+        <w:t xml:space="preserve"> </w:t>
+      </w:r>
+      <m:oMath>
+        <m:r>
+          <m:t>0.33</m:t>
+        </m:r>
+      </m:oMath>
+      <w:r>
+        <w:t xml:space="preserve">; on drug-interaction and legal analysis the figure rises to</w:t>
+      </w:r>
+      <w:r>
+        <w:t xml:space="preserve"> </w:t>
+      </w:r>
+      <m:oMath>
+        <m:r>
+          <m:t>78</m:t>
+        </m:r>
+        <m:r>
+          <m:rPr>
+            <m:sty m:val="p"/>
+          </m:rPr>
+          <m:t>%</m:t>
+        </m:r>
+      </m:oMath>
+      <w:r>
+        <w:t xml:space="preserve"> </w:t>
+      </w:r>
+      <w:r>
+        <w:t xml:space="preserve">and</w:t>
+      </w:r>
+      <w:r>
+        <w:t xml:space="preserve"> </w:t>
+      </w:r>
+      <m:oMath>
+        <m:r>
+          <m:t>85</m:t>
+        </m:r>
+        <m:r>
+          <m:rPr>
+            <m:sty m:val="p"/>
+          </m:rPr>
+          <m:t>%</m:t>
+        </m:r>
+      </m:oMath>
+      <w:r>
+        <w:t xml:space="preserve">. Where the items do not</w:t>
+      </w:r>
+      <w:r>
+        <w:t xml:space="preserve"> </w:t>
+      </w:r>
+      <w:r>
+        <w:t xml:space="preserve">separate the models they are honest about it: clinical reasoning is only</w:t>
+      </w:r>
+      <w:r>
+        <w:t xml:space="preserve"> </w:t>
+      </w:r>
+      <m:oMath>
+        <m:r>
+          <m:t>50</m:t>
+        </m:r>
+        <m:r>
+          <m:rPr>
+            <m:sty m:val="p"/>
+          </m:rPr>
+          <m:t>%</m:t>
+        </m:r>
+      </m:oMath>
+      <w:r>
+        <w:t xml:space="preserve"> </w:t>
+      </w:r>
+      <w:r>
+        <w:t xml:space="preserve">discriminative precisely because its</w:t>
+      </w:r>
+      <w:r>
+        <w:t xml:space="preserve"> </w:t>
+      </w:r>
+      <w:r>
+        <w:t xml:space="preserve">two stronger candidates are genuinely close (</w:t>
+      </w:r>
+      <m:oMath>
+        <m:r>
+          <m:t>0.873</m:t>
+        </m:r>
+      </m:oMath>
+      <w:r>
+        <w:t xml:space="preserve"> </w:t>
+      </w:r>
+      <w:r>
+        <w:t xml:space="preserve">vs</w:t>
+      </w:r>
+      <w:r>
+        <w:t xml:space="preserve"> </w:t>
+      </w:r>
+      <m:oMath>
+        <m:r>
+          <m:t>0.864</m:t>
+        </m:r>
+      </m:oMath>
+      <w:r>
+        <w:t xml:space="preserve">), so the items reflect a real near-tie rather than</w:t>
+      </w:r>
+      <w:r>
+        <w:t xml:space="preserve"> </w:t>
+      </w:r>
+      <w:r>
+        <w:t xml:space="preserve">manufacturing a gap. This is why the panel yields non-overlapping ranking intervals: the teacher supplies items that</w:t>
+      </w:r>
+      <w:r>
+        <w:t xml:space="preserve"> </w:t>
+      </w:r>
+      <w:r>
+        <w:t xml:space="preserve">carry ranking signal, and a non-discriminative benchmark, on which every model scores alike, could not separate the</w:t>
+      </w:r>
+      <w:r>
+        <w:t xml:space="preserve"> </w:t>
+      </w:r>
+      <w:r>
+        <w:t xml:space="preserve">candidates no matter how reliable the judges are.</w:t>
+      </w:r>
+    </w:p>
+    <w:p>
+      <w:pPr>
+        <w:pStyle w:val="TableCaption"/>
+        <w:spacing w:before="280" w:after="60" w:line="240" w:lineRule="auto"/>
+        <w:jc w:val="center"/>
+        <w:keepNext/>
+        <w:keepLines/>
+        <w:widowControl w:val="1"/>
+      </w:pPr>
+      <w:r>
+        <w:rPr>
+          <w:b/>
+          <w:i/>
+        </w:rPr>
+        <w:t>Table G1.</w:t>
+      </w:r>
+      <w:r>
+        <w:rPr>
+          <w:b w:val="0"/>
+          <w:i/>
+        </w:rPr>
+        <w:t xml:space="preserve"> </w:t>
+      </w:r>
+      <w:r>
+        <w:rPr>
+          <w:b w:val="0"/>
+          <w:i/>
+        </w:rPr>
+        <w:t>CoEval ranks three candidate models on three custom, contamination-free verticals generated from a task description with no labeled data. Scores are the cross-family ensemble mean ([0, 1]) with 95% bootstrap CI over 40 generated items. llama-3.2-3b ranks weakest in every vertical; the three judges agree unanimously on the full drug-interaction order, unanimously on the weakest clinical model, and two-of-three in legal.</w:t>
+      </w:r>
+    </w:p>
+    <w:tbl>
+      <w:tblPr>
+        <w:tblStyle w:val="Table"/>
+        <w:tblW w:type="pct" w:w="5000"/>
+        <w:jc w:val="center"/>
+        <w:tblLook w:firstRow="1" w:lastRow="0" w:firstColumn="0" w:lastColumn="0" w:noHBand="0" w:noVBand="0" w:val="0020"/>
+        <w:tblCaption w:val="Table G1. CoEval ranks three candidate models on three custom, contamination-free verticals generated from a task description with no labeled data. Scores are the cross-family ensemble mean ([0, 1]) with 95% bootstrap CI over 40 generated items. llama-3.2-3b ranks weakest in every vertical; the three judges agree unanimously on the full drug-interaction order, unanimously on the weakest clinical model, and two-of-three in legal."/>
+        <w:tblLayout w:type="autofit"/>
+        <w:tblBorders>
+          <w:top w:val="single" w:sz="10" w:color="4F6272"/>
+          <w:bottom w:val="single" w:sz="10" w:color="4F6272"/>
+          <w:insideH w:val="single" w:sz="5" w:color="9FB0C2"/>
+          <w:left w:val="single" w:sz="6" w:color="9FB0C2"/>
+          <w:right w:val="single" w:sz="6" w:color="9FB0C2"/>
+          <w:insideV w:val="single" w:sz="5" w:color="D9E1E8"/>
+        </w:tblBorders>
+      </w:tblPr>
+      <w:tblGrid>
+        <w:gridCol w:w="2640"/>
+        <w:gridCol w:w="2640"/>
+        <w:gridCol w:w="2640"/>
+      </w:tblGrid>
+      <w:tr>
+        <w:trPr>
+          <w:tblHeader w:val="on"/>
+        </w:trPr>
+        <w:tc>
+          <w:tcPr>
+            <w:shd w:fill="EEF3F7"/>
+            <w:tcBorders>
+              <w:left w:val="nil"/>
+              <w:right w:val="nil"/>
+              <w:top w:val="nil"/>
+              <w:bottom w:val="single" w:sz="8" w:color="9FB0C2"/>
+            </w:tcBorders>
+            <w:vAlign w:val="center"/>
+          </w:tcPr>
+          <w:p>
+            <w:pPr>
+              <w:pStyle w:val="Compact"/>
+              <w:spacing w:before="0" w:after="20" w:line="240" w:lineRule="auto"/>
+              <w:jc w:val="center"/>
+              <w:keepNext w:val="0"/>
+              <w:keepLines/>
+              <w:widowControl w:val="1"/>
+            </w:pPr>
+            <w:r>
+              <w:rPr>
+                <w:rFonts w:ascii="Georgia" w:hAnsi="Georgia"/>
+                <w:b/>
+                <w:sz w:val="19"/>
+              </w:rPr>
+              <w:t xml:space="preserve">Vertical</w:t>
+            </w:r>
+          </w:p>
+        </w:tc>
+        <w:tc>
+          <w:tcPr>
+            <w:shd w:fill="EEF3F7"/>
+            <w:tcBorders>
+              <w:left w:val="nil"/>
+              <w:right w:val="nil"/>
+              <w:top w:val="nil"/>
+              <w:bottom w:val="single" w:sz="8" w:color="9FB0C2"/>
+            </w:tcBorders>
+            <w:vAlign w:val="center"/>
+          </w:tcPr>
+          <w:p>
+            <w:pPr>
+              <w:pStyle w:val="Compact"/>
+              <w:spacing w:before="0" w:after="20" w:line="240" w:lineRule="auto"/>
+              <w:jc w:val="center"/>
+              <w:keepNext w:val="0"/>
+              <w:keepLines/>
+              <w:widowControl w:val="1"/>
+            </w:pPr>
+            <w:r>
+              <w:rPr>
+                <w:rFonts w:ascii="Georgia" w:hAnsi="Georgia"/>
+                <w:b/>
+                <w:sz w:val="19"/>
+              </w:rPr>
+              <w:t xml:space="preserve">Model</w:t>
+            </w:r>
+          </w:p>
+        </w:tc>
+        <w:tc>
+          <w:tcPr>
+            <w:shd w:fill="EEF3F7"/>
+            <w:tcBorders>
+              <w:left w:val="nil"/>
+              <w:right w:val="nil"/>
+              <w:top w:val="nil"/>
+              <w:bottom w:val="single" w:sz="8" w:color="9FB0C2"/>
+            </w:tcBorders>
+            <w:vAlign w:val="center"/>
+          </w:tcPr>
+          <w:p>
+            <w:pPr>
+              <w:pStyle w:val="Compact"/>
+              <w:spacing w:before="0" w:after="20" w:line="240" w:lineRule="auto"/>
+              <w:jc w:val="center"/>
+              <w:keepNext w:val="0"/>
+              <w:keepLines/>
+              <w:widowControl w:val="1"/>
+            </w:pPr>
+            <w:r>
+              <w:rPr>
+                <w:rFonts w:ascii="Georgia" w:hAnsi="Georgia"/>
+                <w:b/>
+                <w:sz w:val="19"/>
+              </w:rPr>
+              <w:t xml:space="preserve">CoEval score [95% CI]</w:t>
+            </w:r>
+          </w:p>
+        </w:tc>
+      </w:tr>
+      <w:tr>
+        <w:tc>
+          <w:tcPr>
+            <w:tcBorders>
+              <w:left w:val="nil"/>
+              <w:right w:val="nil"/>
+              <w:top w:val="nil"/>
+              <w:bottom w:val="single" w:sz="4" w:color="D9E1E8"/>
+            </w:tcBorders>
+            <w:vAlign w:val="center"/>
+          </w:tcPr>
+          <w:p>
+            <w:pPr>
+              <w:pStyle w:val="Compact"/>
+              <w:spacing w:before="0" w:after="20" w:line="240" w:lineRule="auto"/>
+              <w:jc w:val="center"/>
+              <w:keepNext w:val="0"/>
+              <w:keepLines/>
+              <w:widowControl w:val="1"/>
+            </w:pPr>
+            <w:r>
+              <w:rPr>
+                <w:rFonts w:ascii="Georgia" w:hAnsi="Georgia"/>
+                <w:i/>
+                <w:iCs/>
+                <w:sz w:val="19"/>
+              </w:rPr>
+              <w:t xml:space="preserve">Drug–drug interaction</w:t>
+            </w:r>
+          </w:p>
+        </w:tc>
+        <w:tc>
+          <w:tcPr>
+            <w:tcBorders>
+              <w:left w:val="nil"/>
+              <w:right w:val="nil"/>
+              <w:top w:val="nil"/>
+              <w:bottom w:val="single" w:sz="4" w:color="D9E1E8"/>
+            </w:tcBorders>
+            <w:vAlign w:val="center"/>
+          </w:tcPr>
+          <w:p>
+            <w:pPr>
+              <w:pStyle w:val="Compact"/>
+              <w:spacing w:before="0" w:after="20" w:line="240" w:lineRule="auto"/>
+              <w:jc w:val="center"/>
+              <w:keepNext w:val="0"/>
+              <w:keepLines/>
+              <w:widowControl w:val="1"/>
+            </w:pPr>
+            <w:r>
+              <w:rPr>
+                <w:rFonts w:ascii="Georgia" w:hAnsi="Georgia"/>
+                <w:sz w:val="19"/>
+              </w:rPr>
+              <w:t xml:space="preserve">gpt-4o-mini</w:t>
+            </w:r>
+          </w:p>
+        </w:tc>
+        <w:tc>
+          <w:tcPr>
+            <w:tcBorders>
+              <w:left w:val="nil"/>
+              <w:right w:val="nil"/>
+              <w:top w:val="nil"/>
+              <w:bottom w:val="single" w:sz="4" w:color="D9E1E8"/>
+            </w:tcBorders>
+            <w:vAlign w:val="center"/>
+          </w:tcPr>
+          <w:p>
+            <w:pPr>
+              <w:pStyle w:val="Compact"/>
+              <w:spacing w:before="0" w:after="20" w:line="240" w:lineRule="auto"/>
+              <w:jc w:val="center"/>
+              <w:keepNext w:val="0"/>
+              <w:keepLines/>
+              <w:widowControl w:val="1"/>
+            </w:pPr>
+            <w:r>
+              <w:rPr>
+                <w:rFonts w:ascii="Georgia" w:hAnsi="Georgia"/>
+                <w:sz w:val="19"/>
+              </w:rPr>
+              <w:t xml:space="preserve">0.770 [0.739, 0.800]</w:t>
+            </w:r>
+          </w:p>
+        </w:tc>
+      </w:tr>
+      <w:tr>
+        <w:tc>
+          <w:tcPr>
+            <w:tcBorders>
+              <w:left w:val="nil"/>
+              <w:right w:val="nil"/>
+              <w:top w:val="nil"/>
+              <w:bottom w:val="single" w:sz="4" w:color="D9E1E8"/>
+            </w:tcBorders>
+            <w:vAlign w:val="center"/>
+          </w:tcPr>
+          <w:p>
+            <w:pPr>
+              <w:pStyle w:val="Compact"/>
+              <w:spacing w:before="0" w:after="20" w:line="240" w:lineRule="auto"/>
+              <w:jc w:val="center"/>
+              <w:keepNext w:val="0"/>
+              <w:keepLines/>
+              <w:widowControl w:val="1"/>
+            </w:pPr>
+          </w:p>
+        </w:tc>
+        <w:tc>
+          <w:tcPr>
+            <w:tcBorders>
+              <w:left w:val="nil"/>
+              <w:right w:val="nil"/>
+              <w:top w:val="nil"/>
+              <w:bottom w:val="single" w:sz="4" w:color="D9E1E8"/>
+            </w:tcBorders>
+            <w:vAlign w:val="center"/>
+          </w:tcPr>
+          <w:p>
+            <w:pPr>
+              <w:pStyle w:val="Compact"/>
+              <w:spacing w:before="0" w:after="20" w:line="240" w:lineRule="auto"/>
+              <w:jc w:val="center"/>
+              <w:keepNext w:val="0"/>
+              <w:keepLines/>
+              <w:widowControl w:val="1"/>
+            </w:pPr>
+            <w:r>
+              <w:rPr>
+                <w:rFonts w:ascii="Georgia" w:hAnsi="Georgia"/>
+                <w:sz w:val="19"/>
+              </w:rPr>
+              <w:t xml:space="preserve">gpt-3.5-turbo</w:t>
+            </w:r>
+          </w:p>
+        </w:tc>
+        <w:tc>
+          <w:tcPr>
+            <w:tcBorders>
+              <w:left w:val="nil"/>
+              <w:right w:val="nil"/>
+              <w:top w:val="nil"/>
+              <w:bottom w:val="single" w:sz="4" w:color="D9E1E8"/>
+            </w:tcBorders>
+            <w:vAlign w:val="center"/>
+          </w:tcPr>
+          <w:p>
+            <w:pPr>
+              <w:pStyle w:val="Compact"/>
+              <w:spacing w:before="0" w:after="20" w:line="240" w:lineRule="auto"/>
+              <w:jc w:val="center"/>
+              <w:keepNext w:val="0"/>
+              <w:keepLines/>
+              <w:widowControl w:val="1"/>
+            </w:pPr>
+            <w:r>
+              <w:rPr>
+                <w:rFonts w:ascii="Georgia" w:hAnsi="Georgia"/>
+                <w:sz w:val="19"/>
+              </w:rPr>
+              <w:t xml:space="preserve">0.682 [0.646, 0.717]</w:t>
+            </w:r>
+          </w:p>
+        </w:tc>
+      </w:tr>
+      <w:tr>
+        <w:tc>
+          <w:tcPr>
+            <w:tcBorders>
+              <w:left w:val="nil"/>
+              <w:right w:val="nil"/>
+              <w:top w:val="nil"/>
+              <w:bottom w:val="single" w:sz="4" w:color="D9E1E8"/>
+            </w:tcBorders>
+            <w:vAlign w:val="center"/>
+          </w:tcPr>
+          <w:p>
+            <w:pPr>
+              <w:pStyle w:val="Compact"/>
+              <w:spacing w:before="0" w:after="20" w:line="240" w:lineRule="auto"/>
+              <w:jc w:val="center"/>
+              <w:keepNext w:val="0"/>
+              <w:keepLines/>
+              <w:widowControl w:val="1"/>
+            </w:pPr>
+          </w:p>
+        </w:tc>
+        <w:tc>
+          <w:tcPr>
+            <w:tcBorders>
+              <w:left w:val="nil"/>
+              <w:right w:val="nil"/>
+              <w:top w:val="nil"/>
+              <w:bottom w:val="single" w:sz="4" w:color="D9E1E8"/>
+            </w:tcBorders>
+            <w:vAlign w:val="center"/>
+          </w:tcPr>
+          <w:p>
+            <w:pPr>
+              <w:pStyle w:val="Compact"/>
+              <w:spacing w:before="0" w:after="20" w:line="240" w:lineRule="auto"/>
+              <w:jc w:val="center"/>
+              <w:keepNext w:val="0"/>
+              <w:keepLines/>
+              <w:widowControl w:val="1"/>
+            </w:pPr>
+            <w:r>
+              <w:rPr>
+                <w:rFonts w:ascii="Georgia" w:hAnsi="Georgia"/>
+                <w:sz w:val="19"/>
+              </w:rPr>
+              <w:t xml:space="preserve">llama-3.2-3b</w:t>
+            </w:r>
+          </w:p>
+        </w:tc>
+        <w:tc>
+          <w:tcPr>
+            <w:tcBorders>
+              <w:left w:val="nil"/>
+              <w:right w:val="nil"/>
+              <w:top w:val="nil"/>
+              <w:bottom w:val="single" w:sz="4" w:color="D9E1E8"/>
+            </w:tcBorders>
+            <w:vAlign w:val="center"/>
+          </w:tcPr>
+          <w:p>
+            <w:pPr>
+              <w:pStyle w:val="Compact"/>
+              <w:spacing w:before="0" w:after="20" w:line="240" w:lineRule="auto"/>
+              <w:jc w:val="center"/>
+              <w:keepNext w:val="0"/>
+              <w:keepLines/>
+              <w:widowControl w:val="1"/>
+            </w:pPr>
+            <w:r>
+              <w:rPr>
+                <w:rFonts w:ascii="Georgia" w:hAnsi="Georgia"/>
+                <w:sz w:val="19"/>
+              </w:rPr>
+              <w:t xml:space="preserve">0.497 [0.459, 0.532]</w:t>
+            </w:r>
+          </w:p>
+        </w:tc>
+      </w:tr>
+      <w:tr>
+        <w:tc>
+          <w:tcPr>
+            <w:tcBorders>
+              <w:left w:val="nil"/>
+              <w:right w:val="nil"/>
+              <w:top w:val="nil"/>
+              <w:bottom w:val="single" w:sz="4" w:color="D9E1E8"/>
+            </w:tcBorders>
+            <w:vAlign w:val="center"/>
+          </w:tcPr>
+          <w:p>
+            <w:pPr>
+              <w:pStyle w:val="Compact"/>
+              <w:spacing w:before="0" w:after="20" w:line="240" w:lineRule="auto"/>
+              <w:jc w:val="center"/>
+              <w:keepNext w:val="0"/>
+              <w:keepLines/>
+              <w:widowControl w:val="1"/>
+            </w:pPr>
+            <w:r>
+              <w:rPr>
+                <w:rFonts w:ascii="Georgia" w:hAnsi="Georgia"/>
+                <w:i/>
+                <w:iCs/>
+                <w:sz w:val="19"/>
+              </w:rPr>
+              <w:t xml:space="preserve">Clinical reasoning</w:t>
+            </w:r>
+          </w:p>
+        </w:tc>
+        <w:tc>
+          <w:tcPr>
+            <w:tcBorders>
+              <w:left w:val="nil"/>
+              <w:right w:val="nil"/>
+              <w:top w:val="nil"/>
+              <w:bottom w:val="single" w:sz="4" w:color="D9E1E8"/>
+            </w:tcBorders>
+            <w:vAlign w:val="center"/>
+          </w:tcPr>
+          <w:p>
+            <w:pPr>
+              <w:pStyle w:val="Compact"/>
+              <w:spacing w:before="0" w:after="20" w:line="240" w:lineRule="auto"/>
+              <w:jc w:val="center"/>
+              <w:keepNext w:val="0"/>
+              <w:keepLines/>
+              <w:widowControl w:val="1"/>
+            </w:pPr>
+            <w:r>
+              <w:rPr>
+                <w:rFonts w:ascii="Georgia" w:hAnsi="Georgia"/>
+                <w:sz w:val="19"/>
+              </w:rPr>
+              <w:t xml:space="preserve">gpt-3.5-turbo</w:t>
+            </w:r>
+          </w:p>
+        </w:tc>
+        <w:tc>
+          <w:tcPr>
+            <w:tcBorders>
+              <w:left w:val="nil"/>
+              <w:right w:val="nil"/>
+              <w:top w:val="nil"/>
+              <w:bottom w:val="single" w:sz="4" w:color="D9E1E8"/>
+            </w:tcBorders>
+            <w:vAlign w:val="center"/>
+          </w:tcPr>
+          <w:p>
+            <w:pPr>
+              <w:pStyle w:val="Compact"/>
+              <w:spacing w:before="0" w:after="20" w:line="240" w:lineRule="auto"/>
+              <w:jc w:val="center"/>
+              <w:keepNext w:val="0"/>
+              <w:keepLines/>
+              <w:widowControl w:val="1"/>
+            </w:pPr>
+            <w:r>
+              <w:rPr>
+                <w:rFonts w:ascii="Georgia" w:hAnsi="Georgia"/>
+                <w:sz w:val="19"/>
+              </w:rPr>
+              <w:t xml:space="preserve">0.873 [0.849, 0.895]</w:t>
+            </w:r>
+          </w:p>
+        </w:tc>
+      </w:tr>
+      <w:tr>
+        <w:tc>
+          <w:tcPr>
+            <w:tcBorders>
+              <w:left w:val="nil"/>
+              <w:right w:val="nil"/>
+              <w:top w:val="nil"/>
+              <w:bottom w:val="single" w:sz="4" w:color="D9E1E8"/>
+            </w:tcBorders>
+            <w:vAlign w:val="center"/>
+          </w:tcPr>
+          <w:p>
+            <w:pPr>
+              <w:pStyle w:val="Compact"/>
+              <w:spacing w:before="0" w:after="20" w:line="240" w:lineRule="auto"/>
+              <w:jc w:val="center"/>
+              <w:keepNext w:val="0"/>
+              <w:keepLines/>
+              <w:widowControl w:val="1"/>
+            </w:pPr>
+          </w:p>
+        </w:tc>
+        <w:tc>
+          <w:tcPr>
+            <w:tcBorders>
+              <w:left w:val="nil"/>
+              <w:right w:val="nil"/>
+              <w:top w:val="nil"/>
+              <w:bottom w:val="single" w:sz="4" w:color="D9E1E8"/>
+            </w:tcBorders>
+            <w:vAlign w:val="center"/>
+          </w:tcPr>
+          <w:p>
+            <w:pPr>
+              <w:pStyle w:val="Compact"/>
+              <w:spacing w:before="0" w:after="20" w:line="240" w:lineRule="auto"/>
+              <w:jc w:val="center"/>
+              <w:keepNext w:val="0"/>
+              <w:keepLines/>
+              <w:widowControl w:val="1"/>
+            </w:pPr>
+            <w:r>
+              <w:rPr>
+                <w:rFonts w:ascii="Georgia" w:hAnsi="Georgia"/>
+                <w:sz w:val="19"/>
+              </w:rPr>
+              <w:t xml:space="preserve">gpt-4o-mini</w:t>
+            </w:r>
+          </w:p>
+        </w:tc>
+        <w:tc>
+          <w:tcPr>
+            <w:tcBorders>
+              <w:left w:val="nil"/>
+              <w:right w:val="nil"/>
+              <w:top w:val="nil"/>
+              <w:bottom w:val="single" w:sz="4" w:color="D9E1E8"/>
+            </w:tcBorders>
+            <w:vAlign w:val="center"/>
+          </w:tcPr>
+          <w:p>
+            <w:pPr>
+              <w:pStyle w:val="Compact"/>
+              <w:spacing w:before="0" w:after="20" w:line="240" w:lineRule="auto"/>
+              <w:jc w:val="center"/>
+              <w:keepNext w:val="0"/>
+              <w:keepLines/>
+              <w:widowControl w:val="1"/>
+            </w:pPr>
+            <w:r>
+              <w:rPr>
+                <w:rFonts w:ascii="Georgia" w:hAnsi="Georgia"/>
+                <w:sz w:val="19"/>
+              </w:rPr>
+              <w:t xml:space="preserve">0.864 [0.840, 0.885]</w:t>
+            </w:r>
+          </w:p>
+        </w:tc>
+      </w:tr>
+      <w:tr>
+        <w:tc>
+          <w:tcPr>
+            <w:tcBorders>
+              <w:left w:val="nil"/>
+              <w:right w:val="nil"/>
+              <w:top w:val="nil"/>
+              <w:bottom w:val="single" w:sz="4" w:color="D9E1E8"/>
+            </w:tcBorders>
+            <w:vAlign w:val="center"/>
+          </w:tcPr>
+          <w:p>
+            <w:pPr>
+              <w:pStyle w:val="Compact"/>
+              <w:spacing w:before="0" w:after="20" w:line="240" w:lineRule="auto"/>
+              <w:jc w:val="center"/>
+              <w:keepNext w:val="0"/>
+              <w:keepLines/>
+              <w:widowControl w:val="1"/>
+            </w:pPr>
+          </w:p>
+        </w:tc>
+        <w:tc>
+          <w:tcPr>
+            <w:tcBorders>
+              <w:left w:val="nil"/>
+              <w:right w:val="nil"/>
+              <w:top w:val="nil"/>
+              <w:bottom w:val="single" w:sz="4" w:color="D9E1E8"/>
+            </w:tcBorders>
+            <w:vAlign w:val="center"/>
+          </w:tcPr>
+          <w:p>
+            <w:pPr>
+              <w:pStyle w:val="Compact"/>
+              <w:spacing w:before="0" w:after="20" w:line="240" w:lineRule="auto"/>
+              <w:jc w:val="center"/>
+              <w:keepNext w:val="0"/>
+              <w:keepLines/>
+              <w:widowControl w:val="1"/>
+            </w:pPr>
+            <w:r>
+              <w:rPr>
+                <w:rFonts w:ascii="Georgia" w:hAnsi="Georgia"/>
+                <w:sz w:val="19"/>
+              </w:rPr>
+              <w:t xml:space="preserve">llama-3.2-3b</w:t>
+            </w:r>
+          </w:p>
+        </w:tc>
+        <w:tc>
+          <w:tcPr>
+            <w:tcBorders>
+              <w:left w:val="nil"/>
+              <w:right w:val="nil"/>
+              <w:top w:val="nil"/>
+              <w:bottom w:val="single" w:sz="4" w:color="D9E1E8"/>
+            </w:tcBorders>
+            <w:vAlign w:val="center"/>
+          </w:tcPr>
+          <w:p>
+            <w:pPr>
+              <w:pStyle w:val="Compact"/>
+              <w:spacing w:before="0" w:after="20" w:line="240" w:lineRule="auto"/>
+              <w:jc w:val="center"/>
+              <w:keepNext w:val="0"/>
+              <w:keepLines/>
+              <w:widowControl w:val="1"/>
+            </w:pPr>
+            <w:r>
+              <w:rPr>
+                <w:rFonts w:ascii="Georgia" w:hAnsi="Georgia"/>
+                <w:sz w:val="19"/>
+              </w:rPr>
+              <w:t xml:space="preserve">0.814 [0.784, 0.844]</w:t>
+            </w:r>
+          </w:p>
+        </w:tc>
+      </w:tr>
+      <w:tr>
+        <w:tc>
+          <w:tcPr>
+            <w:tcBorders>
+              <w:left w:val="nil"/>
+              <w:right w:val="nil"/>
+              <w:top w:val="nil"/>
+              <w:bottom w:val="single" w:sz="4" w:color="D9E1E8"/>
+            </w:tcBorders>
+            <w:vAlign w:val="center"/>
+          </w:tcPr>
+          <w:p>
+            <w:pPr>
+              <w:pStyle w:val="Compact"/>
+              <w:spacing w:before="0" w:after="20" w:line="240" w:lineRule="auto"/>
+              <w:jc w:val="center"/>
+              <w:keepNext w:val="0"/>
+              <w:keepLines/>
+              <w:widowControl w:val="1"/>
+            </w:pPr>
+            <w:r>
+              <w:rPr>
+                <w:rFonts w:ascii="Georgia" w:hAnsi="Georgia"/>
+                <w:i/>
+                <w:iCs/>
+                <w:sz w:val="19"/>
+              </w:rPr>
+              <w:t xml:space="preserve">Legal analysis</w:t>
+            </w:r>
+          </w:p>
+        </w:tc>
+        <w:tc>
+          <w:tcPr>
+            <w:tcBorders>
+              <w:left w:val="nil"/>
+              <w:right w:val="nil"/>
+              <w:top w:val="nil"/>
+              <w:bottom w:val="single" w:sz="4" w:color="D9E1E8"/>
+            </w:tcBorders>
+            <w:vAlign w:val="center"/>
+          </w:tcPr>
+          <w:p>
+            <w:pPr>
+              <w:pStyle w:val="Compact"/>
+              <w:spacing w:before="0" w:after="20" w:line="240" w:lineRule="auto"/>
+              <w:jc w:val="center"/>
+              <w:keepNext w:val="0"/>
+              <w:keepLines/>
+              <w:widowControl w:val="1"/>
+            </w:pPr>
+            <w:r>
+              <w:rPr>
+                <w:rFonts w:ascii="Georgia" w:hAnsi="Georgia"/>
+                <w:sz w:val="19"/>
+              </w:rPr>
+              <w:t xml:space="preserve">gpt-4o-mini</w:t>
+            </w:r>
+          </w:p>
+        </w:tc>
+        <w:tc>
+          <w:tcPr>
+            <w:tcBorders>
+              <w:left w:val="nil"/>
+              <w:right w:val="nil"/>
+              <w:top w:val="nil"/>
+              <w:bottom w:val="single" w:sz="4" w:color="D9E1E8"/>
+            </w:tcBorders>
+            <w:vAlign w:val="center"/>
+          </w:tcPr>
+          <w:p>
+            <w:pPr>
+              <w:pStyle w:val="Compact"/>
+              <w:spacing w:before="0" w:after="20" w:line="240" w:lineRule="auto"/>
+              <w:jc w:val="center"/>
+              <w:keepNext w:val="0"/>
+              <w:keepLines/>
+              <w:widowControl w:val="1"/>
+            </w:pPr>
+            <w:r>
+              <w:rPr>
+                <w:rFonts w:ascii="Georgia" w:hAnsi="Georgia"/>
+                <w:sz w:val="19"/>
+              </w:rPr>
+              <w:t xml:space="preserve">0.982 [0.973, 0.991]</w:t>
+            </w:r>
+          </w:p>
+        </w:tc>
+      </w:tr>
+      <w:tr>
+        <w:tc>
+          <w:tcPr>
+            <w:tcBorders>
+              <w:left w:val="nil"/>
+              <w:right w:val="nil"/>
+              <w:top w:val="nil"/>
+              <w:bottom w:val="single" w:sz="4" w:color="D9E1E8"/>
+            </w:tcBorders>
+            <w:vAlign w:val="center"/>
+          </w:tcPr>
+          <w:p>
+            <w:pPr>
+              <w:pStyle w:val="Compact"/>
+              <w:spacing w:before="0" w:after="20" w:line="240" w:lineRule="auto"/>
+              <w:jc w:val="center"/>
+              <w:keepNext w:val="0"/>
+              <w:keepLines/>
+              <w:widowControl w:val="1"/>
+            </w:pPr>
+          </w:p>
+        </w:tc>
+        <w:tc>
+          <w:tcPr>
+            <w:tcBorders>
+              <w:left w:val="nil"/>
+              <w:right w:val="nil"/>
+              <w:top w:val="nil"/>
+              <w:bottom w:val="single" w:sz="4" w:color="D9E1E8"/>
+            </w:tcBorders>
+            <w:vAlign w:val="center"/>
+          </w:tcPr>
+          <w:p>
+            <w:pPr>
+              <w:pStyle w:val="Compact"/>
+              <w:spacing w:before="0" w:after="20" w:line="240" w:lineRule="auto"/>
+              <w:jc w:val="center"/>
+              <w:keepNext w:val="0"/>
+              <w:keepLines/>
+              <w:widowControl w:val="1"/>
+            </w:pPr>
+            <w:r>
+              <w:rPr>
+                <w:rFonts w:ascii="Georgia" w:hAnsi="Georgia"/>
+                <w:sz w:val="19"/>
+              </w:rPr>
+              <w:t xml:space="preserve">gpt-3.5-turbo</w:t>
+            </w:r>
+          </w:p>
+        </w:tc>
+        <w:tc>
+          <w:tcPr>
+            <w:tcBorders>
+              <w:left w:val="nil"/>
+              <w:right w:val="nil"/>
+              <w:top w:val="nil"/>
+              <w:bottom w:val="single" w:sz="4" w:color="D9E1E8"/>
+            </w:tcBorders>
+            <w:vAlign w:val="center"/>
+          </w:tcPr>
+          <w:p>
+            <w:pPr>
+              <w:pStyle w:val="Compact"/>
+              <w:spacing w:before="0" w:after="20" w:line="240" w:lineRule="auto"/>
+              <w:jc w:val="center"/>
+              <w:keepNext w:val="0"/>
+              <w:keepLines/>
+              <w:widowControl w:val="1"/>
+            </w:pPr>
+            <w:r>
+              <w:rPr>
+                <w:rFonts w:ascii="Georgia" w:hAnsi="Georgia"/>
+                <w:sz w:val="19"/>
+              </w:rPr>
+              <w:t xml:space="preserve">0.740 [0.709, 0.770]</w:t>
+            </w:r>
+          </w:p>
+        </w:tc>
+      </w:tr>
+      <w:tr>
+        <w:tc>
+          <w:tcPr>
+            <w:tcBorders>
+              <w:left w:val="nil"/>
+              <w:right w:val="nil"/>
+              <w:top w:val="nil"/>
+              <w:bottom w:val="nil"/>
+            </w:tcBorders>
+            <w:vAlign w:val="center"/>
+          </w:tcPr>
+          <w:p>
+            <w:pPr>
+              <w:pStyle w:val="Compact"/>
+              <w:spacing w:before="0" w:after="20" w:line="240" w:lineRule="auto"/>
+              <w:jc w:val="center"/>
+              <w:keepNext w:val="0"/>
+              <w:keepLines/>
+              <w:widowControl w:val="1"/>
+            </w:pPr>
+          </w:p>
+        </w:tc>
+        <w:tc>
+          <w:tcPr>
+            <w:tcBorders>
+              <w:left w:val="nil"/>
+              <w:right w:val="nil"/>
+              <w:top w:val="nil"/>
+              <w:bottom w:val="nil"/>
+            </w:tcBorders>
+            <w:vAlign w:val="center"/>
+          </w:tcPr>
+          <w:p>
+            <w:pPr>
+              <w:pStyle w:val="Compact"/>
+              <w:spacing w:before="0" w:after="20" w:line="240" w:lineRule="auto"/>
+              <w:jc w:val="center"/>
+              <w:keepNext w:val="0"/>
+              <w:keepLines/>
+              <w:widowControl w:val="1"/>
+            </w:pPr>
+            <w:r>
+              <w:rPr>
+                <w:rFonts w:ascii="Georgia" w:hAnsi="Georgia"/>
+                <w:sz w:val="19"/>
+              </w:rPr>
+              <w:t xml:space="preserve">llama-3.2-3b</w:t>
+            </w:r>
+          </w:p>
+        </w:tc>
+        <w:tc>
+          <w:tcPr>
+            <w:tcBorders>
+              <w:left w:val="nil"/>
+              <w:right w:val="nil"/>
+              <w:top w:val="nil"/>
+              <w:bottom w:val="nil"/>
+            </w:tcBorders>
+            <w:vAlign w:val="center"/>
+          </w:tcPr>
+          <w:p>
+            <w:pPr>
+              <w:pStyle w:val="Compact"/>
+              <w:spacing w:before="0" w:after="20" w:line="240" w:lineRule="auto"/>
+              <w:jc w:val="center"/>
+              <w:keepNext w:val="0"/>
+              <w:keepLines/>
+              <w:widowControl w:val="1"/>
+            </w:pPr>
+            <w:r>
+              <w:rPr>
+                <w:rFonts w:ascii="Georgia" w:hAnsi="Georgia"/>
+                <w:sz w:val="19"/>
+              </w:rPr>
+              <w:t xml:space="preserve">0.709 [0.677, 0.744]</w:t>
+            </w:r>
+          </w:p>
+        </w:tc>
+      </w:tr>
+    </w:tbl>
+    <w:bookmarkEnd w:id="126"/>
     <w:sectPr>
       <w:footerReference w:type="default" r:id="rId9"/>
       <w:pgSz w:h="15840" w:w="12240"/>

</xml_diff>